<commit_message>
Checkpoint: Swapped server/templates/abc.docx with the newly uploaded template. All 5 tags ({dog id}, {date}, {location}, {description}, {notes}) confirmed present and working.
</commit_message>
<xml_diff>
--- a/server/templates/abc.docx
+++ b/server/templates/abc.docx
@@ -75,16 +75,16 @@
         <w:gridCol w:w="1695"/>
         <w:gridCol w:w="1140"/>
         <w:gridCol w:w="1485"/>
-        <w:gridCol w:w="2070"/>
-        <w:gridCol w:w="3150"/>
+        <w:gridCol w:w="1545"/>
+        <w:gridCol w:w="3675"/>
         <w:tblGridChange w:id="0">
           <w:tblGrid>
             <w:gridCol w:w="1260"/>
             <w:gridCol w:w="1695"/>
             <w:gridCol w:w="1140"/>
             <w:gridCol w:w="1485"/>
-            <w:gridCol w:w="2070"/>
-            <w:gridCol w:w="3150"/>
+            <w:gridCol w:w="1545"/>
+            <w:gridCol w:w="3675"/>
           </w:tblGrid>
         </w:tblGridChange>
       </w:tblGrid>
@@ -475,8 +475,8 @@
         <w:rPr>
           <w:b w:val="1"/>
           <w:bCs w:val="1"/>
-          <w:sz w:val="30"/>
-          <w:szCs w:val="30"/>
+          <w:sz w:val="12"/>
+          <w:szCs w:val="12"/>
         </w:rPr>
       </w:pPr>
       <w:r>
@@ -488,9 +488,9 @@
     <w:tbl>
       <w:tblPr>
         <w:tblStyle w:val="Table2"/>
-        <w:tblW w:w="10830.0" w:type="dxa"/>
+        <w:tblW w:w="10740.0" w:type="dxa"/>
         <w:jc w:val="left"/>
-        <w:tblInd w:w="-945.0" w:type="dxa"/>
+        <w:tblInd w:w="-855.0" w:type="dxa"/>
         <w:tblBorders>
           <w:top w:color="000000" w:space="0" w:sz="8" w:val="single"/>
           <w:left w:color="000000" w:space="0" w:sz="8" w:val="single"/>
@@ -503,7 +503,7 @@
         <w:tblLook w:val="0600"/>
       </w:tblPr>
       <w:tblGrid>
-        <w:gridCol w:w="1395"/>
+        <w:gridCol w:w="1305"/>
         <w:gridCol w:w="1200"/>
         <w:gridCol w:w="1635"/>
         <w:gridCol w:w="1860"/>
@@ -513,7 +513,7 @@
         <w:gridCol w:w="1380"/>
         <w:tblGridChange w:id="0">
           <w:tblGrid>
-            <w:gridCol w:w="1395"/>
+            <w:gridCol w:w="1305"/>
             <w:gridCol w:w="1200"/>
             <w:gridCol w:w="1635"/>
             <w:gridCol w:w="1860"/>
@@ -1474,8 +1474,8 @@
       <w:pPr>
         <w:ind w:left="-850.3937007874016" w:firstLine="0"/>
         <w:rPr>
-          <w:sz w:val="20"/>
-          <w:szCs w:val="20"/>
+          <w:sz w:val="8"/>
+          <w:szCs w:val="8"/>
         </w:rPr>
       </w:pPr>
       <w:r>
@@ -1727,8 +1727,8 @@
       <w:pPr>
         <w:ind w:left="-850.3937007874016" w:firstLine="0"/>
         <w:rPr>
-          <w:sz w:val="20"/>
-          <w:szCs w:val="20"/>
+          <w:sz w:val="8"/>
+          <w:szCs w:val="8"/>
         </w:rPr>
       </w:pPr>
       <w:r>
@@ -1740,9 +1740,9 @@
     <w:tbl>
       <w:tblPr>
         <w:tblStyle w:val="Table4"/>
-        <w:tblW w:w="10815.0" w:type="dxa"/>
+        <w:tblW w:w="10695.0" w:type="dxa"/>
         <w:jc w:val="left"/>
-        <w:tblInd w:w="-945.0" w:type="dxa"/>
+        <w:tblInd w:w="-825.0" w:type="dxa"/>
         <w:tblBorders>
           <w:top w:color="000000" w:space="0" w:sz="8" w:val="single"/>
           <w:left w:color="000000" w:space="0" w:sz="8" w:val="single"/>
@@ -1755,7 +1755,7 @@
         <w:tblLook w:val="0600"/>
       </w:tblPr>
       <w:tblGrid>
-        <w:gridCol w:w="2850"/>
+        <w:gridCol w:w="2730"/>
         <w:gridCol w:w="1245"/>
         <w:gridCol w:w="1860"/>
         <w:gridCol w:w="1710"/>
@@ -1763,7 +1763,7 @@
         <w:gridCol w:w="1695"/>
         <w:tblGridChange w:id="0">
           <w:tblGrid>
-            <w:gridCol w:w="2850"/>
+            <w:gridCol w:w="2730"/>
             <w:gridCol w:w="1245"/>
             <w:gridCol w:w="1860"/>
             <w:gridCol w:w="1710"/>
@@ -3542,7 +3542,6 @@
         <w:tc>
           <w:tcPr>
             <w:gridSpan w:val="3"/>
-            <w:vMerge w:val="continue"/>
             <w:shd w:fill="auto" w:val="clear"/>
             <w:tcMar>
               <w:top w:w="100.0" w:type="dxa"/>
@@ -3577,8 +3576,8 @@
         <w:rPr>
           <w:b w:val="1"/>
           <w:bCs w:val="1"/>
-          <w:sz w:val="20"/>
-          <w:szCs w:val="20"/>
+          <w:sz w:val="12"/>
+          <w:szCs w:val="12"/>
         </w:rPr>
       </w:pPr>
       <w:r>
@@ -4817,8 +4816,8 @@
         <w:rPr>
           <w:b w:val="1"/>
           <w:bCs w:val="1"/>
-          <w:sz w:val="20"/>
-          <w:szCs w:val="20"/>
+          <w:sz w:val="12"/>
+          <w:szCs w:val="12"/>
         </w:rPr>
       </w:pPr>
       <w:r>
@@ -4830,9 +4829,9 @@
     <w:tbl>
       <w:tblPr>
         <w:tblStyle w:val="Table6"/>
-        <w:tblW w:w="10800.0" w:type="dxa"/>
+        <w:tblW w:w="10695.0" w:type="dxa"/>
         <w:jc w:val="left"/>
-        <w:tblInd w:w="-945.0" w:type="dxa"/>
+        <w:tblInd w:w="-840.0" w:type="dxa"/>
         <w:tblBorders>
           <w:top w:color="000000" w:space="0" w:sz="8" w:val="single"/>
           <w:left w:color="000000" w:space="0" w:sz="8" w:val="single"/>
@@ -4845,16 +4844,16 @@
         <w:tblLook w:val="0600"/>
       </w:tblPr>
       <w:tblGrid>
-        <w:gridCol w:w="2460"/>
-        <w:gridCol w:w="1665"/>
-        <w:gridCol w:w="2490"/>
-        <w:gridCol w:w="4185"/>
+        <w:gridCol w:w="2355"/>
+        <w:gridCol w:w="2235"/>
+        <w:gridCol w:w="2535"/>
+        <w:gridCol w:w="3570"/>
         <w:tblGridChange w:id="0">
           <w:tblGrid>
-            <w:gridCol w:w="2460"/>
-            <w:gridCol w:w="1665"/>
-            <w:gridCol w:w="2490"/>
-            <w:gridCol w:w="4185"/>
+            <w:gridCol w:w="2355"/>
+            <w:gridCol w:w="2235"/>
+            <w:gridCol w:w="2535"/>
+            <w:gridCol w:w="3570"/>
           </w:tblGrid>
         </w:tblGridChange>
       </w:tblGrid>

</xml_diff>

<commit_message>
Checkpoint: Replaced server/templates/abc.docx with the user-provided file. Template verified — all existing placeholders ({dog id}, {date}, {location}, {description}, {notes}) render correctly in the new layout.
</commit_message>
<xml_diff>
--- a/server/templates/abc.docx
+++ b/server/templates/abc.docx
@@ -5220,13 +5220,331 @@
     </w:tbl>
     <w:p>
       <w:pPr>
+        <w:rPr/>
+      </w:pPr>
+      <w:r>
+        <w:rPr>
+          <w:rtl w:val="0"/>
+        </w:rPr>
+      </w:r>
+    </w:p>
+    <w:p>
+      <w:pPr>
+        <w:rPr/>
+      </w:pPr>
+      <w:r>
+        <w:br w:type="page"/>
+      </w:r>
+      <w:r>
+        <w:rPr>
+          <w:rtl w:val="0"/>
+        </w:rPr>
+      </w:r>
+    </w:p>
+    <w:p>
+      <w:pPr>
+        <w:ind w:left="-992.1259842519685" w:firstLine="0"/>
+        <w:rPr/>
+      </w:pPr>
+      <w:r>
+        <w:rPr>
+          <w:rtl w:val="0"/>
+        </w:rPr>
+      </w:r>
+    </w:p>
+    <w:tbl>
+      <w:tblPr>
+        <w:tblStyle w:val="Table7"/>
+        <w:tblpPr w:leftFromText="180" w:rightFromText="180" w:topFromText="180" w:bottomFromText="180" w:vertAnchor="text" w:horzAnchor="text" w:tblpX="-855" w:tblpY="0"/>
+        <w:tblW w:w="11070.0" w:type="dxa"/>
+        <w:jc w:val="left"/>
+        <w:tblBorders>
+          <w:top w:color="000000" w:space="0" w:sz="8" w:val="single"/>
+          <w:left w:color="000000" w:space="0" w:sz="8" w:val="single"/>
+          <w:bottom w:color="000000" w:space="0" w:sz="8" w:val="single"/>
+          <w:right w:color="000000" w:space="0" w:sz="8" w:val="single"/>
+          <w:insideH w:color="000000" w:space="0" w:sz="8" w:val="single"/>
+          <w:insideV w:color="000000" w:space="0" w:sz="8" w:val="single"/>
+        </w:tblBorders>
+        <w:tblLayout w:type="fixed"/>
+        <w:tblLook w:val="0600"/>
+      </w:tblPr>
+      <w:tblGrid>
+        <w:gridCol w:w="1335"/>
+        <w:gridCol w:w="2670"/>
+        <w:gridCol w:w="5385"/>
+        <w:gridCol w:w="1680"/>
+        <w:tblGridChange w:id="0">
+          <w:tblGrid>
+            <w:gridCol w:w="1335"/>
+            <w:gridCol w:w="2670"/>
+            <w:gridCol w:w="5385"/>
+            <w:gridCol w:w="1680"/>
+          </w:tblGrid>
+        </w:tblGridChange>
+      </w:tblGrid>
+      <w:tr>
+        <w:trPr>
+          <w:cantSplit w:val="0"/>
+          <w:tblHeader w:val="0"/>
+        </w:trPr>
+        <w:tc>
+          <w:tcPr/>
+          <w:p>
+            <w:pPr>
+              <w:widowControl w:val="0"/>
+              <w:spacing w:line="240" w:lineRule="auto"/>
+              <w:rPr>
+                <w:rFonts w:ascii="Roboto" w:cs="Roboto" w:eastAsia="Roboto" w:hAnsi="Roboto"/>
+                <w:sz w:val="18"/>
+                <w:szCs w:val="18"/>
+              </w:rPr>
+            </w:pPr>
+            <w:r>
+              <w:rPr>
+                <w:rFonts w:ascii="Roboto" w:cs="Roboto" w:eastAsia="Roboto" w:hAnsi="Roboto"/>
+                <w:sz w:val="18"/>
+                <w:szCs w:val="18"/>
+                <w:rtl w:val="0"/>
+              </w:rPr>
+              <w:t xml:space="preserve">DATE</w:t>
+            </w:r>
+          </w:p>
+        </w:tc>
+        <w:tc>
+          <w:tcPr/>
+          <w:p>
+            <w:pPr>
+              <w:widowControl w:val="0"/>
+              <w:spacing w:line="240" w:lineRule="auto"/>
+              <w:rPr>
+                <w:rFonts w:ascii="Roboto" w:cs="Roboto" w:eastAsia="Roboto" w:hAnsi="Roboto"/>
+                <w:sz w:val="18"/>
+                <w:szCs w:val="18"/>
+              </w:rPr>
+            </w:pPr>
+            <w:r>
+              <w:rPr>
+                <w:rFonts w:ascii="Roboto" w:cs="Roboto" w:eastAsia="Roboto" w:hAnsi="Roboto"/>
+                <w:sz w:val="18"/>
+                <w:szCs w:val="18"/>
+                <w:rtl w:val="0"/>
+              </w:rPr>
+              <w:t xml:space="preserve">SYMPTOMS</w:t>
+            </w:r>
+          </w:p>
+        </w:tc>
+        <w:tc>
+          <w:tcPr/>
+          <w:p>
+            <w:pPr>
+              <w:widowControl w:val="0"/>
+              <w:spacing w:line="240" w:lineRule="auto"/>
+              <w:rPr>
+                <w:rFonts w:ascii="Roboto" w:cs="Roboto" w:eastAsia="Roboto" w:hAnsi="Roboto"/>
+                <w:sz w:val="18"/>
+                <w:szCs w:val="18"/>
+              </w:rPr>
+            </w:pPr>
+            <w:r>
+              <w:rPr>
+                <w:rFonts w:ascii="Roboto" w:cs="Roboto" w:eastAsia="Roboto" w:hAnsi="Roboto"/>
+                <w:sz w:val="18"/>
+                <w:szCs w:val="18"/>
+                <w:rtl w:val="0"/>
+              </w:rPr>
+              <w:t xml:space="preserve">PRESCRIPTION</w:t>
+            </w:r>
+          </w:p>
+        </w:tc>
+        <w:tc>
+          <w:tcPr/>
+          <w:p>
+            <w:pPr>
+              <w:widowControl w:val="0"/>
+              <w:spacing w:line="240" w:lineRule="auto"/>
+              <w:rPr>
+                <w:rFonts w:ascii="Roboto" w:cs="Roboto" w:eastAsia="Roboto" w:hAnsi="Roboto"/>
+                <w:sz w:val="18"/>
+                <w:szCs w:val="18"/>
+              </w:rPr>
+            </w:pPr>
+            <w:r>
+              <w:rPr>
+                <w:rFonts w:ascii="Roboto" w:cs="Roboto" w:eastAsia="Roboto" w:hAnsi="Roboto"/>
+                <w:sz w:val="18"/>
+                <w:szCs w:val="18"/>
+                <w:rtl w:val="0"/>
+              </w:rPr>
+              <w:t xml:space="preserve">NAME</w:t>
+            </w:r>
+          </w:p>
+        </w:tc>
+      </w:tr>
+      <w:tr>
+        <w:trPr>
+          <w:cantSplit w:val="0"/>
+          <w:trHeight w:val="5565" w:hRule="atLeast"/>
+          <w:tblHeader w:val="0"/>
+        </w:trPr>
+        <w:tc>
+          <w:tcPr/>
+          <w:p>
+            <w:pPr>
+              <w:widowControl w:val="0"/>
+              <w:spacing w:line="240" w:lineRule="auto"/>
+              <w:rPr>
+                <w:rFonts w:ascii="Roboto Thin" w:cs="Roboto Thin" w:eastAsia="Roboto Thin" w:hAnsi="Roboto Thin"/>
+                <w:color w:val="d9d9d9"/>
+                <w:sz w:val="36"/>
+                <w:szCs w:val="36"/>
+              </w:rPr>
+            </w:pPr>
+            <w:r>
+              <w:rPr>
+                <w:rFonts w:ascii="Roboto Thin" w:cs="Roboto Thin" w:eastAsia="Roboto Thin" w:hAnsi="Roboto Thin"/>
+                <w:color w:val="d9d9d9"/>
+                <w:sz w:val="36"/>
+                <w:szCs w:val="36"/>
+                <w:rtl w:val="0"/>
+              </w:rPr>
+              <w:t xml:space="preserve">_______________________________________________________________</w:t>
+            </w:r>
+          </w:p>
+          <w:p>
+            <w:pPr>
+              <w:widowControl w:val="0"/>
+              <w:spacing w:line="240" w:lineRule="auto"/>
+              <w:rPr>
+                <w:rFonts w:ascii="Roboto Thin" w:cs="Roboto Thin" w:eastAsia="Roboto Thin" w:hAnsi="Roboto Thin"/>
+                <w:color w:val="d9d9d9"/>
+                <w:sz w:val="36"/>
+                <w:szCs w:val="36"/>
+              </w:rPr>
+            </w:pPr>
+            <w:r>
+              <w:rPr>
+                <w:rFonts w:ascii="Roboto Thin" w:cs="Roboto Thin" w:eastAsia="Roboto Thin" w:hAnsi="Roboto Thin"/>
+                <w:color w:val="d9d9d9"/>
+                <w:sz w:val="36"/>
+                <w:szCs w:val="36"/>
+                <w:rtl w:val="0"/>
+              </w:rPr>
+              <w:t xml:space="preserve">_____________________</w:t>
+            </w:r>
+          </w:p>
+        </w:tc>
+        <w:tc>
+          <w:tcPr/>
+          <w:p>
+            <w:pPr>
+              <w:widowControl w:val="0"/>
+              <w:spacing w:line="240" w:lineRule="auto"/>
+              <w:rPr>
+                <w:sz w:val="40"/>
+                <w:szCs w:val="40"/>
+              </w:rPr>
+            </w:pPr>
+            <w:r>
+              <w:rPr>
+                <w:rFonts w:ascii="Roboto Thin" w:cs="Roboto Thin" w:eastAsia="Roboto Thin" w:hAnsi="Roboto Thin"/>
+                <w:color w:val="d9d9d9"/>
+                <w:sz w:val="36"/>
+                <w:szCs w:val="36"/>
+                <w:rtl w:val="0"/>
+              </w:rPr>
+              <w:t xml:space="preserve">________________________________________________________________________________________________________________________________________________________________________________________________</w:t>
+            </w:r>
+            <w:r>
+              <w:rPr>
+                <w:rtl w:val="0"/>
+              </w:rPr>
+            </w:r>
+          </w:p>
+        </w:tc>
+        <w:tc>
+          <w:tcPr/>
+          <w:p>
+            <w:pPr>
+              <w:widowControl w:val="0"/>
+              <w:spacing w:line="240" w:lineRule="auto"/>
+              <w:rPr>
+                <w:rFonts w:ascii="Roboto Thin" w:cs="Roboto Thin" w:eastAsia="Roboto Thin" w:hAnsi="Roboto Thin"/>
+                <w:color w:val="d9d9d9"/>
+                <w:sz w:val="36"/>
+                <w:szCs w:val="36"/>
+              </w:rPr>
+            </w:pPr>
+            <w:r>
+              <w:rPr>
+                <w:rFonts w:ascii="Roboto Thin" w:cs="Roboto Thin" w:eastAsia="Roboto Thin" w:hAnsi="Roboto Thin"/>
+                <w:color w:val="d9d9d9"/>
+                <w:sz w:val="36"/>
+                <w:szCs w:val="36"/>
+                <w:rtl w:val="0"/>
+              </w:rPr>
+              <w:t xml:space="preserve">____________________________________________________________________________</w:t>
+            </w:r>
+          </w:p>
+          <w:p>
+            <w:pPr>
+              <w:widowControl w:val="0"/>
+              <w:spacing w:line="240" w:lineRule="auto"/>
+              <w:rPr>
+                <w:sz w:val="40"/>
+                <w:szCs w:val="40"/>
+              </w:rPr>
+            </w:pPr>
+            <w:r>
+              <w:rPr>
+                <w:rFonts w:ascii="Roboto Thin" w:cs="Roboto Thin" w:eastAsia="Roboto Thin" w:hAnsi="Roboto Thin"/>
+                <w:color w:val="d9d9d9"/>
+                <w:sz w:val="36"/>
+                <w:szCs w:val="36"/>
+                <w:rtl w:val="0"/>
+              </w:rPr>
+              <w:t xml:space="preserve">__________________________________________________________________________________________________________________________________________________________________________________________________________________________________________________________________________________________________________________</w:t>
+            </w:r>
+            <w:r>
+              <w:rPr>
+                <w:rtl w:val="0"/>
+              </w:rPr>
+            </w:r>
+          </w:p>
+        </w:tc>
+        <w:tc>
+          <w:tcPr/>
+          <w:p>
+            <w:pPr>
+              <w:widowControl w:val="0"/>
+              <w:spacing w:line="240" w:lineRule="auto"/>
+              <w:rPr>
+                <w:rFonts w:ascii="Roboto Thin" w:cs="Roboto Thin" w:eastAsia="Roboto Thin" w:hAnsi="Roboto Thin"/>
+                <w:color w:val="d9d9d9"/>
+                <w:sz w:val="36"/>
+                <w:szCs w:val="36"/>
+              </w:rPr>
+            </w:pPr>
+            <w:r>
+              <w:rPr>
+                <w:rFonts w:ascii="Roboto Thin" w:cs="Roboto Thin" w:eastAsia="Roboto Thin" w:hAnsi="Roboto Thin"/>
+                <w:color w:val="d9d9d9"/>
+                <w:sz w:val="36"/>
+                <w:szCs w:val="36"/>
+                <w:rtl w:val="0"/>
+              </w:rPr>
+              <w:t xml:space="preserve">____________________________________________________________________________________________________________</w:t>
+            </w:r>
+          </w:p>
+        </w:tc>
+      </w:tr>
+    </w:tbl>
+    <w:p>
+      <w:pPr>
         <w:pStyle w:val="Heading1"/>
-        <w:rPr>
-          <w:sz w:val="20"/>
-          <w:szCs w:val="20"/>
-        </w:rPr>
+        <w:rPr/>
       </w:pPr>
-      <w:bookmarkStart w:colFirst="0" w:colLast="0" w:name="_4h46krrfxrkj" w:id="0"/>
+      <w:bookmarkStart w:colFirst="0" w:colLast="0" w:name="_3c219fubekzv" w:id="0"/>
       <w:bookmarkEnd w:id="0"/>
       <w:r>
         <w:rPr>
@@ -5448,6 +5766,13 @@
     </w:tblPr>
   </w:style>
   <w:style w:type="table" w:styleId="Table6">
+    <w:basedOn w:val="TableNormal"/>
+    <w:tblPr>
+      <w:tblStyleRowBandSize w:val="1"/>
+      <w:tblStyleColBandSize w:val="1"/>
+    </w:tblPr>
+  </w:style>
+  <w:style w:type="table" w:styleId="Table7">
     <w:basedOn w:val="TableNormal"/>
     <w:tblPr>
       <w:tblStyleRowBandSize w:val="1"/>

</xml_diff>

<commit_message>
Checkpoint: Replaced server/templates/abc.docx with the user-provided template file.
</commit_message>
<xml_diff>
--- a/server/templates/abc.docx
+++ b/server/templates/abc.docx
@@ -5213,327 +5213,6 @@
               <w:rPr>
                 <w:rtl w:val="0"/>
               </w:rPr>
-            </w:r>
-          </w:p>
-        </w:tc>
-      </w:tr>
-    </w:tbl>
-    <w:p>
-      <w:pPr>
-        <w:rPr/>
-      </w:pPr>
-      <w:r>
-        <w:rPr>
-          <w:rtl w:val="0"/>
-        </w:rPr>
-      </w:r>
-    </w:p>
-    <w:p>
-      <w:pPr>
-        <w:rPr/>
-      </w:pPr>
-      <w:r>
-        <w:br w:type="page"/>
-      </w:r>
-      <w:r>
-        <w:rPr>
-          <w:rtl w:val="0"/>
-        </w:rPr>
-      </w:r>
-    </w:p>
-    <w:p>
-      <w:pPr>
-        <w:ind w:left="-992.1259842519685" w:firstLine="0"/>
-        <w:rPr/>
-      </w:pPr>
-      <w:r>
-        <w:rPr>
-          <w:rtl w:val="0"/>
-        </w:rPr>
-      </w:r>
-    </w:p>
-    <w:tbl>
-      <w:tblPr>
-        <w:tblStyle w:val="Table7"/>
-        <w:tblpPr w:leftFromText="180" w:rightFromText="180" w:topFromText="180" w:bottomFromText="180" w:vertAnchor="text" w:horzAnchor="text" w:tblpX="-855" w:tblpY="0"/>
-        <w:tblW w:w="11070.0" w:type="dxa"/>
-        <w:jc w:val="left"/>
-        <w:tblBorders>
-          <w:top w:color="000000" w:space="0" w:sz="8" w:val="single"/>
-          <w:left w:color="000000" w:space="0" w:sz="8" w:val="single"/>
-          <w:bottom w:color="000000" w:space="0" w:sz="8" w:val="single"/>
-          <w:right w:color="000000" w:space="0" w:sz="8" w:val="single"/>
-          <w:insideH w:color="000000" w:space="0" w:sz="8" w:val="single"/>
-          <w:insideV w:color="000000" w:space="0" w:sz="8" w:val="single"/>
-        </w:tblBorders>
-        <w:tblLayout w:type="fixed"/>
-        <w:tblLook w:val="0600"/>
-      </w:tblPr>
-      <w:tblGrid>
-        <w:gridCol w:w="1335"/>
-        <w:gridCol w:w="2670"/>
-        <w:gridCol w:w="5385"/>
-        <w:gridCol w:w="1680"/>
-        <w:tblGridChange w:id="0">
-          <w:tblGrid>
-            <w:gridCol w:w="1335"/>
-            <w:gridCol w:w="2670"/>
-            <w:gridCol w:w="5385"/>
-            <w:gridCol w:w="1680"/>
-          </w:tblGrid>
-        </w:tblGridChange>
-      </w:tblGrid>
-      <w:tr>
-        <w:trPr>
-          <w:cantSplit w:val="0"/>
-          <w:tblHeader w:val="0"/>
-        </w:trPr>
-        <w:tc>
-          <w:tcPr/>
-          <w:p>
-            <w:pPr>
-              <w:widowControl w:val="0"/>
-              <w:spacing w:line="240" w:lineRule="auto"/>
-              <w:rPr>
-                <w:rFonts w:ascii="Roboto" w:cs="Roboto" w:eastAsia="Roboto" w:hAnsi="Roboto"/>
-                <w:sz w:val="18"/>
-                <w:szCs w:val="18"/>
-              </w:rPr>
-            </w:pPr>
-            <w:r>
-              <w:rPr>
-                <w:rFonts w:ascii="Roboto" w:cs="Roboto" w:eastAsia="Roboto" w:hAnsi="Roboto"/>
-                <w:sz w:val="18"/>
-                <w:szCs w:val="18"/>
-                <w:rtl w:val="0"/>
-              </w:rPr>
-              <w:t xml:space="preserve">DATE</w:t>
-            </w:r>
-          </w:p>
-        </w:tc>
-        <w:tc>
-          <w:tcPr/>
-          <w:p>
-            <w:pPr>
-              <w:widowControl w:val="0"/>
-              <w:spacing w:line="240" w:lineRule="auto"/>
-              <w:rPr>
-                <w:rFonts w:ascii="Roboto" w:cs="Roboto" w:eastAsia="Roboto" w:hAnsi="Roboto"/>
-                <w:sz w:val="18"/>
-                <w:szCs w:val="18"/>
-              </w:rPr>
-            </w:pPr>
-            <w:r>
-              <w:rPr>
-                <w:rFonts w:ascii="Roboto" w:cs="Roboto" w:eastAsia="Roboto" w:hAnsi="Roboto"/>
-                <w:sz w:val="18"/>
-                <w:szCs w:val="18"/>
-                <w:rtl w:val="0"/>
-              </w:rPr>
-              <w:t xml:space="preserve">SYMPTOMS</w:t>
-            </w:r>
-          </w:p>
-        </w:tc>
-        <w:tc>
-          <w:tcPr/>
-          <w:p>
-            <w:pPr>
-              <w:widowControl w:val="0"/>
-              <w:spacing w:line="240" w:lineRule="auto"/>
-              <w:rPr>
-                <w:rFonts w:ascii="Roboto" w:cs="Roboto" w:eastAsia="Roboto" w:hAnsi="Roboto"/>
-                <w:sz w:val="18"/>
-                <w:szCs w:val="18"/>
-              </w:rPr>
-            </w:pPr>
-            <w:r>
-              <w:rPr>
-                <w:rFonts w:ascii="Roboto" w:cs="Roboto" w:eastAsia="Roboto" w:hAnsi="Roboto"/>
-                <w:sz w:val="18"/>
-                <w:szCs w:val="18"/>
-                <w:rtl w:val="0"/>
-              </w:rPr>
-              <w:t xml:space="preserve">PRESCRIPTION</w:t>
-            </w:r>
-          </w:p>
-        </w:tc>
-        <w:tc>
-          <w:tcPr/>
-          <w:p>
-            <w:pPr>
-              <w:widowControl w:val="0"/>
-              <w:spacing w:line="240" w:lineRule="auto"/>
-              <w:rPr>
-                <w:rFonts w:ascii="Roboto" w:cs="Roboto" w:eastAsia="Roboto" w:hAnsi="Roboto"/>
-                <w:sz w:val="18"/>
-                <w:szCs w:val="18"/>
-              </w:rPr>
-            </w:pPr>
-            <w:r>
-              <w:rPr>
-                <w:rFonts w:ascii="Roboto" w:cs="Roboto" w:eastAsia="Roboto" w:hAnsi="Roboto"/>
-                <w:sz w:val="18"/>
-                <w:szCs w:val="18"/>
-                <w:rtl w:val="0"/>
-              </w:rPr>
-              <w:t xml:space="preserve">NAME</w:t>
-            </w:r>
-          </w:p>
-        </w:tc>
-      </w:tr>
-      <w:tr>
-        <w:trPr>
-          <w:cantSplit w:val="0"/>
-          <w:trHeight w:val="5565" w:hRule="atLeast"/>
-          <w:tblHeader w:val="0"/>
-        </w:trPr>
-        <w:tc>
-          <w:tcPr/>
-          <w:p>
-            <w:pPr>
-              <w:widowControl w:val="0"/>
-              <w:spacing w:line="240" w:lineRule="auto"/>
-              <w:rPr>
-                <w:rFonts w:ascii="Roboto Thin" w:cs="Roboto Thin" w:eastAsia="Roboto Thin" w:hAnsi="Roboto Thin"/>
-                <w:color w:val="d9d9d9"/>
-                <w:sz w:val="36"/>
-                <w:szCs w:val="36"/>
-              </w:rPr>
-            </w:pPr>
-            <w:r>
-              <w:rPr>
-                <w:rFonts w:ascii="Roboto Thin" w:cs="Roboto Thin" w:eastAsia="Roboto Thin" w:hAnsi="Roboto Thin"/>
-                <w:color w:val="d9d9d9"/>
-                <w:sz w:val="36"/>
-                <w:szCs w:val="36"/>
-                <w:rtl w:val="0"/>
-              </w:rPr>
-              <w:t xml:space="preserve">_______________________________________________________________</w:t>
-            </w:r>
-          </w:p>
-          <w:p>
-            <w:pPr>
-              <w:widowControl w:val="0"/>
-              <w:spacing w:line="240" w:lineRule="auto"/>
-              <w:rPr>
-                <w:rFonts w:ascii="Roboto Thin" w:cs="Roboto Thin" w:eastAsia="Roboto Thin" w:hAnsi="Roboto Thin"/>
-                <w:color w:val="d9d9d9"/>
-                <w:sz w:val="36"/>
-                <w:szCs w:val="36"/>
-              </w:rPr>
-            </w:pPr>
-            <w:r>
-              <w:rPr>
-                <w:rFonts w:ascii="Roboto Thin" w:cs="Roboto Thin" w:eastAsia="Roboto Thin" w:hAnsi="Roboto Thin"/>
-                <w:color w:val="d9d9d9"/>
-                <w:sz w:val="36"/>
-                <w:szCs w:val="36"/>
-                <w:rtl w:val="0"/>
-              </w:rPr>
-              <w:t xml:space="preserve">_____________________</w:t>
-            </w:r>
-          </w:p>
-        </w:tc>
-        <w:tc>
-          <w:tcPr/>
-          <w:p>
-            <w:pPr>
-              <w:widowControl w:val="0"/>
-              <w:spacing w:line="240" w:lineRule="auto"/>
-              <w:rPr>
-                <w:sz w:val="40"/>
-                <w:szCs w:val="40"/>
-              </w:rPr>
-            </w:pPr>
-            <w:r>
-              <w:rPr>
-                <w:rFonts w:ascii="Roboto Thin" w:cs="Roboto Thin" w:eastAsia="Roboto Thin" w:hAnsi="Roboto Thin"/>
-                <w:color w:val="d9d9d9"/>
-                <w:sz w:val="36"/>
-                <w:szCs w:val="36"/>
-                <w:rtl w:val="0"/>
-              </w:rPr>
-              <w:t xml:space="preserve">________________________________________________________________________________________________________________________________________________________________________________________________</w:t>
-            </w:r>
-            <w:r>
-              <w:rPr>
-                <w:rtl w:val="0"/>
-              </w:rPr>
-            </w:r>
-          </w:p>
-        </w:tc>
-        <w:tc>
-          <w:tcPr/>
-          <w:p>
-            <w:pPr>
-              <w:widowControl w:val="0"/>
-              <w:spacing w:line="240" w:lineRule="auto"/>
-              <w:rPr>
-                <w:rFonts w:ascii="Roboto Thin" w:cs="Roboto Thin" w:eastAsia="Roboto Thin" w:hAnsi="Roboto Thin"/>
-                <w:color w:val="d9d9d9"/>
-                <w:sz w:val="36"/>
-                <w:szCs w:val="36"/>
-              </w:rPr>
-            </w:pPr>
-            <w:r>
-              <w:rPr>
-                <w:rFonts w:ascii="Roboto Thin" w:cs="Roboto Thin" w:eastAsia="Roboto Thin" w:hAnsi="Roboto Thin"/>
-                <w:color w:val="d9d9d9"/>
-                <w:sz w:val="36"/>
-                <w:szCs w:val="36"/>
-                <w:rtl w:val="0"/>
-              </w:rPr>
-              <w:t xml:space="preserve">____________________________________________________________________________</w:t>
-            </w:r>
-          </w:p>
-          <w:p>
-            <w:pPr>
-              <w:widowControl w:val="0"/>
-              <w:spacing w:line="240" w:lineRule="auto"/>
-              <w:rPr>
-                <w:sz w:val="40"/>
-                <w:szCs w:val="40"/>
-              </w:rPr>
-            </w:pPr>
-            <w:r>
-              <w:rPr>
-                <w:rFonts w:ascii="Roboto Thin" w:cs="Roboto Thin" w:eastAsia="Roboto Thin" w:hAnsi="Roboto Thin"/>
-                <w:color w:val="d9d9d9"/>
-                <w:sz w:val="36"/>
-                <w:szCs w:val="36"/>
-                <w:rtl w:val="0"/>
-              </w:rPr>
-              <w:t xml:space="preserve">__________________________________________________________________________________________________________________________________________________________________________________________________________________________________________________________________________________________________________________</w:t>
-            </w:r>
-            <w:r>
-              <w:rPr>
-                <w:rtl w:val="0"/>
-              </w:rPr>
-            </w:r>
-          </w:p>
-        </w:tc>
-        <w:tc>
-          <w:tcPr/>
-          <w:p>
-            <w:pPr>
-              <w:widowControl w:val="0"/>
-              <w:spacing w:line="240" w:lineRule="auto"/>
-              <w:rPr>
-                <w:rFonts w:ascii="Roboto Thin" w:cs="Roboto Thin" w:eastAsia="Roboto Thin" w:hAnsi="Roboto Thin"/>
-                <w:color w:val="d9d9d9"/>
-                <w:sz w:val="36"/>
-                <w:szCs w:val="36"/>
-              </w:rPr>
-            </w:pPr>
-            <w:r>
-              <w:rPr>
-                <w:rFonts w:ascii="Roboto Thin" w:cs="Roboto Thin" w:eastAsia="Roboto Thin" w:hAnsi="Roboto Thin"/>
-                <w:color w:val="d9d9d9"/>
-                <w:sz w:val="36"/>
-                <w:szCs w:val="36"/>
-                <w:rtl w:val="0"/>
-              </w:rPr>
-              <w:t xml:space="preserve">____________________________________________________________________________________________________________</w:t>
             </w:r>
           </w:p>
         </w:tc>
@@ -5766,13 +5445,6 @@
     </w:tblPr>
   </w:style>
   <w:style w:type="table" w:styleId="Table6">
-    <w:basedOn w:val="TableNormal"/>
-    <w:tblPr>
-      <w:tblStyleRowBandSize w:val="1"/>
-      <w:tblStyleColBandSize w:val="1"/>
-    </w:tblPr>
-  </w:style>
-  <w:style w:type="table" w:styleId="Table7">
     <w:basedOn w:val="TableNormal"/>
     <w:tblPr>
       <w:tblStyleRowBandSize w:val="1"/>

</xml_diff>

<commit_message>
Checkpoint: Replaced server/templates/abc.docx with the updated template file provided by the user.
</commit_message>
<xml_diff>
--- a/server/templates/abc.docx
+++ b/server/templates/abc.docx
@@ -4,19 +4,20 @@
   <w:body>
     <w:p>
       <w:pPr>
+        <w:spacing w:line="240" w:lineRule="auto"/>
         <w:ind w:left="-992.1259842519685" w:right="-1032.9921259842508" w:firstLine="0"/>
         <w:jc w:val="center"/>
         <w:rPr>
-          <w:sz w:val="30"/>
-          <w:szCs w:val="30"/>
+          <w:sz w:val="28"/>
+          <w:szCs w:val="28"/>
         </w:rPr>
       </w:pPr>
       <w:r>
         <w:rPr>
           <w:b w:val="1"/>
           <w:bCs w:val="1"/>
-          <w:sz w:val="30"/>
-          <w:szCs w:val="30"/>
+          <w:sz w:val="28"/>
+          <w:szCs w:val="28"/>
           <w:rtl w:val="0"/>
         </w:rPr>
         <w:t xml:space="preserve">Dog ABC</w:t>
@@ -25,16 +26,16 @@
         <w:rPr>
           <w:b w:val="1"/>
           <w:bCs w:val="1"/>
-          <w:sz w:val="30"/>
-          <w:szCs w:val="30"/>
+          <w:sz w:val="28"/>
+          <w:szCs w:val="28"/>
           <w:rtl w:val="0"/>
         </w:rPr>
         <w:t xml:space="preserve"> </w:t>
       </w:r>
       <w:r>
         <w:rPr>
-          <w:sz w:val="30"/>
-          <w:szCs w:val="30"/>
+          <w:sz w:val="28"/>
+          <w:szCs w:val="28"/>
           <w:rtl w:val="0"/>
         </w:rPr>
         <w:t xml:space="preserve">individual case record</w:t>
@@ -42,9 +43,10 @@
     </w:p>
     <w:p>
       <w:pPr>
+        <w:spacing w:line="240" w:lineRule="auto"/>
         <w:rPr>
-          <w:sz w:val="20"/>
-          <w:szCs w:val="20"/>
+          <w:sz w:val="18"/>
+          <w:szCs w:val="18"/>
         </w:rPr>
       </w:pPr>
       <w:r>
@@ -72,19 +74,19 @@
       </w:tblPr>
       <w:tblGrid>
         <w:gridCol w:w="1260"/>
-        <w:gridCol w:w="1695"/>
-        <w:gridCol w:w="1140"/>
-        <w:gridCol w:w="1485"/>
-        <w:gridCol w:w="1545"/>
-        <w:gridCol w:w="3675"/>
+        <w:gridCol w:w="1425"/>
+        <w:gridCol w:w="885"/>
+        <w:gridCol w:w="2325"/>
+        <w:gridCol w:w="1410"/>
+        <w:gridCol w:w="3495"/>
         <w:tblGridChange w:id="0">
           <w:tblGrid>
             <w:gridCol w:w="1260"/>
-            <w:gridCol w:w="1695"/>
-            <w:gridCol w:w="1140"/>
-            <w:gridCol w:w="1485"/>
-            <w:gridCol w:w="1545"/>
-            <w:gridCol w:w="3675"/>
+            <w:gridCol w:w="1425"/>
+            <w:gridCol w:w="885"/>
+            <w:gridCol w:w="2325"/>
+            <w:gridCol w:w="1410"/>
+            <w:gridCol w:w="3495"/>
           </w:tblGrid>
         </w:tblGridChange>
       </w:tblGrid>
@@ -110,14 +112,14 @@
               <w:widowControl w:val="0"/>
               <w:spacing w:line="240" w:lineRule="auto"/>
               <w:rPr>
-                <w:sz w:val="20"/>
-                <w:szCs w:val="20"/>
-              </w:rPr>
-            </w:pPr>
-            <w:r>
-              <w:rPr>
-                <w:sz w:val="20"/>
-                <w:szCs w:val="20"/>
+                <w:sz w:val="18"/>
+                <w:szCs w:val="18"/>
+              </w:rPr>
+            </w:pPr>
+            <w:r>
+              <w:rPr>
+                <w:sz w:val="18"/>
+                <w:szCs w:val="18"/>
                 <w:rtl w:val="0"/>
               </w:rPr>
               <w:t xml:space="preserve">Dog ID</w:t>
@@ -140,14 +142,18 @@
               <w:widowControl w:val="0"/>
               <w:spacing w:line="240" w:lineRule="auto"/>
               <w:rPr>
-                <w:sz w:val="20"/>
-                <w:szCs w:val="20"/>
-              </w:rPr>
-            </w:pPr>
-            <w:r>
-              <w:rPr>
-                <w:sz w:val="20"/>
-                <w:szCs w:val="20"/>
+                <w:b w:val="1"/>
+                <w:bCs w:val="1"/>
+                <w:sz w:val="18"/>
+                <w:szCs w:val="18"/>
+              </w:rPr>
+            </w:pPr>
+            <w:r>
+              <w:rPr>
+                <w:b w:val="1"/>
+                <w:bCs w:val="1"/>
+                <w:sz w:val="18"/>
+                <w:szCs w:val="18"/>
                 <w:rtl w:val="0"/>
               </w:rPr>
               <w:t xml:space="preserve">{dog id}</w:t>
@@ -170,14 +176,14 @@
               <w:widowControl w:val="0"/>
               <w:spacing w:line="240" w:lineRule="auto"/>
               <w:rPr>
-                <w:sz w:val="20"/>
-                <w:szCs w:val="20"/>
-              </w:rPr>
-            </w:pPr>
-            <w:r>
-              <w:rPr>
-                <w:sz w:val="20"/>
-                <w:szCs w:val="20"/>
+                <w:sz w:val="18"/>
+                <w:szCs w:val="18"/>
+              </w:rPr>
+            </w:pPr>
+            <w:r>
+              <w:rPr>
+                <w:sz w:val="18"/>
+                <w:szCs w:val="18"/>
                 <w:rtl w:val="0"/>
               </w:rPr>
               <w:t xml:space="preserve">Date in</w:t>
@@ -200,14 +206,18 @@
               <w:widowControl w:val="0"/>
               <w:spacing w:line="240" w:lineRule="auto"/>
               <w:rPr>
-                <w:sz w:val="20"/>
-                <w:szCs w:val="20"/>
-              </w:rPr>
-            </w:pPr>
-            <w:r>
-              <w:rPr>
-                <w:sz w:val="20"/>
-                <w:szCs w:val="20"/>
+                <w:b w:val="1"/>
+                <w:bCs w:val="1"/>
+                <w:sz w:val="18"/>
+                <w:szCs w:val="18"/>
+              </w:rPr>
+            </w:pPr>
+            <w:r>
+              <w:rPr>
+                <w:b w:val="1"/>
+                <w:bCs w:val="1"/>
+                <w:sz w:val="18"/>
+                <w:szCs w:val="18"/>
                 <w:rtl w:val="0"/>
               </w:rPr>
               <w:t xml:space="preserve">{date}</w:t>
@@ -230,14 +240,14 @@
               <w:widowControl w:val="0"/>
               <w:spacing w:line="240" w:lineRule="auto"/>
               <w:rPr>
-                <w:sz w:val="20"/>
-                <w:szCs w:val="20"/>
-              </w:rPr>
-            </w:pPr>
-            <w:r>
-              <w:rPr>
-                <w:sz w:val="20"/>
-                <w:szCs w:val="20"/>
+                <w:sz w:val="18"/>
+                <w:szCs w:val="18"/>
+              </w:rPr>
+            </w:pPr>
+            <w:r>
+              <w:rPr>
+                <w:sz w:val="18"/>
+                <w:szCs w:val="18"/>
                 <w:rtl w:val="0"/>
               </w:rPr>
               <w:t xml:space="preserve">Catching team</w:t>
@@ -260,8 +270,8 @@
               <w:widowControl w:val="0"/>
               <w:spacing w:line="240" w:lineRule="auto"/>
               <w:rPr>
-                <w:sz w:val="20"/>
-                <w:szCs w:val="20"/>
+                <w:sz w:val="18"/>
+                <w:szCs w:val="18"/>
               </w:rPr>
             </w:pPr>
             <w:r>
@@ -285,14 +295,14 @@
               <w:widowControl w:val="0"/>
               <w:spacing w:line="240" w:lineRule="auto"/>
               <w:rPr>
-                <w:sz w:val="20"/>
-                <w:szCs w:val="20"/>
-              </w:rPr>
-            </w:pPr>
-            <w:r>
-              <w:rPr>
-                <w:sz w:val="20"/>
-                <w:szCs w:val="20"/>
+                <w:sz w:val="18"/>
+                <w:szCs w:val="18"/>
+              </w:rPr>
+            </w:pPr>
+            <w:r>
+              <w:rPr>
+                <w:sz w:val="18"/>
+                <w:szCs w:val="18"/>
                 <w:rtl w:val="0"/>
               </w:rPr>
               <w:t xml:space="preserve">Notes</w:t>
@@ -316,14 +326,14 @@
               <w:widowControl w:val="0"/>
               <w:spacing w:line="240" w:lineRule="auto"/>
               <w:rPr>
-                <w:sz w:val="20"/>
-                <w:szCs w:val="20"/>
-              </w:rPr>
-            </w:pPr>
-            <w:r>
-              <w:rPr>
-                <w:sz w:val="20"/>
-                <w:szCs w:val="20"/>
+                <w:sz w:val="18"/>
+                <w:szCs w:val="18"/>
+              </w:rPr>
+            </w:pPr>
+            <w:r>
+              <w:rPr>
+                <w:sz w:val="18"/>
+                <w:szCs w:val="18"/>
                 <w:rtl w:val="0"/>
               </w:rPr>
               <w:t xml:space="preserve">{notes}</w:t>
@@ -353,14 +363,14 @@
               <w:widowControl w:val="0"/>
               <w:spacing w:line="240" w:lineRule="auto"/>
               <w:rPr>
-                <w:sz w:val="20"/>
-                <w:szCs w:val="20"/>
-              </w:rPr>
-            </w:pPr>
-            <w:r>
-              <w:rPr>
-                <w:sz w:val="20"/>
-                <w:szCs w:val="20"/>
+                <w:sz w:val="18"/>
+                <w:szCs w:val="18"/>
+              </w:rPr>
+            </w:pPr>
+            <w:r>
+              <w:rPr>
+                <w:sz w:val="18"/>
+                <w:szCs w:val="18"/>
                 <w:rtl w:val="0"/>
               </w:rPr>
               <w:t xml:space="preserve">Location</w:t>
@@ -384,14 +394,14 @@
               <w:widowControl w:val="0"/>
               <w:spacing w:line="240" w:lineRule="auto"/>
               <w:rPr>
-                <w:sz w:val="20"/>
-                <w:szCs w:val="20"/>
-              </w:rPr>
-            </w:pPr>
-            <w:r>
-              <w:rPr>
-                <w:sz w:val="20"/>
-                <w:szCs w:val="20"/>
+                <w:sz w:val="18"/>
+                <w:szCs w:val="18"/>
+              </w:rPr>
+            </w:pPr>
+            <w:r>
+              <w:rPr>
+                <w:sz w:val="18"/>
+                <w:szCs w:val="18"/>
                 <w:rtl w:val="0"/>
               </w:rPr>
               <w:t xml:space="preserve">{location}</w:t>
@@ -421,14 +431,14 @@
               <w:widowControl w:val="0"/>
               <w:spacing w:line="240" w:lineRule="auto"/>
               <w:rPr>
-                <w:sz w:val="20"/>
-                <w:szCs w:val="20"/>
-              </w:rPr>
-            </w:pPr>
-            <w:r>
-              <w:rPr>
-                <w:sz w:val="20"/>
-                <w:szCs w:val="20"/>
+                <w:sz w:val="18"/>
+                <w:szCs w:val="18"/>
+              </w:rPr>
+            </w:pPr>
+            <w:r>
+              <w:rPr>
+                <w:sz w:val="18"/>
+                <w:szCs w:val="18"/>
                 <w:rtl w:val="0"/>
               </w:rPr>
               <w:t xml:space="preserve">Description</w:t>
@@ -452,14 +462,18 @@
               <w:widowControl w:val="0"/>
               <w:spacing w:line="240" w:lineRule="auto"/>
               <w:rPr>
-                <w:sz w:val="20"/>
-                <w:szCs w:val="20"/>
-              </w:rPr>
-            </w:pPr>
-            <w:r>
-              <w:rPr>
-                <w:sz w:val="20"/>
-                <w:szCs w:val="20"/>
+                <w:b w:val="1"/>
+                <w:bCs w:val="1"/>
+                <w:sz w:val="18"/>
+                <w:szCs w:val="18"/>
+              </w:rPr>
+            </w:pPr>
+            <w:r>
+              <w:rPr>
+                <w:b w:val="1"/>
+                <w:bCs w:val="1"/>
+                <w:sz w:val="18"/>
+                <w:szCs w:val="18"/>
                 <w:rtl w:val="0"/>
               </w:rPr>
               <w:t xml:space="preserve">{description}</w:t>
@@ -470,13 +484,14 @@
     </w:tbl>
     <w:p>
       <w:pPr>
+        <w:spacing w:line="240" w:lineRule="auto"/>
         <w:ind w:left="-992.1259842519685" w:right="-1032.9921259842508" w:firstLine="0"/>
         <w:jc w:val="left"/>
         <w:rPr>
           <w:b w:val="1"/>
           <w:bCs w:val="1"/>
-          <w:sz w:val="12"/>
-          <w:szCs w:val="12"/>
+          <w:sz w:val="10"/>
+          <w:szCs w:val="10"/>
         </w:rPr>
       </w:pPr>
       <w:r>
@@ -545,14 +560,14 @@
               <w:widowControl w:val="0"/>
               <w:spacing w:line="240" w:lineRule="auto"/>
               <w:rPr>
-                <w:sz w:val="20"/>
-                <w:szCs w:val="20"/>
-              </w:rPr>
-            </w:pPr>
-            <w:r>
-              <w:rPr>
-                <w:sz w:val="20"/>
-                <w:szCs w:val="20"/>
+                <w:sz w:val="18"/>
+                <w:szCs w:val="18"/>
+              </w:rPr>
+            </w:pPr>
+            <w:r>
+              <w:rPr>
+                <w:sz w:val="18"/>
+                <w:szCs w:val="18"/>
                 <w:rtl w:val="0"/>
               </w:rPr>
               <w:t xml:space="preserve">Kennel no.</w:t>
@@ -588,41 +603,41 @@
               <w:ind w:left="0" w:right="0" w:firstLine="0"/>
               <w:jc w:val="left"/>
               <w:rPr>
-                <w:sz w:val="20"/>
-                <w:szCs w:val="20"/>
-              </w:rPr>
-            </w:pPr>
-            <w:r>
-              <w:rPr>
-                <w:rtl w:val="0"/>
-              </w:rPr>
-            </w:r>
-          </w:p>
-        </w:tc>
-        <w:tc>
-          <w:tcPr>
-            <w:shd w:fill="auto" w:val="clear"/>
-            <w:tcMar>
-              <w:top w:w="100.0" w:type="dxa"/>
-              <w:left w:w="100.0" w:type="dxa"/>
-              <w:bottom w:w="100.0" w:type="dxa"/>
-              <w:right w:w="100.0" w:type="dxa"/>
-            </w:tcMar>
-            <w:vAlign w:val="top"/>
-          </w:tcPr>
-          <w:p>
-            <w:pPr>
-              <w:widowControl w:val="0"/>
-              <w:spacing w:line="240" w:lineRule="auto"/>
-              <w:rPr>
-                <w:sz w:val="20"/>
-                <w:szCs w:val="20"/>
-              </w:rPr>
-            </w:pPr>
-            <w:r>
-              <w:rPr>
-                <w:sz w:val="20"/>
-                <w:szCs w:val="20"/>
+                <w:sz w:val="18"/>
+                <w:szCs w:val="18"/>
+              </w:rPr>
+            </w:pPr>
+            <w:r>
+              <w:rPr>
+                <w:rtl w:val="0"/>
+              </w:rPr>
+            </w:r>
+          </w:p>
+        </w:tc>
+        <w:tc>
+          <w:tcPr>
+            <w:shd w:fill="auto" w:val="clear"/>
+            <w:tcMar>
+              <w:top w:w="100.0" w:type="dxa"/>
+              <w:left w:w="100.0" w:type="dxa"/>
+              <w:bottom w:w="100.0" w:type="dxa"/>
+              <w:right w:w="100.0" w:type="dxa"/>
+            </w:tcMar>
+            <w:vAlign w:val="top"/>
+          </w:tcPr>
+          <w:p>
+            <w:pPr>
+              <w:widowControl w:val="0"/>
+              <w:spacing w:line="240" w:lineRule="auto"/>
+              <w:rPr>
+                <w:sz w:val="18"/>
+                <w:szCs w:val="18"/>
+              </w:rPr>
+            </w:pPr>
+            <w:r>
+              <w:rPr>
+                <w:sz w:val="18"/>
+                <w:szCs w:val="18"/>
                 <w:rtl w:val="0"/>
               </w:rPr>
               <w:t xml:space="preserve">CRT</w:t>
@@ -645,41 +660,41 @@
               <w:widowControl w:val="0"/>
               <w:spacing w:line="240" w:lineRule="auto"/>
               <w:rPr>
-                <w:sz w:val="20"/>
-                <w:szCs w:val="20"/>
-              </w:rPr>
-            </w:pPr>
-            <w:r>
-              <w:rPr>
-                <w:rtl w:val="0"/>
-              </w:rPr>
-            </w:r>
-          </w:p>
-        </w:tc>
-        <w:tc>
-          <w:tcPr>
-            <w:shd w:fill="auto" w:val="clear"/>
-            <w:tcMar>
-              <w:top w:w="100.0" w:type="dxa"/>
-              <w:left w:w="100.0" w:type="dxa"/>
-              <w:bottom w:w="100.0" w:type="dxa"/>
-              <w:right w:w="100.0" w:type="dxa"/>
-            </w:tcMar>
-            <w:vAlign w:val="top"/>
-          </w:tcPr>
-          <w:p>
-            <w:pPr>
-              <w:widowControl w:val="0"/>
-              <w:spacing w:line="240" w:lineRule="auto"/>
-              <w:rPr>
-                <w:sz w:val="20"/>
-                <w:szCs w:val="20"/>
-              </w:rPr>
-            </w:pPr>
-            <w:r>
-              <w:rPr>
-                <w:sz w:val="20"/>
-                <w:szCs w:val="20"/>
+                <w:sz w:val="18"/>
+                <w:szCs w:val="18"/>
+              </w:rPr>
+            </w:pPr>
+            <w:r>
+              <w:rPr>
+                <w:rtl w:val="0"/>
+              </w:rPr>
+            </w:r>
+          </w:p>
+        </w:tc>
+        <w:tc>
+          <w:tcPr>
+            <w:shd w:fill="auto" w:val="clear"/>
+            <w:tcMar>
+              <w:top w:w="100.0" w:type="dxa"/>
+              <w:left w:w="100.0" w:type="dxa"/>
+              <w:bottom w:w="100.0" w:type="dxa"/>
+              <w:right w:w="100.0" w:type="dxa"/>
+            </w:tcMar>
+            <w:vAlign w:val="top"/>
+          </w:tcPr>
+          <w:p>
+            <w:pPr>
+              <w:widowControl w:val="0"/>
+              <w:spacing w:line="240" w:lineRule="auto"/>
+              <w:rPr>
+                <w:sz w:val="18"/>
+                <w:szCs w:val="18"/>
+              </w:rPr>
+            </w:pPr>
+            <w:r>
+              <w:rPr>
+                <w:sz w:val="18"/>
+                <w:szCs w:val="18"/>
                 <w:rtl w:val="0"/>
               </w:rPr>
               <w:t xml:space="preserve">HR</w:t>
@@ -702,41 +717,41 @@
               <w:widowControl w:val="0"/>
               <w:spacing w:line="240" w:lineRule="auto"/>
               <w:rPr>
-                <w:sz w:val="20"/>
-                <w:szCs w:val="20"/>
-              </w:rPr>
-            </w:pPr>
-            <w:r>
-              <w:rPr>
-                <w:rtl w:val="0"/>
-              </w:rPr>
-            </w:r>
-          </w:p>
-        </w:tc>
-        <w:tc>
-          <w:tcPr>
-            <w:shd w:fill="auto" w:val="clear"/>
-            <w:tcMar>
-              <w:top w:w="100.0" w:type="dxa"/>
-              <w:left w:w="100.0" w:type="dxa"/>
-              <w:bottom w:w="100.0" w:type="dxa"/>
-              <w:right w:w="100.0" w:type="dxa"/>
-            </w:tcMar>
-            <w:vAlign w:val="top"/>
-          </w:tcPr>
-          <w:p>
-            <w:pPr>
-              <w:widowControl w:val="0"/>
-              <w:spacing w:line="240" w:lineRule="auto"/>
-              <w:rPr>
-                <w:sz w:val="20"/>
-                <w:szCs w:val="20"/>
-              </w:rPr>
-            </w:pPr>
-            <w:r>
-              <w:rPr>
-                <w:sz w:val="20"/>
-                <w:szCs w:val="20"/>
+                <w:sz w:val="18"/>
+                <w:szCs w:val="18"/>
+              </w:rPr>
+            </w:pPr>
+            <w:r>
+              <w:rPr>
+                <w:rtl w:val="0"/>
+              </w:rPr>
+            </w:r>
+          </w:p>
+        </w:tc>
+        <w:tc>
+          <w:tcPr>
+            <w:shd w:fill="auto" w:val="clear"/>
+            <w:tcMar>
+              <w:top w:w="100.0" w:type="dxa"/>
+              <w:left w:w="100.0" w:type="dxa"/>
+              <w:bottom w:w="100.0" w:type="dxa"/>
+              <w:right w:w="100.0" w:type="dxa"/>
+            </w:tcMar>
+            <w:vAlign w:val="top"/>
+          </w:tcPr>
+          <w:p>
+            <w:pPr>
+              <w:widowControl w:val="0"/>
+              <w:spacing w:line="240" w:lineRule="auto"/>
+              <w:rPr>
+                <w:sz w:val="18"/>
+                <w:szCs w:val="18"/>
+              </w:rPr>
+            </w:pPr>
+            <w:r>
+              <w:rPr>
+                <w:sz w:val="18"/>
+                <w:szCs w:val="18"/>
                 <w:rtl w:val="0"/>
               </w:rPr>
               <w:t xml:space="preserve">Surgery date</w:t>
@@ -759,8 +774,8 @@
               <w:widowControl w:val="0"/>
               <w:spacing w:line="240" w:lineRule="auto"/>
               <w:rPr>
-                <w:sz w:val="20"/>
-                <w:szCs w:val="20"/>
+                <w:sz w:val="18"/>
+                <w:szCs w:val="18"/>
               </w:rPr>
             </w:pPr>
             <w:r>
@@ -792,14 +807,14 @@
               <w:widowControl w:val="0"/>
               <w:spacing w:line="240" w:lineRule="auto"/>
               <w:rPr>
-                <w:sz w:val="20"/>
-                <w:szCs w:val="20"/>
-              </w:rPr>
-            </w:pPr>
-            <w:r>
-              <w:rPr>
-                <w:sz w:val="20"/>
-                <w:szCs w:val="20"/>
+                <w:sz w:val="18"/>
+                <w:szCs w:val="18"/>
+              </w:rPr>
+            </w:pPr>
+            <w:r>
+              <w:rPr>
+                <w:sz w:val="18"/>
+                <w:szCs w:val="18"/>
                 <w:rtl w:val="0"/>
               </w:rPr>
               <w:t xml:space="preserve">Age</w:t>
@@ -822,41 +837,41 @@
               <w:widowControl w:val="0"/>
               <w:spacing w:line="240" w:lineRule="auto"/>
               <w:rPr>
-                <w:sz w:val="20"/>
-                <w:szCs w:val="20"/>
-              </w:rPr>
-            </w:pPr>
-            <w:r>
-              <w:rPr>
-                <w:rtl w:val="0"/>
-              </w:rPr>
-            </w:r>
-          </w:p>
-        </w:tc>
-        <w:tc>
-          <w:tcPr>
-            <w:shd w:fill="auto" w:val="clear"/>
-            <w:tcMar>
-              <w:top w:w="100.0" w:type="dxa"/>
-              <w:left w:w="100.0" w:type="dxa"/>
-              <w:bottom w:w="100.0" w:type="dxa"/>
-              <w:right w:w="100.0" w:type="dxa"/>
-            </w:tcMar>
-            <w:vAlign w:val="top"/>
-          </w:tcPr>
-          <w:p>
-            <w:pPr>
-              <w:widowControl w:val="0"/>
-              <w:spacing w:line="240" w:lineRule="auto"/>
-              <w:rPr>
-                <w:sz w:val="20"/>
-                <w:szCs w:val="20"/>
-              </w:rPr>
-            </w:pPr>
-            <w:r>
-              <w:rPr>
-                <w:sz w:val="20"/>
-                <w:szCs w:val="20"/>
+                <w:sz w:val="18"/>
+                <w:szCs w:val="18"/>
+              </w:rPr>
+            </w:pPr>
+            <w:r>
+              <w:rPr>
+                <w:rtl w:val="0"/>
+              </w:rPr>
+            </w:r>
+          </w:p>
+        </w:tc>
+        <w:tc>
+          <w:tcPr>
+            <w:shd w:fill="auto" w:val="clear"/>
+            <w:tcMar>
+              <w:top w:w="100.0" w:type="dxa"/>
+              <w:left w:w="100.0" w:type="dxa"/>
+              <w:bottom w:w="100.0" w:type="dxa"/>
+              <w:right w:w="100.0" w:type="dxa"/>
+            </w:tcMar>
+            <w:vAlign w:val="top"/>
+          </w:tcPr>
+          <w:p>
+            <w:pPr>
+              <w:widowControl w:val="0"/>
+              <w:spacing w:line="240" w:lineRule="auto"/>
+              <w:rPr>
+                <w:sz w:val="18"/>
+                <w:szCs w:val="18"/>
+              </w:rPr>
+            </w:pPr>
+            <w:r>
+              <w:rPr>
+                <w:sz w:val="18"/>
+                <w:szCs w:val="18"/>
                 <w:rtl w:val="0"/>
               </w:rPr>
               <w:t xml:space="preserve">Fluid rate</w:t>
@@ -879,41 +894,41 @@
               <w:widowControl w:val="0"/>
               <w:spacing w:line="240" w:lineRule="auto"/>
               <w:rPr>
-                <w:sz w:val="20"/>
-                <w:szCs w:val="20"/>
-              </w:rPr>
-            </w:pPr>
-            <w:r>
-              <w:rPr>
-                <w:rtl w:val="0"/>
-              </w:rPr>
-            </w:r>
-          </w:p>
-        </w:tc>
-        <w:tc>
-          <w:tcPr>
-            <w:shd w:fill="auto" w:val="clear"/>
-            <w:tcMar>
-              <w:top w:w="100.0" w:type="dxa"/>
-              <w:left w:w="100.0" w:type="dxa"/>
-              <w:bottom w:w="100.0" w:type="dxa"/>
-              <w:right w:w="100.0" w:type="dxa"/>
-            </w:tcMar>
-            <w:vAlign w:val="top"/>
-          </w:tcPr>
-          <w:p>
-            <w:pPr>
-              <w:widowControl w:val="0"/>
-              <w:spacing w:line="240" w:lineRule="auto"/>
-              <w:rPr>
-                <w:sz w:val="20"/>
-                <w:szCs w:val="20"/>
-              </w:rPr>
-            </w:pPr>
-            <w:r>
-              <w:rPr>
-                <w:sz w:val="20"/>
-                <w:szCs w:val="20"/>
+                <w:sz w:val="18"/>
+                <w:szCs w:val="18"/>
+              </w:rPr>
+            </w:pPr>
+            <w:r>
+              <w:rPr>
+                <w:rtl w:val="0"/>
+              </w:rPr>
+            </w:r>
+          </w:p>
+        </w:tc>
+        <w:tc>
+          <w:tcPr>
+            <w:shd w:fill="auto" w:val="clear"/>
+            <w:tcMar>
+              <w:top w:w="100.0" w:type="dxa"/>
+              <w:left w:w="100.0" w:type="dxa"/>
+              <w:bottom w:w="100.0" w:type="dxa"/>
+              <w:right w:w="100.0" w:type="dxa"/>
+            </w:tcMar>
+            <w:vAlign w:val="top"/>
+          </w:tcPr>
+          <w:p>
+            <w:pPr>
+              <w:widowControl w:val="0"/>
+              <w:spacing w:line="240" w:lineRule="auto"/>
+              <w:rPr>
+                <w:sz w:val="18"/>
+                <w:szCs w:val="18"/>
+              </w:rPr>
+            </w:pPr>
+            <w:r>
+              <w:rPr>
+                <w:sz w:val="18"/>
+                <w:szCs w:val="18"/>
                 <w:rtl w:val="0"/>
               </w:rPr>
               <w:t xml:space="preserve">PR</w:t>
@@ -936,41 +951,41 @@
               <w:widowControl w:val="0"/>
               <w:spacing w:line="240" w:lineRule="auto"/>
               <w:rPr>
-                <w:sz w:val="20"/>
-                <w:szCs w:val="20"/>
-              </w:rPr>
-            </w:pPr>
-            <w:r>
-              <w:rPr>
-                <w:rtl w:val="0"/>
-              </w:rPr>
-            </w:r>
-          </w:p>
-        </w:tc>
-        <w:tc>
-          <w:tcPr>
-            <w:shd w:fill="auto" w:val="clear"/>
-            <w:tcMar>
-              <w:top w:w="100.0" w:type="dxa"/>
-              <w:left w:w="100.0" w:type="dxa"/>
-              <w:bottom w:w="100.0" w:type="dxa"/>
-              <w:right w:w="100.0" w:type="dxa"/>
-            </w:tcMar>
-            <w:vAlign w:val="top"/>
-          </w:tcPr>
-          <w:p>
-            <w:pPr>
-              <w:widowControl w:val="0"/>
-              <w:spacing w:line="240" w:lineRule="auto"/>
-              <w:rPr>
-                <w:sz w:val="20"/>
-                <w:szCs w:val="20"/>
-              </w:rPr>
-            </w:pPr>
-            <w:r>
-              <w:rPr>
-                <w:sz w:val="20"/>
-                <w:szCs w:val="20"/>
+                <w:sz w:val="18"/>
+                <w:szCs w:val="18"/>
+              </w:rPr>
+            </w:pPr>
+            <w:r>
+              <w:rPr>
+                <w:rtl w:val="0"/>
+              </w:rPr>
+            </w:r>
+          </w:p>
+        </w:tc>
+        <w:tc>
+          <w:tcPr>
+            <w:shd w:fill="auto" w:val="clear"/>
+            <w:tcMar>
+              <w:top w:w="100.0" w:type="dxa"/>
+              <w:left w:w="100.0" w:type="dxa"/>
+              <w:bottom w:w="100.0" w:type="dxa"/>
+              <w:right w:w="100.0" w:type="dxa"/>
+            </w:tcMar>
+            <w:vAlign w:val="top"/>
+          </w:tcPr>
+          <w:p>
+            <w:pPr>
+              <w:widowControl w:val="0"/>
+              <w:spacing w:line="240" w:lineRule="auto"/>
+              <w:rPr>
+                <w:sz w:val="18"/>
+                <w:szCs w:val="18"/>
+              </w:rPr>
+            </w:pPr>
+            <w:r>
+              <w:rPr>
+                <w:sz w:val="18"/>
+                <w:szCs w:val="18"/>
                 <w:rtl w:val="0"/>
               </w:rPr>
               <w:t xml:space="preserve">Surgery no.</w:t>
@@ -993,8 +1008,8 @@
               <w:widowControl w:val="0"/>
               <w:spacing w:line="240" w:lineRule="auto"/>
               <w:rPr>
-                <w:sz w:val="20"/>
-                <w:szCs w:val="20"/>
+                <w:sz w:val="18"/>
+                <w:szCs w:val="18"/>
               </w:rPr>
             </w:pPr>
             <w:r>
@@ -1027,14 +1042,14 @@
               <w:widowControl w:val="0"/>
               <w:spacing w:line="240" w:lineRule="auto"/>
               <w:rPr>
-                <w:sz w:val="20"/>
-                <w:szCs w:val="20"/>
-              </w:rPr>
-            </w:pPr>
-            <w:r>
-              <w:rPr>
-                <w:sz w:val="20"/>
-                <w:szCs w:val="20"/>
+                <w:sz w:val="18"/>
+                <w:szCs w:val="18"/>
+              </w:rPr>
+            </w:pPr>
+            <w:r>
+              <w:rPr>
+                <w:sz w:val="18"/>
+                <w:szCs w:val="18"/>
                 <w:rtl w:val="0"/>
               </w:rPr>
               <w:t xml:space="preserve">Gender</w:t>
@@ -1057,41 +1072,41 @@
               <w:widowControl w:val="0"/>
               <w:spacing w:line="240" w:lineRule="auto"/>
               <w:rPr>
-                <w:sz w:val="20"/>
-                <w:szCs w:val="20"/>
-              </w:rPr>
-            </w:pPr>
-            <w:r>
-              <w:rPr>
-                <w:rtl w:val="0"/>
-              </w:rPr>
-            </w:r>
-          </w:p>
-        </w:tc>
-        <w:tc>
-          <w:tcPr>
-            <w:shd w:fill="auto" w:val="clear"/>
-            <w:tcMar>
-              <w:top w:w="100.0" w:type="dxa"/>
-              <w:left w:w="100.0" w:type="dxa"/>
-              <w:bottom w:w="100.0" w:type="dxa"/>
-              <w:right w:w="100.0" w:type="dxa"/>
-            </w:tcMar>
-            <w:vAlign w:val="top"/>
-          </w:tcPr>
-          <w:p>
-            <w:pPr>
-              <w:widowControl w:val="0"/>
-              <w:spacing w:line="240" w:lineRule="auto"/>
-              <w:rPr>
-                <w:sz w:val="20"/>
-                <w:szCs w:val="20"/>
-              </w:rPr>
-            </w:pPr>
-            <w:r>
-              <w:rPr>
-                <w:sz w:val="20"/>
-                <w:szCs w:val="20"/>
+                <w:sz w:val="18"/>
+                <w:szCs w:val="18"/>
+              </w:rPr>
+            </w:pPr>
+            <w:r>
+              <w:rPr>
+                <w:rtl w:val="0"/>
+              </w:rPr>
+            </w:r>
+          </w:p>
+        </w:tc>
+        <w:tc>
+          <w:tcPr>
+            <w:shd w:fill="auto" w:val="clear"/>
+            <w:tcMar>
+              <w:top w:w="100.0" w:type="dxa"/>
+              <w:left w:w="100.0" w:type="dxa"/>
+              <w:bottom w:w="100.0" w:type="dxa"/>
+              <w:right w:w="100.0" w:type="dxa"/>
+            </w:tcMar>
+            <w:vAlign w:val="top"/>
+          </w:tcPr>
+          <w:p>
+            <w:pPr>
+              <w:widowControl w:val="0"/>
+              <w:spacing w:line="240" w:lineRule="auto"/>
+              <w:rPr>
+                <w:sz w:val="18"/>
+                <w:szCs w:val="18"/>
+              </w:rPr>
+            </w:pPr>
+            <w:r>
+              <w:rPr>
+                <w:sz w:val="18"/>
+                <w:szCs w:val="18"/>
                 <w:rtl w:val="0"/>
               </w:rPr>
               <w:t xml:space="preserve">Temp</w:t>
@@ -1114,41 +1129,41 @@
               <w:widowControl w:val="0"/>
               <w:spacing w:line="240" w:lineRule="auto"/>
               <w:rPr>
-                <w:sz w:val="20"/>
-                <w:szCs w:val="20"/>
-              </w:rPr>
-            </w:pPr>
-            <w:r>
-              <w:rPr>
-                <w:rtl w:val="0"/>
-              </w:rPr>
-            </w:r>
-          </w:p>
-        </w:tc>
-        <w:tc>
-          <w:tcPr>
-            <w:shd w:fill="auto" w:val="clear"/>
-            <w:tcMar>
-              <w:top w:w="100.0" w:type="dxa"/>
-              <w:left w:w="100.0" w:type="dxa"/>
-              <w:bottom w:w="100.0" w:type="dxa"/>
-              <w:right w:w="100.0" w:type="dxa"/>
-            </w:tcMar>
-            <w:vAlign w:val="top"/>
-          </w:tcPr>
-          <w:p>
-            <w:pPr>
-              <w:widowControl w:val="0"/>
-              <w:spacing w:line="240" w:lineRule="auto"/>
-              <w:rPr>
-                <w:sz w:val="20"/>
-                <w:szCs w:val="20"/>
-              </w:rPr>
-            </w:pPr>
-            <w:r>
-              <w:rPr>
-                <w:sz w:val="20"/>
-                <w:szCs w:val="20"/>
+                <w:sz w:val="18"/>
+                <w:szCs w:val="18"/>
+              </w:rPr>
+            </w:pPr>
+            <w:r>
+              <w:rPr>
+                <w:rtl w:val="0"/>
+              </w:rPr>
+            </w:r>
+          </w:p>
+        </w:tc>
+        <w:tc>
+          <w:tcPr>
+            <w:shd w:fill="auto" w:val="clear"/>
+            <w:tcMar>
+              <w:top w:w="100.0" w:type="dxa"/>
+              <w:left w:w="100.0" w:type="dxa"/>
+              <w:bottom w:w="100.0" w:type="dxa"/>
+              <w:right w:w="100.0" w:type="dxa"/>
+            </w:tcMar>
+            <w:vAlign w:val="top"/>
+          </w:tcPr>
+          <w:p>
+            <w:pPr>
+              <w:widowControl w:val="0"/>
+              <w:spacing w:line="240" w:lineRule="auto"/>
+              <w:rPr>
+                <w:sz w:val="18"/>
+                <w:szCs w:val="18"/>
+              </w:rPr>
+            </w:pPr>
+            <w:r>
+              <w:rPr>
+                <w:sz w:val="18"/>
+                <w:szCs w:val="18"/>
                 <w:rtl w:val="0"/>
               </w:rPr>
               <w:t xml:space="preserve">MM</w:t>
@@ -1171,41 +1186,41 @@
               <w:widowControl w:val="0"/>
               <w:spacing w:line="240" w:lineRule="auto"/>
               <w:rPr>
-                <w:sz w:val="20"/>
-                <w:szCs w:val="20"/>
-              </w:rPr>
-            </w:pPr>
-            <w:r>
-              <w:rPr>
-                <w:rtl w:val="0"/>
-              </w:rPr>
-            </w:r>
-          </w:p>
-        </w:tc>
-        <w:tc>
-          <w:tcPr>
-            <w:shd w:fill="auto" w:val="clear"/>
-            <w:tcMar>
-              <w:top w:w="100.0" w:type="dxa"/>
-              <w:left w:w="100.0" w:type="dxa"/>
-              <w:bottom w:w="100.0" w:type="dxa"/>
-              <w:right w:w="100.0" w:type="dxa"/>
-            </w:tcMar>
-            <w:vAlign w:val="top"/>
-          </w:tcPr>
-          <w:p>
-            <w:pPr>
-              <w:widowControl w:val="0"/>
-              <w:spacing w:line="240" w:lineRule="auto"/>
-              <w:rPr>
-                <w:sz w:val="20"/>
-                <w:szCs w:val="20"/>
-              </w:rPr>
-            </w:pPr>
-            <w:r>
-              <w:rPr>
-                <w:sz w:val="20"/>
-                <w:szCs w:val="20"/>
+                <w:sz w:val="18"/>
+                <w:szCs w:val="18"/>
+              </w:rPr>
+            </w:pPr>
+            <w:r>
+              <w:rPr>
+                <w:rtl w:val="0"/>
+              </w:rPr>
+            </w:r>
+          </w:p>
+        </w:tc>
+        <w:tc>
+          <w:tcPr>
+            <w:shd w:fill="auto" w:val="clear"/>
+            <w:tcMar>
+              <w:top w:w="100.0" w:type="dxa"/>
+              <w:left w:w="100.0" w:type="dxa"/>
+              <w:bottom w:w="100.0" w:type="dxa"/>
+              <w:right w:w="100.0" w:type="dxa"/>
+            </w:tcMar>
+            <w:vAlign w:val="top"/>
+          </w:tcPr>
+          <w:p>
+            <w:pPr>
+              <w:widowControl w:val="0"/>
+              <w:spacing w:line="240" w:lineRule="auto"/>
+              <w:rPr>
+                <w:sz w:val="18"/>
+                <w:szCs w:val="18"/>
+              </w:rPr>
+            </w:pPr>
+            <w:r>
+              <w:rPr>
+                <w:sz w:val="18"/>
+                <w:szCs w:val="18"/>
                 <w:rtl w:val="0"/>
               </w:rPr>
               <w:t xml:space="preserve">Flank/Midline</w:t>
@@ -1228,8 +1243,8 @@
               <w:widowControl w:val="0"/>
               <w:spacing w:line="240" w:lineRule="auto"/>
               <w:rPr>
-                <w:sz w:val="20"/>
-                <w:szCs w:val="20"/>
+                <w:sz w:val="18"/>
+                <w:szCs w:val="18"/>
               </w:rPr>
             </w:pPr>
             <w:r>
@@ -1262,14 +1277,14 @@
               <w:widowControl w:val="0"/>
               <w:spacing w:line="240" w:lineRule="auto"/>
               <w:rPr>
-                <w:sz w:val="20"/>
-                <w:szCs w:val="20"/>
-              </w:rPr>
-            </w:pPr>
-            <w:r>
-              <w:rPr>
-                <w:sz w:val="20"/>
-                <w:szCs w:val="20"/>
+                <w:sz w:val="18"/>
+                <w:szCs w:val="18"/>
+              </w:rPr>
+            </w:pPr>
+            <w:r>
+              <w:rPr>
+                <w:sz w:val="18"/>
+                <w:szCs w:val="18"/>
                 <w:rtl w:val="0"/>
               </w:rPr>
               <w:t xml:space="preserve">Weight</w:t>
@@ -1292,41 +1307,41 @@
               <w:widowControl w:val="0"/>
               <w:spacing w:line="240" w:lineRule="auto"/>
               <w:rPr>
-                <w:sz w:val="20"/>
-                <w:szCs w:val="20"/>
-              </w:rPr>
-            </w:pPr>
-            <w:r>
-              <w:rPr>
-                <w:rtl w:val="0"/>
-              </w:rPr>
-            </w:r>
-          </w:p>
-        </w:tc>
-        <w:tc>
-          <w:tcPr>
-            <w:shd w:fill="auto" w:val="clear"/>
-            <w:tcMar>
-              <w:top w:w="100.0" w:type="dxa"/>
-              <w:left w:w="100.0" w:type="dxa"/>
-              <w:bottom w:w="100.0" w:type="dxa"/>
-              <w:right w:w="100.0" w:type="dxa"/>
-            </w:tcMar>
-            <w:vAlign w:val="top"/>
-          </w:tcPr>
-          <w:p>
-            <w:pPr>
-              <w:widowControl w:val="0"/>
-              <w:spacing w:line="240" w:lineRule="auto"/>
-              <w:rPr>
-                <w:sz w:val="20"/>
-                <w:szCs w:val="20"/>
-              </w:rPr>
-            </w:pPr>
-            <w:r>
-              <w:rPr>
-                <w:sz w:val="20"/>
-                <w:szCs w:val="20"/>
+                <w:sz w:val="18"/>
+                <w:szCs w:val="18"/>
+              </w:rPr>
+            </w:pPr>
+            <w:r>
+              <w:rPr>
+                <w:rtl w:val="0"/>
+              </w:rPr>
+            </w:r>
+          </w:p>
+        </w:tc>
+        <w:tc>
+          <w:tcPr>
+            <w:shd w:fill="auto" w:val="clear"/>
+            <w:tcMar>
+              <w:top w:w="100.0" w:type="dxa"/>
+              <w:left w:w="100.0" w:type="dxa"/>
+              <w:bottom w:w="100.0" w:type="dxa"/>
+              <w:right w:w="100.0" w:type="dxa"/>
+            </w:tcMar>
+            <w:vAlign w:val="top"/>
+          </w:tcPr>
+          <w:p>
+            <w:pPr>
+              <w:widowControl w:val="0"/>
+              <w:spacing w:line="240" w:lineRule="auto"/>
+              <w:rPr>
+                <w:sz w:val="18"/>
+                <w:szCs w:val="18"/>
+              </w:rPr>
+            </w:pPr>
+            <w:r>
+              <w:rPr>
+                <w:sz w:val="18"/>
+                <w:szCs w:val="18"/>
                 <w:rtl w:val="0"/>
               </w:rPr>
               <w:t xml:space="preserve">Dehydration %</w:t>
@@ -1349,116 +1364,116 @@
               <w:widowControl w:val="0"/>
               <w:spacing w:line="240" w:lineRule="auto"/>
               <w:rPr>
-                <w:sz w:val="20"/>
-                <w:szCs w:val="20"/>
-              </w:rPr>
-            </w:pPr>
-            <w:r>
-              <w:rPr>
-                <w:rtl w:val="0"/>
-              </w:rPr>
-            </w:r>
-          </w:p>
-        </w:tc>
-        <w:tc>
-          <w:tcPr>
-            <w:shd w:fill="auto" w:val="clear"/>
-            <w:tcMar>
-              <w:top w:w="100.0" w:type="dxa"/>
-              <w:left w:w="100.0" w:type="dxa"/>
-              <w:bottom w:w="100.0" w:type="dxa"/>
-              <w:right w:w="100.0" w:type="dxa"/>
-            </w:tcMar>
-            <w:vAlign w:val="top"/>
-          </w:tcPr>
-          <w:p>
-            <w:pPr>
-              <w:widowControl w:val="0"/>
-              <w:spacing w:line="240" w:lineRule="auto"/>
-              <w:rPr>
-                <w:sz w:val="20"/>
-                <w:szCs w:val="20"/>
-              </w:rPr>
-            </w:pPr>
-            <w:r>
-              <w:rPr>
-                <w:rtl w:val="0"/>
-              </w:rPr>
-            </w:r>
-          </w:p>
-        </w:tc>
-        <w:tc>
-          <w:tcPr>
-            <w:shd w:fill="auto" w:val="clear"/>
-            <w:tcMar>
-              <w:top w:w="100.0" w:type="dxa"/>
-              <w:left w:w="100.0" w:type="dxa"/>
-              <w:bottom w:w="100.0" w:type="dxa"/>
-              <w:right w:w="100.0" w:type="dxa"/>
-            </w:tcMar>
-            <w:vAlign w:val="top"/>
-          </w:tcPr>
-          <w:p>
-            <w:pPr>
-              <w:widowControl w:val="0"/>
-              <w:spacing w:line="240" w:lineRule="auto"/>
-              <w:rPr>
-                <w:sz w:val="20"/>
-                <w:szCs w:val="20"/>
-              </w:rPr>
-            </w:pPr>
-            <w:r>
-              <w:rPr>
-                <w:rtl w:val="0"/>
-              </w:rPr>
-            </w:r>
-          </w:p>
-        </w:tc>
-        <w:tc>
-          <w:tcPr>
-            <w:shd w:fill="auto" w:val="clear"/>
-            <w:tcMar>
-              <w:top w:w="100.0" w:type="dxa"/>
-              <w:left w:w="100.0" w:type="dxa"/>
-              <w:bottom w:w="100.0" w:type="dxa"/>
-              <w:right w:w="100.0" w:type="dxa"/>
-            </w:tcMar>
-            <w:vAlign w:val="top"/>
-          </w:tcPr>
-          <w:p>
-            <w:pPr>
-              <w:widowControl w:val="0"/>
-              <w:spacing w:line="240" w:lineRule="auto"/>
-              <w:rPr>
-                <w:sz w:val="20"/>
-                <w:szCs w:val="20"/>
-              </w:rPr>
-            </w:pPr>
-            <w:r>
-              <w:rPr>
-                <w:rtl w:val="0"/>
-              </w:rPr>
-            </w:r>
-          </w:p>
-        </w:tc>
-        <w:tc>
-          <w:tcPr>
-            <w:shd w:fill="auto" w:val="clear"/>
-            <w:tcMar>
-              <w:top w:w="100.0" w:type="dxa"/>
-              <w:left w:w="100.0" w:type="dxa"/>
-              <w:bottom w:w="100.0" w:type="dxa"/>
-              <w:right w:w="100.0" w:type="dxa"/>
-            </w:tcMar>
-            <w:vAlign w:val="top"/>
-          </w:tcPr>
-          <w:p>
-            <w:pPr>
-              <w:widowControl w:val="0"/>
-              <w:spacing w:line="240" w:lineRule="auto"/>
-              <w:rPr>
-                <w:sz w:val="20"/>
-                <w:szCs w:val="20"/>
+                <w:sz w:val="18"/>
+                <w:szCs w:val="18"/>
+              </w:rPr>
+            </w:pPr>
+            <w:r>
+              <w:rPr>
+                <w:rtl w:val="0"/>
+              </w:rPr>
+            </w:r>
+          </w:p>
+        </w:tc>
+        <w:tc>
+          <w:tcPr>
+            <w:shd w:fill="auto" w:val="clear"/>
+            <w:tcMar>
+              <w:top w:w="100.0" w:type="dxa"/>
+              <w:left w:w="100.0" w:type="dxa"/>
+              <w:bottom w:w="100.0" w:type="dxa"/>
+              <w:right w:w="100.0" w:type="dxa"/>
+            </w:tcMar>
+            <w:vAlign w:val="top"/>
+          </w:tcPr>
+          <w:p>
+            <w:pPr>
+              <w:widowControl w:val="0"/>
+              <w:spacing w:line="240" w:lineRule="auto"/>
+              <w:rPr>
+                <w:sz w:val="18"/>
+                <w:szCs w:val="18"/>
+              </w:rPr>
+            </w:pPr>
+            <w:r>
+              <w:rPr>
+                <w:rtl w:val="0"/>
+              </w:rPr>
+            </w:r>
+          </w:p>
+        </w:tc>
+        <w:tc>
+          <w:tcPr>
+            <w:shd w:fill="auto" w:val="clear"/>
+            <w:tcMar>
+              <w:top w:w="100.0" w:type="dxa"/>
+              <w:left w:w="100.0" w:type="dxa"/>
+              <w:bottom w:w="100.0" w:type="dxa"/>
+              <w:right w:w="100.0" w:type="dxa"/>
+            </w:tcMar>
+            <w:vAlign w:val="top"/>
+          </w:tcPr>
+          <w:p>
+            <w:pPr>
+              <w:widowControl w:val="0"/>
+              <w:spacing w:line="240" w:lineRule="auto"/>
+              <w:rPr>
+                <w:sz w:val="18"/>
+                <w:szCs w:val="18"/>
+              </w:rPr>
+            </w:pPr>
+            <w:r>
+              <w:rPr>
+                <w:rtl w:val="0"/>
+              </w:rPr>
+            </w:r>
+          </w:p>
+        </w:tc>
+        <w:tc>
+          <w:tcPr>
+            <w:shd w:fill="auto" w:val="clear"/>
+            <w:tcMar>
+              <w:top w:w="100.0" w:type="dxa"/>
+              <w:left w:w="100.0" w:type="dxa"/>
+              <w:bottom w:w="100.0" w:type="dxa"/>
+              <w:right w:w="100.0" w:type="dxa"/>
+            </w:tcMar>
+            <w:vAlign w:val="top"/>
+          </w:tcPr>
+          <w:p>
+            <w:pPr>
+              <w:widowControl w:val="0"/>
+              <w:spacing w:line="240" w:lineRule="auto"/>
+              <w:rPr>
+                <w:sz w:val="18"/>
+                <w:szCs w:val="18"/>
+              </w:rPr>
+            </w:pPr>
+            <w:r>
+              <w:rPr>
+                <w:rtl w:val="0"/>
+              </w:rPr>
+            </w:r>
+          </w:p>
+        </w:tc>
+        <w:tc>
+          <w:tcPr>
+            <w:shd w:fill="auto" w:val="clear"/>
+            <w:tcMar>
+              <w:top w:w="100.0" w:type="dxa"/>
+              <w:left w:w="100.0" w:type="dxa"/>
+              <w:bottom w:w="100.0" w:type="dxa"/>
+              <w:right w:w="100.0" w:type="dxa"/>
+            </w:tcMar>
+            <w:vAlign w:val="top"/>
+          </w:tcPr>
+          <w:p>
+            <w:pPr>
+              <w:widowControl w:val="0"/>
+              <w:spacing w:line="240" w:lineRule="auto"/>
+              <w:rPr>
+                <w:sz w:val="18"/>
+                <w:szCs w:val="18"/>
               </w:rPr>
             </w:pPr>
             <w:r>
@@ -1472,10 +1487,11 @@
     </w:tbl>
     <w:p>
       <w:pPr>
+        <w:spacing w:line="240" w:lineRule="auto"/>
         <w:ind w:left="-850.3937007874016" w:firstLine="0"/>
         <w:rPr>
-          <w:sz w:val="8"/>
-          <w:szCs w:val="8"/>
+          <w:sz w:val="6"/>
+          <w:szCs w:val="6"/>
         </w:rPr>
       </w:pPr>
       <w:r>
@@ -1540,14 +1556,14 @@
               <w:widowControl w:val="0"/>
               <w:spacing w:line="240" w:lineRule="auto"/>
               <w:rPr>
-                <w:sz w:val="20"/>
-                <w:szCs w:val="20"/>
-              </w:rPr>
-            </w:pPr>
-            <w:r>
-              <w:rPr>
-                <w:sz w:val="20"/>
-                <w:szCs w:val="20"/>
+                <w:sz w:val="18"/>
+                <w:szCs w:val="18"/>
+              </w:rPr>
+            </w:pPr>
+            <w:r>
+              <w:rPr>
+                <w:sz w:val="18"/>
+                <w:szCs w:val="18"/>
                 <w:rtl w:val="0"/>
               </w:rPr>
               <w:t xml:space="preserve">Surgeon</w:t>
@@ -1570,41 +1586,41 @@
               <w:widowControl w:val="0"/>
               <w:spacing w:line="240" w:lineRule="auto"/>
               <w:rPr>
-                <w:sz w:val="20"/>
-                <w:szCs w:val="20"/>
-              </w:rPr>
-            </w:pPr>
-            <w:r>
-              <w:rPr>
-                <w:rtl w:val="0"/>
-              </w:rPr>
-            </w:r>
-          </w:p>
-        </w:tc>
-        <w:tc>
-          <w:tcPr>
-            <w:shd w:fill="auto" w:val="clear"/>
-            <w:tcMar>
-              <w:top w:w="100.0" w:type="dxa"/>
-              <w:left w:w="100.0" w:type="dxa"/>
-              <w:bottom w:w="100.0" w:type="dxa"/>
-              <w:right w:w="100.0" w:type="dxa"/>
-            </w:tcMar>
-            <w:vAlign w:val="top"/>
-          </w:tcPr>
-          <w:p>
-            <w:pPr>
-              <w:widowControl w:val="0"/>
-              <w:spacing w:line="240" w:lineRule="auto"/>
-              <w:rPr>
-                <w:sz w:val="20"/>
-                <w:szCs w:val="20"/>
-              </w:rPr>
-            </w:pPr>
-            <w:r>
-              <w:rPr>
-                <w:sz w:val="20"/>
-                <w:szCs w:val="20"/>
+                <w:sz w:val="18"/>
+                <w:szCs w:val="18"/>
+              </w:rPr>
+            </w:pPr>
+            <w:r>
+              <w:rPr>
+                <w:rtl w:val="0"/>
+              </w:rPr>
+            </w:r>
+          </w:p>
+        </w:tc>
+        <w:tc>
+          <w:tcPr>
+            <w:shd w:fill="auto" w:val="clear"/>
+            <w:tcMar>
+              <w:top w:w="100.0" w:type="dxa"/>
+              <w:left w:w="100.0" w:type="dxa"/>
+              <w:bottom w:w="100.0" w:type="dxa"/>
+              <w:right w:w="100.0" w:type="dxa"/>
+            </w:tcMar>
+            <w:vAlign w:val="top"/>
+          </w:tcPr>
+          <w:p>
+            <w:pPr>
+              <w:widowControl w:val="0"/>
+              <w:spacing w:line="240" w:lineRule="auto"/>
+              <w:rPr>
+                <w:sz w:val="18"/>
+                <w:szCs w:val="18"/>
+              </w:rPr>
+            </w:pPr>
+            <w:r>
+              <w:rPr>
+                <w:sz w:val="18"/>
+                <w:szCs w:val="18"/>
                 <w:rtl w:val="0"/>
               </w:rPr>
               <w:t xml:space="preserve">Assistant</w:t>
@@ -1640,41 +1656,41 @@
               <w:ind w:left="0" w:right="0" w:firstLine="0"/>
               <w:jc w:val="left"/>
               <w:rPr>
-                <w:sz w:val="20"/>
-                <w:szCs w:val="20"/>
-              </w:rPr>
-            </w:pPr>
-            <w:r>
-              <w:rPr>
-                <w:rtl w:val="0"/>
-              </w:rPr>
-            </w:r>
-          </w:p>
-        </w:tc>
-        <w:tc>
-          <w:tcPr>
-            <w:shd w:fill="auto" w:val="clear"/>
-            <w:tcMar>
-              <w:top w:w="100.0" w:type="dxa"/>
-              <w:left w:w="100.0" w:type="dxa"/>
-              <w:bottom w:w="100.0" w:type="dxa"/>
-              <w:right w:w="100.0" w:type="dxa"/>
-            </w:tcMar>
-            <w:vAlign w:val="top"/>
-          </w:tcPr>
-          <w:p>
-            <w:pPr>
-              <w:widowControl w:val="0"/>
-              <w:spacing w:line="240" w:lineRule="auto"/>
-              <w:rPr>
-                <w:sz w:val="20"/>
-                <w:szCs w:val="20"/>
-              </w:rPr>
-            </w:pPr>
-            <w:r>
-              <w:rPr>
-                <w:sz w:val="20"/>
-                <w:szCs w:val="20"/>
+                <w:sz w:val="18"/>
+                <w:szCs w:val="18"/>
+              </w:rPr>
+            </w:pPr>
+            <w:r>
+              <w:rPr>
+                <w:rtl w:val="0"/>
+              </w:rPr>
+            </w:r>
+          </w:p>
+        </w:tc>
+        <w:tc>
+          <w:tcPr>
+            <w:shd w:fill="auto" w:val="clear"/>
+            <w:tcMar>
+              <w:top w:w="100.0" w:type="dxa"/>
+              <w:left w:w="100.0" w:type="dxa"/>
+              <w:bottom w:w="100.0" w:type="dxa"/>
+              <w:right w:w="100.0" w:type="dxa"/>
+            </w:tcMar>
+            <w:vAlign w:val="top"/>
+          </w:tcPr>
+          <w:p>
+            <w:pPr>
+              <w:widowControl w:val="0"/>
+              <w:spacing w:line="240" w:lineRule="auto"/>
+              <w:rPr>
+                <w:sz w:val="18"/>
+                <w:szCs w:val="18"/>
+              </w:rPr>
+            </w:pPr>
+            <w:r>
+              <w:rPr>
+                <w:sz w:val="18"/>
+                <w:szCs w:val="18"/>
                 <w:rtl w:val="0"/>
               </w:rPr>
               <w:t xml:space="preserve">Anesthesiologist</w:t>
@@ -1710,8 +1726,8 @@
               <w:ind w:left="0" w:right="0" w:firstLine="0"/>
               <w:jc w:val="left"/>
               <w:rPr>
-                <w:sz w:val="20"/>
-                <w:szCs w:val="20"/>
+                <w:sz w:val="18"/>
+                <w:szCs w:val="18"/>
               </w:rPr>
             </w:pPr>
             <w:r>
@@ -1725,10 +1741,11 @@
     </w:tbl>
     <w:p>
       <w:pPr>
+        <w:spacing w:line="240" w:lineRule="auto"/>
         <w:ind w:left="-850.3937007874016" w:firstLine="0"/>
         <w:rPr>
-          <w:sz w:val="8"/>
-          <w:szCs w:val="8"/>
+          <w:sz w:val="6"/>
+          <w:szCs w:val="6"/>
         </w:rPr>
       </w:pPr>
       <w:r>
@@ -1810,16 +1827,16 @@
               <w:rPr>
                 <w:b w:val="1"/>
                 <w:bCs w:val="1"/>
-                <w:sz w:val="20"/>
-                <w:szCs w:val="20"/>
+                <w:sz w:val="18"/>
+                <w:szCs w:val="18"/>
               </w:rPr>
             </w:pPr>
             <w:r>
               <w:rPr>
                 <w:b w:val="1"/>
                 <w:bCs w:val="1"/>
-                <w:sz w:val="20"/>
-                <w:szCs w:val="20"/>
+                <w:sz w:val="18"/>
+                <w:szCs w:val="18"/>
                 <w:rtl w:val="0"/>
               </w:rPr>
               <w:t xml:space="preserve">Premedication</w:t>
@@ -1857,8 +1874,8 @@
               <w:ind w:left="0" w:right="0" w:firstLine="0"/>
               <w:jc w:val="left"/>
               <w:rPr>
-                <w:sz w:val="20"/>
-                <w:szCs w:val="20"/>
+                <w:sz w:val="18"/>
+                <w:szCs w:val="18"/>
               </w:rPr>
             </w:pPr>
             <w:r>
@@ -1891,14 +1908,14 @@
               <w:widowControl w:val="0"/>
               <w:spacing w:line="240" w:lineRule="auto"/>
               <w:rPr>
-                <w:sz w:val="20"/>
-                <w:szCs w:val="20"/>
-              </w:rPr>
-            </w:pPr>
-            <w:r>
-              <w:rPr>
-                <w:sz w:val="20"/>
-                <w:szCs w:val="20"/>
+                <w:sz w:val="18"/>
+                <w:szCs w:val="18"/>
+              </w:rPr>
+            </w:pPr>
+            <w:r>
+              <w:rPr>
+                <w:sz w:val="18"/>
+                <w:szCs w:val="18"/>
                 <w:rtl w:val="0"/>
               </w:rPr>
               <w:t xml:space="preserve">Sedative</w:t>
@@ -1921,14 +1938,14 @@
               <w:widowControl w:val="0"/>
               <w:spacing w:line="240" w:lineRule="auto"/>
               <w:rPr>
-                <w:sz w:val="20"/>
-                <w:szCs w:val="20"/>
-              </w:rPr>
-            </w:pPr>
-            <w:r>
-              <w:rPr>
-                <w:sz w:val="20"/>
-                <w:szCs w:val="20"/>
+                <w:sz w:val="18"/>
+                <w:szCs w:val="18"/>
+              </w:rPr>
+            </w:pPr>
+            <w:r>
+              <w:rPr>
+                <w:sz w:val="18"/>
+                <w:szCs w:val="18"/>
                 <w:rtl w:val="0"/>
               </w:rPr>
               <w:t xml:space="preserve">Dose </w:t>
@@ -1951,14 +1968,14 @@
               <w:widowControl w:val="0"/>
               <w:spacing w:line="240" w:lineRule="auto"/>
               <w:rPr>
-                <w:sz w:val="20"/>
-                <w:szCs w:val="20"/>
-              </w:rPr>
-            </w:pPr>
-            <w:r>
-              <w:rPr>
-                <w:sz w:val="20"/>
-                <w:szCs w:val="20"/>
+                <w:sz w:val="18"/>
+                <w:szCs w:val="18"/>
+              </w:rPr>
+            </w:pPr>
+            <w:r>
+              <w:rPr>
+                <w:sz w:val="18"/>
+                <w:szCs w:val="18"/>
                 <w:rtl w:val="0"/>
               </w:rPr>
               <w:t xml:space="preserve">Time</w:t>
@@ -1984,8 +2001,8 @@
               <w:spacing w:after="0" w:before="0" w:line="240" w:lineRule="auto"/>
               <w:ind w:left="0" w:firstLine="0"/>
               <w:rPr>
-                <w:sz w:val="20"/>
-                <w:szCs w:val="20"/>
+                <w:sz w:val="18"/>
+                <w:szCs w:val="18"/>
               </w:rPr>
             </w:pPr>
             <w:r>
@@ -2020,14 +2037,14 @@
               <w:rPr>
                 <w:b w:val="1"/>
                 <w:bCs w:val="1"/>
-                <w:sz w:val="20"/>
-                <w:szCs w:val="20"/>
-              </w:rPr>
-            </w:pPr>
-            <w:r>
-              <w:rPr>
-                <w:sz w:val="20"/>
-                <w:szCs w:val="20"/>
+                <w:sz w:val="18"/>
+                <w:szCs w:val="18"/>
+              </w:rPr>
+            </w:pPr>
+            <w:r>
+              <w:rPr>
+                <w:sz w:val="18"/>
+                <w:szCs w:val="18"/>
                 <w:rtl w:val="0"/>
               </w:rPr>
               <w:t xml:space="preserve">Xylazine(0.1ml/kg) </w:t>
@@ -2036,8 +2053,8 @@
               <w:rPr>
                 <w:b w:val="1"/>
                 <w:bCs w:val="1"/>
-                <w:sz w:val="20"/>
-                <w:szCs w:val="20"/>
+                <w:sz w:val="18"/>
+                <w:szCs w:val="18"/>
                 <w:rtl w:val="0"/>
               </w:rPr>
               <w:t xml:space="preserve">IM</w:t>
@@ -2060,35 +2077,35 @@
               <w:widowControl w:val="0"/>
               <w:spacing w:line="240" w:lineRule="auto"/>
               <w:rPr>
-                <w:sz w:val="20"/>
-                <w:szCs w:val="20"/>
-              </w:rPr>
-            </w:pPr>
-            <w:r>
-              <w:rPr>
-                <w:rtl w:val="0"/>
-              </w:rPr>
-            </w:r>
-          </w:p>
-        </w:tc>
-        <w:tc>
-          <w:tcPr>
-            <w:shd w:fill="auto" w:val="clear"/>
-            <w:tcMar>
-              <w:top w:w="100.0" w:type="dxa"/>
-              <w:left w:w="100.0" w:type="dxa"/>
-              <w:bottom w:w="100.0" w:type="dxa"/>
-              <w:right w:w="100.0" w:type="dxa"/>
-            </w:tcMar>
-            <w:vAlign w:val="top"/>
-          </w:tcPr>
-          <w:p>
-            <w:pPr>
-              <w:widowControl w:val="0"/>
-              <w:spacing w:line="240" w:lineRule="auto"/>
-              <w:rPr>
-                <w:sz w:val="20"/>
-                <w:szCs w:val="20"/>
+                <w:sz w:val="18"/>
+                <w:szCs w:val="18"/>
+              </w:rPr>
+            </w:pPr>
+            <w:r>
+              <w:rPr>
+                <w:rtl w:val="0"/>
+              </w:rPr>
+            </w:r>
+          </w:p>
+        </w:tc>
+        <w:tc>
+          <w:tcPr>
+            <w:shd w:fill="auto" w:val="clear"/>
+            <w:tcMar>
+              <w:top w:w="100.0" w:type="dxa"/>
+              <w:left w:w="100.0" w:type="dxa"/>
+              <w:bottom w:w="100.0" w:type="dxa"/>
+              <w:right w:w="100.0" w:type="dxa"/>
+            </w:tcMar>
+            <w:vAlign w:val="top"/>
+          </w:tcPr>
+          <w:p>
+            <w:pPr>
+              <w:widowControl w:val="0"/>
+              <w:spacing w:line="240" w:lineRule="auto"/>
+              <w:rPr>
+                <w:sz w:val="18"/>
+                <w:szCs w:val="18"/>
               </w:rPr>
             </w:pPr>
             <w:r>
@@ -2119,8 +2136,8 @@
               <w:rPr>
                 <w:b w:val="1"/>
                 <w:bCs w:val="1"/>
-                <w:sz w:val="20"/>
-                <w:szCs w:val="20"/>
+                <w:sz w:val="18"/>
+                <w:szCs w:val="18"/>
               </w:rPr>
             </w:pPr>
             <w:r>
@@ -2155,14 +2172,14 @@
               <w:rPr>
                 <w:b w:val="1"/>
                 <w:bCs w:val="1"/>
-                <w:sz w:val="20"/>
-                <w:szCs w:val="20"/>
-              </w:rPr>
-            </w:pPr>
-            <w:r>
-              <w:rPr>
-                <w:sz w:val="20"/>
-                <w:szCs w:val="20"/>
+                <w:sz w:val="18"/>
+                <w:szCs w:val="18"/>
+              </w:rPr>
+            </w:pPr>
+            <w:r>
+              <w:rPr>
+                <w:sz w:val="18"/>
+                <w:szCs w:val="18"/>
                 <w:rtl w:val="0"/>
               </w:rPr>
               <w:t xml:space="preserve">Butorphanol (0.1ml/kg) </w:t>
@@ -2171,8 +2188,8 @@
               <w:rPr>
                 <w:b w:val="1"/>
                 <w:bCs w:val="1"/>
-                <w:sz w:val="20"/>
-                <w:szCs w:val="20"/>
+                <w:sz w:val="18"/>
+                <w:szCs w:val="18"/>
                 <w:rtl w:val="0"/>
               </w:rPr>
               <w:t xml:space="preserve">IM</w:t>
@@ -2195,35 +2212,35 @@
               <w:widowControl w:val="0"/>
               <w:spacing w:line="240" w:lineRule="auto"/>
               <w:rPr>
-                <w:sz w:val="20"/>
-                <w:szCs w:val="20"/>
-              </w:rPr>
-            </w:pPr>
-            <w:r>
-              <w:rPr>
-                <w:rtl w:val="0"/>
-              </w:rPr>
-            </w:r>
-          </w:p>
-        </w:tc>
-        <w:tc>
-          <w:tcPr>
-            <w:shd w:fill="auto" w:val="clear"/>
-            <w:tcMar>
-              <w:top w:w="100.0" w:type="dxa"/>
-              <w:left w:w="100.0" w:type="dxa"/>
-              <w:bottom w:w="100.0" w:type="dxa"/>
-              <w:right w:w="100.0" w:type="dxa"/>
-            </w:tcMar>
-            <w:vAlign w:val="top"/>
-          </w:tcPr>
-          <w:p>
-            <w:pPr>
-              <w:widowControl w:val="0"/>
-              <w:spacing w:line="240" w:lineRule="auto"/>
-              <w:rPr>
-                <w:sz w:val="20"/>
-                <w:szCs w:val="20"/>
+                <w:sz w:val="18"/>
+                <w:szCs w:val="18"/>
+              </w:rPr>
+            </w:pPr>
+            <w:r>
+              <w:rPr>
+                <w:rtl w:val="0"/>
+              </w:rPr>
+            </w:r>
+          </w:p>
+        </w:tc>
+        <w:tc>
+          <w:tcPr>
+            <w:shd w:fill="auto" w:val="clear"/>
+            <w:tcMar>
+              <w:top w:w="100.0" w:type="dxa"/>
+              <w:left w:w="100.0" w:type="dxa"/>
+              <w:bottom w:w="100.0" w:type="dxa"/>
+              <w:right w:w="100.0" w:type="dxa"/>
+            </w:tcMar>
+            <w:vAlign w:val="top"/>
+          </w:tcPr>
+          <w:p>
+            <w:pPr>
+              <w:widowControl w:val="0"/>
+              <w:spacing w:line="240" w:lineRule="auto"/>
+              <w:rPr>
+                <w:sz w:val="18"/>
+                <w:szCs w:val="18"/>
               </w:rPr>
             </w:pPr>
             <w:r>
@@ -2254,8 +2271,8 @@
               <w:rPr>
                 <w:b w:val="1"/>
                 <w:bCs w:val="1"/>
-                <w:sz w:val="20"/>
-                <w:szCs w:val="20"/>
+                <w:sz w:val="18"/>
+                <w:szCs w:val="18"/>
               </w:rPr>
             </w:pPr>
             <w:r>
@@ -2286,20 +2303,21 @@
           </w:tcPr>
           <w:p>
             <w:pPr>
+              <w:spacing w:line="240" w:lineRule="auto"/>
               <w:ind w:left="0" w:firstLine="0"/>
               <w:rPr>
                 <w:b w:val="1"/>
                 <w:bCs w:val="1"/>
-                <w:sz w:val="20"/>
-                <w:szCs w:val="20"/>
+                <w:sz w:val="18"/>
+                <w:szCs w:val="18"/>
               </w:rPr>
             </w:pPr>
             <w:r>
               <w:rPr>
                 <w:b w:val="1"/>
                 <w:bCs w:val="1"/>
-                <w:sz w:val="20"/>
-                <w:szCs w:val="20"/>
+                <w:sz w:val="18"/>
+                <w:szCs w:val="18"/>
                 <w:rtl w:val="0"/>
               </w:rPr>
               <w:t xml:space="preserve">Induction</w:t>
@@ -2329,14 +2347,14 @@
               <w:widowControl w:val="0"/>
               <w:spacing w:line="240" w:lineRule="auto"/>
               <w:rPr>
-                <w:sz w:val="20"/>
-                <w:szCs w:val="20"/>
-              </w:rPr>
-            </w:pPr>
-            <w:r>
-              <w:rPr>
-                <w:sz w:val="20"/>
-                <w:szCs w:val="20"/>
+                <w:sz w:val="18"/>
+                <w:szCs w:val="18"/>
+              </w:rPr>
+            </w:pPr>
+            <w:r>
+              <w:rPr>
+                <w:sz w:val="18"/>
+                <w:szCs w:val="18"/>
                 <w:rtl w:val="0"/>
               </w:rPr>
               <w:t xml:space="preserve">Intravenous drugs</w:t>
@@ -2359,14 +2377,14 @@
               <w:widowControl w:val="0"/>
               <w:spacing w:line="240" w:lineRule="auto"/>
               <w:rPr>
-                <w:sz w:val="20"/>
-                <w:szCs w:val="20"/>
-              </w:rPr>
-            </w:pPr>
-            <w:r>
-              <w:rPr>
-                <w:sz w:val="20"/>
-                <w:szCs w:val="20"/>
+                <w:sz w:val="18"/>
+                <w:szCs w:val="18"/>
+              </w:rPr>
+            </w:pPr>
+            <w:r>
+              <w:rPr>
+                <w:sz w:val="18"/>
+                <w:szCs w:val="18"/>
                 <w:rtl w:val="0"/>
               </w:rPr>
               <w:t xml:space="preserve">Dose</w:t>
@@ -2389,14 +2407,14 @@
               <w:widowControl w:val="0"/>
               <w:spacing w:line="240" w:lineRule="auto"/>
               <w:rPr>
-                <w:sz w:val="20"/>
-                <w:szCs w:val="20"/>
-              </w:rPr>
-            </w:pPr>
-            <w:r>
-              <w:rPr>
-                <w:sz w:val="20"/>
-                <w:szCs w:val="20"/>
+                <w:sz w:val="18"/>
+                <w:szCs w:val="18"/>
+              </w:rPr>
+            </w:pPr>
+            <w:r>
+              <w:rPr>
+                <w:sz w:val="18"/>
+                <w:szCs w:val="18"/>
                 <w:rtl w:val="0"/>
               </w:rPr>
               <w:t xml:space="preserve">Time</w:t>
@@ -2419,14 +2437,14 @@
               <w:widowControl w:val="0"/>
               <w:spacing w:line="240" w:lineRule="auto"/>
               <w:rPr>
-                <w:sz w:val="20"/>
-                <w:szCs w:val="20"/>
-              </w:rPr>
-            </w:pPr>
-            <w:r>
-              <w:rPr>
-                <w:sz w:val="20"/>
-                <w:szCs w:val="20"/>
+                <w:sz w:val="18"/>
+                <w:szCs w:val="18"/>
+              </w:rPr>
+            </w:pPr>
+            <w:r>
+              <w:rPr>
+                <w:sz w:val="18"/>
+                <w:szCs w:val="18"/>
                 <w:rtl w:val="0"/>
               </w:rPr>
               <w:t xml:space="preserve">Subcut drugs</w:t>
@@ -2449,14 +2467,14 @@
               <w:widowControl w:val="0"/>
               <w:spacing w:line="240" w:lineRule="auto"/>
               <w:rPr>
-                <w:sz w:val="20"/>
-                <w:szCs w:val="20"/>
-              </w:rPr>
-            </w:pPr>
-            <w:r>
-              <w:rPr>
-                <w:sz w:val="20"/>
-                <w:szCs w:val="20"/>
+                <w:sz w:val="18"/>
+                <w:szCs w:val="18"/>
+              </w:rPr>
+            </w:pPr>
+            <w:r>
+              <w:rPr>
+                <w:sz w:val="18"/>
+                <w:szCs w:val="18"/>
                 <w:rtl w:val="0"/>
               </w:rPr>
               <w:t xml:space="preserve">Dose</w:t>
@@ -2479,14 +2497,14 @@
               <w:widowControl w:val="0"/>
               <w:spacing w:line="240" w:lineRule="auto"/>
               <w:rPr>
-                <w:sz w:val="20"/>
-                <w:szCs w:val="20"/>
-              </w:rPr>
-            </w:pPr>
-            <w:r>
-              <w:rPr>
-                <w:sz w:val="20"/>
-                <w:szCs w:val="20"/>
+                <w:sz w:val="18"/>
+                <w:szCs w:val="18"/>
+              </w:rPr>
+            </w:pPr>
+            <w:r>
+              <w:rPr>
+                <w:sz w:val="18"/>
+                <w:szCs w:val="18"/>
                 <w:rtl w:val="0"/>
               </w:rPr>
               <w:t xml:space="preserve">Time</w:t>
@@ -2516,14 +2534,14 @@
               <w:widowControl w:val="0"/>
               <w:spacing w:line="240" w:lineRule="auto"/>
               <w:rPr>
-                <w:sz w:val="20"/>
-                <w:szCs w:val="20"/>
-              </w:rPr>
-            </w:pPr>
-            <w:r>
-              <w:rPr>
-                <w:sz w:val="20"/>
-                <w:szCs w:val="20"/>
+                <w:sz w:val="18"/>
+                <w:szCs w:val="18"/>
+              </w:rPr>
+            </w:pPr>
+            <w:r>
+              <w:rPr>
+                <w:sz w:val="18"/>
+                <w:szCs w:val="18"/>
                 <w:rtl w:val="0"/>
               </w:rPr>
               <w:t xml:space="preserve">Propofol (0.1ml/kg) - IV</w:t>
@@ -2546,35 +2564,35 @@
               <w:widowControl w:val="0"/>
               <w:spacing w:line="240" w:lineRule="auto"/>
               <w:rPr>
-                <w:sz w:val="20"/>
-                <w:szCs w:val="20"/>
-              </w:rPr>
-            </w:pPr>
-            <w:r>
-              <w:rPr>
-                <w:rtl w:val="0"/>
-              </w:rPr>
-            </w:r>
-          </w:p>
-        </w:tc>
-        <w:tc>
-          <w:tcPr>
-            <w:shd w:fill="auto" w:val="clear"/>
-            <w:tcMar>
-              <w:top w:w="100.0" w:type="dxa"/>
-              <w:left w:w="100.0" w:type="dxa"/>
-              <w:bottom w:w="100.0" w:type="dxa"/>
-              <w:right w:w="100.0" w:type="dxa"/>
-            </w:tcMar>
-            <w:vAlign w:val="top"/>
-          </w:tcPr>
-          <w:p>
-            <w:pPr>
-              <w:widowControl w:val="0"/>
-              <w:spacing w:line="240" w:lineRule="auto"/>
-              <w:rPr>
-                <w:sz w:val="20"/>
-                <w:szCs w:val="20"/>
+                <w:sz w:val="18"/>
+                <w:szCs w:val="18"/>
+              </w:rPr>
+            </w:pPr>
+            <w:r>
+              <w:rPr>
+                <w:rtl w:val="0"/>
+              </w:rPr>
+            </w:r>
+          </w:p>
+        </w:tc>
+        <w:tc>
+          <w:tcPr>
+            <w:shd w:fill="auto" w:val="clear"/>
+            <w:tcMar>
+              <w:top w:w="100.0" w:type="dxa"/>
+              <w:left w:w="100.0" w:type="dxa"/>
+              <w:bottom w:w="100.0" w:type="dxa"/>
+              <w:right w:w="100.0" w:type="dxa"/>
+            </w:tcMar>
+            <w:vAlign w:val="top"/>
+          </w:tcPr>
+          <w:p>
+            <w:pPr>
+              <w:widowControl w:val="0"/>
+              <w:spacing w:line="240" w:lineRule="auto"/>
+              <w:rPr>
+                <w:sz w:val="18"/>
+                <w:szCs w:val="18"/>
               </w:rPr>
             </w:pPr>
             <w:r>
@@ -2602,14 +2620,14 @@
               <w:rPr>
                 <w:b w:val="1"/>
                 <w:bCs w:val="1"/>
-                <w:sz w:val="20"/>
-                <w:szCs w:val="20"/>
-              </w:rPr>
-            </w:pPr>
-            <w:r>
-              <w:rPr>
-                <w:sz w:val="20"/>
-                <w:szCs w:val="20"/>
+                <w:sz w:val="18"/>
+                <w:szCs w:val="18"/>
+              </w:rPr>
+            </w:pPr>
+            <w:r>
+              <w:rPr>
+                <w:sz w:val="18"/>
+                <w:szCs w:val="18"/>
                 <w:rtl w:val="0"/>
               </w:rPr>
               <w:t xml:space="preserve">Meloxicam (0.04ml/kg) - </w:t>
@@ -2618,8 +2636,8 @@
               <w:rPr>
                 <w:b w:val="1"/>
                 <w:bCs w:val="1"/>
-                <w:sz w:val="20"/>
-                <w:szCs w:val="20"/>
+                <w:sz w:val="18"/>
+                <w:szCs w:val="18"/>
                 <w:rtl w:val="0"/>
               </w:rPr>
               <w:t xml:space="preserve">Subcut</w:t>
@@ -2642,35 +2660,35 @@
               <w:widowControl w:val="0"/>
               <w:spacing w:line="240" w:lineRule="auto"/>
               <w:rPr>
-                <w:sz w:val="20"/>
-                <w:szCs w:val="20"/>
-              </w:rPr>
-            </w:pPr>
-            <w:r>
-              <w:rPr>
-                <w:rtl w:val="0"/>
-              </w:rPr>
-            </w:r>
-          </w:p>
-        </w:tc>
-        <w:tc>
-          <w:tcPr>
-            <w:shd w:fill="auto" w:val="clear"/>
-            <w:tcMar>
-              <w:top w:w="100.0" w:type="dxa"/>
-              <w:left w:w="100.0" w:type="dxa"/>
-              <w:bottom w:w="100.0" w:type="dxa"/>
-              <w:right w:w="100.0" w:type="dxa"/>
-            </w:tcMar>
-            <w:vAlign w:val="top"/>
-          </w:tcPr>
-          <w:p>
-            <w:pPr>
-              <w:widowControl w:val="0"/>
-              <w:spacing w:line="240" w:lineRule="auto"/>
-              <w:rPr>
-                <w:sz w:val="20"/>
-                <w:szCs w:val="20"/>
+                <w:sz w:val="18"/>
+                <w:szCs w:val="18"/>
+              </w:rPr>
+            </w:pPr>
+            <w:r>
+              <w:rPr>
+                <w:rtl w:val="0"/>
+              </w:rPr>
+            </w:r>
+          </w:p>
+        </w:tc>
+        <w:tc>
+          <w:tcPr>
+            <w:shd w:fill="auto" w:val="clear"/>
+            <w:tcMar>
+              <w:top w:w="100.0" w:type="dxa"/>
+              <w:left w:w="100.0" w:type="dxa"/>
+              <w:bottom w:w="100.0" w:type="dxa"/>
+              <w:right w:w="100.0" w:type="dxa"/>
+            </w:tcMar>
+            <w:vAlign w:val="top"/>
+          </w:tcPr>
+          <w:p>
+            <w:pPr>
+              <w:widowControl w:val="0"/>
+              <w:spacing w:line="240" w:lineRule="auto"/>
+              <w:rPr>
+                <w:sz w:val="18"/>
+                <w:szCs w:val="18"/>
               </w:rPr>
             </w:pPr>
             <w:r>
@@ -2703,14 +2721,14 @@
               <w:widowControl w:val="0"/>
               <w:spacing w:line="240" w:lineRule="auto"/>
               <w:rPr>
-                <w:sz w:val="20"/>
-                <w:szCs w:val="20"/>
-              </w:rPr>
-            </w:pPr>
-            <w:r>
-              <w:rPr>
-                <w:sz w:val="20"/>
-                <w:szCs w:val="20"/>
+                <w:sz w:val="18"/>
+                <w:szCs w:val="18"/>
+              </w:rPr>
+            </w:pPr>
+            <w:r>
+              <w:rPr>
+                <w:sz w:val="18"/>
+                <w:szCs w:val="18"/>
                 <w:rtl w:val="0"/>
               </w:rPr>
               <w:t xml:space="preserve">Diazepam (0.1/ml/kg) - IV</w:t>
@@ -2733,35 +2751,35 @@
               <w:widowControl w:val="0"/>
               <w:spacing w:line="240" w:lineRule="auto"/>
               <w:rPr>
-                <w:sz w:val="20"/>
-                <w:szCs w:val="20"/>
-              </w:rPr>
-            </w:pPr>
-            <w:r>
-              <w:rPr>
-                <w:rtl w:val="0"/>
-              </w:rPr>
-            </w:r>
-          </w:p>
-        </w:tc>
-        <w:tc>
-          <w:tcPr>
-            <w:shd w:fill="auto" w:val="clear"/>
-            <w:tcMar>
-              <w:top w:w="100.0" w:type="dxa"/>
-              <w:left w:w="100.0" w:type="dxa"/>
-              <w:bottom w:w="100.0" w:type="dxa"/>
-              <w:right w:w="100.0" w:type="dxa"/>
-            </w:tcMar>
-            <w:vAlign w:val="top"/>
-          </w:tcPr>
-          <w:p>
-            <w:pPr>
-              <w:widowControl w:val="0"/>
-              <w:spacing w:line="240" w:lineRule="auto"/>
-              <w:rPr>
-                <w:sz w:val="20"/>
-                <w:szCs w:val="20"/>
+                <w:sz w:val="18"/>
+                <w:szCs w:val="18"/>
+              </w:rPr>
+            </w:pPr>
+            <w:r>
+              <w:rPr>
+                <w:rtl w:val="0"/>
+              </w:rPr>
+            </w:r>
+          </w:p>
+        </w:tc>
+        <w:tc>
+          <w:tcPr>
+            <w:shd w:fill="auto" w:val="clear"/>
+            <w:tcMar>
+              <w:top w:w="100.0" w:type="dxa"/>
+              <w:left w:w="100.0" w:type="dxa"/>
+              <w:bottom w:w="100.0" w:type="dxa"/>
+              <w:right w:w="100.0" w:type="dxa"/>
+            </w:tcMar>
+            <w:vAlign w:val="top"/>
+          </w:tcPr>
+          <w:p>
+            <w:pPr>
+              <w:widowControl w:val="0"/>
+              <w:spacing w:line="240" w:lineRule="auto"/>
+              <w:rPr>
+                <w:sz w:val="18"/>
+                <w:szCs w:val="18"/>
               </w:rPr>
             </w:pPr>
             <w:r>
@@ -2790,14 +2808,14 @@
               <w:rPr>
                 <w:b w:val="1"/>
                 <w:bCs w:val="1"/>
-                <w:sz w:val="20"/>
-                <w:szCs w:val="20"/>
-              </w:rPr>
-            </w:pPr>
-            <w:r>
-              <w:rPr>
-                <w:sz w:val="20"/>
-                <w:szCs w:val="20"/>
+                <w:sz w:val="18"/>
+                <w:szCs w:val="18"/>
+              </w:rPr>
+            </w:pPr>
+            <w:r>
+              <w:rPr>
+                <w:sz w:val="18"/>
+                <w:szCs w:val="18"/>
                 <w:rtl w:val="0"/>
               </w:rPr>
               <w:t xml:space="preserve">Ivermectin (0.025ml/kg) - </w:t>
@@ -2806,8 +2824,8 @@
               <w:rPr>
                 <w:b w:val="1"/>
                 <w:bCs w:val="1"/>
-                <w:sz w:val="20"/>
-                <w:szCs w:val="20"/>
+                <w:sz w:val="18"/>
+                <w:szCs w:val="18"/>
                 <w:rtl w:val="0"/>
               </w:rPr>
               <w:t xml:space="preserve">Subcut</w:t>
@@ -2832,8 +2850,8 @@
               <w:spacing w:after="0" w:before="0" w:line="240" w:lineRule="auto"/>
               <w:ind w:left="0" w:firstLine="0"/>
               <w:rPr>
-                <w:sz w:val="20"/>
-                <w:szCs w:val="20"/>
+                <w:sz w:val="18"/>
+                <w:szCs w:val="18"/>
               </w:rPr>
             </w:pPr>
             <w:r>
@@ -2861,8 +2879,8 @@
               <w:spacing w:after="0" w:before="0" w:line="240" w:lineRule="auto"/>
               <w:ind w:left="0" w:firstLine="0"/>
               <w:rPr>
-                <w:sz w:val="20"/>
-                <w:szCs w:val="20"/>
+                <w:sz w:val="18"/>
+                <w:szCs w:val="18"/>
               </w:rPr>
             </w:pPr>
             <w:r>
@@ -2895,14 +2913,14 @@
               <w:widowControl w:val="0"/>
               <w:spacing w:line="240" w:lineRule="auto"/>
               <w:rPr>
-                <w:sz w:val="20"/>
-                <w:szCs w:val="20"/>
-              </w:rPr>
-            </w:pPr>
-            <w:r>
-              <w:rPr>
-                <w:sz w:val="20"/>
-                <w:szCs w:val="20"/>
+                <w:sz w:val="18"/>
+                <w:szCs w:val="18"/>
+              </w:rPr>
+            </w:pPr>
+            <w:r>
+              <w:rPr>
+                <w:sz w:val="18"/>
+                <w:szCs w:val="18"/>
                 <w:rtl w:val="0"/>
               </w:rPr>
               <w:t xml:space="preserve">Tramadol (0.04ml/kg) -IV</w:t>
@@ -2925,35 +2943,35 @@
               <w:widowControl w:val="0"/>
               <w:spacing w:line="240" w:lineRule="auto"/>
               <w:rPr>
-                <w:sz w:val="20"/>
-                <w:szCs w:val="20"/>
-              </w:rPr>
-            </w:pPr>
-            <w:r>
-              <w:rPr>
-                <w:rtl w:val="0"/>
-              </w:rPr>
-            </w:r>
-          </w:p>
-        </w:tc>
-        <w:tc>
-          <w:tcPr>
-            <w:shd w:fill="auto" w:val="clear"/>
-            <w:tcMar>
-              <w:top w:w="100.0" w:type="dxa"/>
-              <w:left w:w="100.0" w:type="dxa"/>
-              <w:bottom w:w="100.0" w:type="dxa"/>
-              <w:right w:w="100.0" w:type="dxa"/>
-            </w:tcMar>
-            <w:vAlign w:val="top"/>
-          </w:tcPr>
-          <w:p>
-            <w:pPr>
-              <w:widowControl w:val="0"/>
-              <w:spacing w:line="240" w:lineRule="auto"/>
-              <w:rPr>
-                <w:sz w:val="20"/>
-                <w:szCs w:val="20"/>
+                <w:sz w:val="18"/>
+                <w:szCs w:val="18"/>
+              </w:rPr>
+            </w:pPr>
+            <w:r>
+              <w:rPr>
+                <w:rtl w:val="0"/>
+              </w:rPr>
+            </w:r>
+          </w:p>
+        </w:tc>
+        <w:tc>
+          <w:tcPr>
+            <w:shd w:fill="auto" w:val="clear"/>
+            <w:tcMar>
+              <w:top w:w="100.0" w:type="dxa"/>
+              <w:left w:w="100.0" w:type="dxa"/>
+              <w:bottom w:w="100.0" w:type="dxa"/>
+              <w:right w:w="100.0" w:type="dxa"/>
+            </w:tcMar>
+            <w:vAlign w:val="top"/>
+          </w:tcPr>
+          <w:p>
+            <w:pPr>
+              <w:widowControl w:val="0"/>
+              <w:spacing w:line="240" w:lineRule="auto"/>
+              <w:rPr>
+                <w:sz w:val="18"/>
+                <w:szCs w:val="18"/>
               </w:rPr>
             </w:pPr>
             <w:r>
@@ -2981,8 +2999,8 @@
               <w:spacing w:after="0" w:before="0" w:line="240" w:lineRule="auto"/>
               <w:ind w:left="0" w:firstLine="0"/>
               <w:rPr>
-                <w:sz w:val="20"/>
-                <w:szCs w:val="20"/>
+                <w:sz w:val="18"/>
+                <w:szCs w:val="18"/>
               </w:rPr>
             </w:pPr>
             <w:r>
@@ -3022,8 +3040,8 @@
               <w:ind w:left="0" w:right="0" w:firstLine="0"/>
               <w:jc w:val="left"/>
               <w:rPr>
-                <w:sz w:val="20"/>
-                <w:szCs w:val="20"/>
+                <w:sz w:val="18"/>
+                <w:szCs w:val="18"/>
               </w:rPr>
             </w:pPr>
             <w:r>
@@ -3063,8 +3081,8 @@
               <w:ind w:left="0" w:right="0" w:firstLine="0"/>
               <w:jc w:val="left"/>
               <w:rPr>
-                <w:sz w:val="20"/>
-                <w:szCs w:val="20"/>
+                <w:sz w:val="18"/>
+                <w:szCs w:val="18"/>
               </w:rPr>
             </w:pPr>
             <w:r>
@@ -3097,14 +3115,14 @@
               <w:widowControl w:val="0"/>
               <w:spacing w:line="240" w:lineRule="auto"/>
               <w:rPr>
-                <w:sz w:val="20"/>
-                <w:szCs w:val="20"/>
-              </w:rPr>
-            </w:pPr>
-            <w:r>
-              <w:rPr>
-                <w:sz w:val="20"/>
-                <w:szCs w:val="20"/>
+                <w:sz w:val="18"/>
+                <w:szCs w:val="18"/>
+              </w:rPr>
+            </w:pPr>
+            <w:r>
+              <w:rPr>
+                <w:sz w:val="18"/>
+                <w:szCs w:val="18"/>
                 <w:rtl w:val="0"/>
               </w:rPr>
               <w:t xml:space="preserve">Amoxicillin (25mg/kg)-IV </w:t>
@@ -3127,35 +3145,35 @@
               <w:widowControl w:val="0"/>
               <w:spacing w:line="240" w:lineRule="auto"/>
               <w:rPr>
-                <w:sz w:val="20"/>
-                <w:szCs w:val="20"/>
-              </w:rPr>
-            </w:pPr>
-            <w:r>
-              <w:rPr>
-                <w:rtl w:val="0"/>
-              </w:rPr>
-            </w:r>
-          </w:p>
-        </w:tc>
-        <w:tc>
-          <w:tcPr>
-            <w:shd w:fill="auto" w:val="clear"/>
-            <w:tcMar>
-              <w:top w:w="100.0" w:type="dxa"/>
-              <w:left w:w="100.0" w:type="dxa"/>
-              <w:bottom w:w="100.0" w:type="dxa"/>
-              <w:right w:w="100.0" w:type="dxa"/>
-            </w:tcMar>
-            <w:vAlign w:val="top"/>
-          </w:tcPr>
-          <w:p>
-            <w:pPr>
-              <w:widowControl w:val="0"/>
-              <w:spacing w:line="240" w:lineRule="auto"/>
-              <w:rPr>
-                <w:sz w:val="20"/>
-                <w:szCs w:val="20"/>
+                <w:sz w:val="18"/>
+                <w:szCs w:val="18"/>
+              </w:rPr>
+            </w:pPr>
+            <w:r>
+              <w:rPr>
+                <w:rtl w:val="0"/>
+              </w:rPr>
+            </w:r>
+          </w:p>
+        </w:tc>
+        <w:tc>
+          <w:tcPr>
+            <w:shd w:fill="auto" w:val="clear"/>
+            <w:tcMar>
+              <w:top w:w="100.0" w:type="dxa"/>
+              <w:left w:w="100.0" w:type="dxa"/>
+              <w:bottom w:w="100.0" w:type="dxa"/>
+              <w:right w:w="100.0" w:type="dxa"/>
+            </w:tcMar>
+            <w:vAlign w:val="top"/>
+          </w:tcPr>
+          <w:p>
+            <w:pPr>
+              <w:widowControl w:val="0"/>
+              <w:spacing w:line="240" w:lineRule="auto"/>
+              <w:rPr>
+                <w:sz w:val="18"/>
+                <w:szCs w:val="18"/>
               </w:rPr>
             </w:pPr>
             <w:r>
@@ -3185,16 +3203,16 @@
               <w:rPr>
                 <w:b w:val="1"/>
                 <w:bCs w:val="1"/>
-                <w:sz w:val="20"/>
-                <w:szCs w:val="20"/>
+                <w:sz w:val="18"/>
+                <w:szCs w:val="18"/>
               </w:rPr>
             </w:pPr>
             <w:r>
               <w:rPr>
                 <w:b w:val="1"/>
                 <w:bCs w:val="1"/>
-                <w:sz w:val="20"/>
-                <w:szCs w:val="20"/>
+                <w:sz w:val="18"/>
+                <w:szCs w:val="18"/>
                 <w:rtl w:val="0"/>
               </w:rPr>
               <w:t xml:space="preserve">Notes:</w:t>
@@ -3224,14 +3242,14 @@
               <w:widowControl w:val="0"/>
               <w:spacing w:line="240" w:lineRule="auto"/>
               <w:rPr>
-                <w:sz w:val="20"/>
-                <w:szCs w:val="20"/>
-              </w:rPr>
-            </w:pPr>
-            <w:r>
-              <w:rPr>
-                <w:sz w:val="20"/>
-                <w:szCs w:val="20"/>
+                <w:sz w:val="18"/>
+                <w:szCs w:val="18"/>
+              </w:rPr>
+            </w:pPr>
+            <w:r>
+              <w:rPr>
+                <w:sz w:val="18"/>
+                <w:szCs w:val="18"/>
                 <w:rtl w:val="0"/>
               </w:rPr>
               <w:t xml:space="preserve">Lignocaine (0.05ml/kg)</w:t>
@@ -3254,35 +3272,35 @@
               <w:widowControl w:val="0"/>
               <w:spacing w:line="240" w:lineRule="auto"/>
               <w:rPr>
-                <w:sz w:val="20"/>
-                <w:szCs w:val="20"/>
-              </w:rPr>
-            </w:pPr>
-            <w:r>
-              <w:rPr>
-                <w:rtl w:val="0"/>
-              </w:rPr>
-            </w:r>
-          </w:p>
-        </w:tc>
-        <w:tc>
-          <w:tcPr>
-            <w:shd w:fill="auto" w:val="clear"/>
-            <w:tcMar>
-              <w:top w:w="100.0" w:type="dxa"/>
-              <w:left w:w="100.0" w:type="dxa"/>
-              <w:bottom w:w="100.0" w:type="dxa"/>
-              <w:right w:w="100.0" w:type="dxa"/>
-            </w:tcMar>
-            <w:vAlign w:val="top"/>
-          </w:tcPr>
-          <w:p>
-            <w:pPr>
-              <w:widowControl w:val="0"/>
-              <w:spacing w:line="240" w:lineRule="auto"/>
-              <w:rPr>
-                <w:sz w:val="20"/>
-                <w:szCs w:val="20"/>
+                <w:sz w:val="18"/>
+                <w:szCs w:val="18"/>
+              </w:rPr>
+            </w:pPr>
+            <w:r>
+              <w:rPr>
+                <w:rtl w:val="0"/>
+              </w:rPr>
+            </w:r>
+          </w:p>
+        </w:tc>
+        <w:tc>
+          <w:tcPr>
+            <w:shd w:fill="auto" w:val="clear"/>
+            <w:tcMar>
+              <w:top w:w="100.0" w:type="dxa"/>
+              <w:left w:w="100.0" w:type="dxa"/>
+              <w:bottom w:w="100.0" w:type="dxa"/>
+              <w:right w:w="100.0" w:type="dxa"/>
+            </w:tcMar>
+            <w:vAlign w:val="top"/>
+          </w:tcPr>
+          <w:p>
+            <w:pPr>
+              <w:widowControl w:val="0"/>
+              <w:spacing w:line="240" w:lineRule="auto"/>
+              <w:rPr>
+                <w:sz w:val="18"/>
+                <w:szCs w:val="18"/>
               </w:rPr>
             </w:pPr>
             <w:r>
@@ -3313,8 +3331,8 @@
               <w:rPr>
                 <w:b w:val="1"/>
                 <w:bCs w:val="1"/>
-                <w:sz w:val="20"/>
-                <w:szCs w:val="20"/>
+                <w:sz w:val="18"/>
+                <w:szCs w:val="18"/>
               </w:rPr>
             </w:pPr>
             <w:r>
@@ -3347,14 +3365,14 @@
               <w:widowControl w:val="0"/>
               <w:spacing w:line="240" w:lineRule="auto"/>
               <w:rPr>
-                <w:sz w:val="20"/>
-                <w:szCs w:val="20"/>
-              </w:rPr>
-            </w:pPr>
-            <w:r>
-              <w:rPr>
-                <w:sz w:val="20"/>
-                <w:szCs w:val="20"/>
+                <w:sz w:val="18"/>
+                <w:szCs w:val="18"/>
+              </w:rPr>
+            </w:pPr>
+            <w:r>
+              <w:rPr>
+                <w:sz w:val="18"/>
+                <w:szCs w:val="18"/>
                 <w:rtl w:val="0"/>
               </w:rPr>
               <w:t xml:space="preserve">Ethamsylate / Texableed (0.1ml/kg) - IV</w:t>
@@ -3377,35 +3395,35 @@
               <w:widowControl w:val="0"/>
               <w:spacing w:line="240" w:lineRule="auto"/>
               <w:rPr>
-                <w:sz w:val="20"/>
-                <w:szCs w:val="20"/>
-              </w:rPr>
-            </w:pPr>
-            <w:r>
-              <w:rPr>
-                <w:rtl w:val="0"/>
-              </w:rPr>
-            </w:r>
-          </w:p>
-        </w:tc>
-        <w:tc>
-          <w:tcPr>
-            <w:shd w:fill="auto" w:val="clear"/>
-            <w:tcMar>
-              <w:top w:w="100.0" w:type="dxa"/>
-              <w:left w:w="100.0" w:type="dxa"/>
-              <w:bottom w:w="100.0" w:type="dxa"/>
-              <w:right w:w="100.0" w:type="dxa"/>
-            </w:tcMar>
-            <w:vAlign w:val="top"/>
-          </w:tcPr>
-          <w:p>
-            <w:pPr>
-              <w:widowControl w:val="0"/>
-              <w:spacing w:line="240" w:lineRule="auto"/>
-              <w:rPr>
-                <w:sz w:val="20"/>
-                <w:szCs w:val="20"/>
+                <w:sz w:val="18"/>
+                <w:szCs w:val="18"/>
+              </w:rPr>
+            </w:pPr>
+            <w:r>
+              <w:rPr>
+                <w:rtl w:val="0"/>
+              </w:rPr>
+            </w:r>
+          </w:p>
+        </w:tc>
+        <w:tc>
+          <w:tcPr>
+            <w:shd w:fill="auto" w:val="clear"/>
+            <w:tcMar>
+              <w:top w:w="100.0" w:type="dxa"/>
+              <w:left w:w="100.0" w:type="dxa"/>
+              <w:bottom w:w="100.0" w:type="dxa"/>
+              <w:right w:w="100.0" w:type="dxa"/>
+            </w:tcMar>
+            <w:vAlign w:val="top"/>
+          </w:tcPr>
+          <w:p>
+            <w:pPr>
+              <w:widowControl w:val="0"/>
+              <w:spacing w:line="240" w:lineRule="auto"/>
+              <w:rPr>
+                <w:sz w:val="18"/>
+                <w:szCs w:val="18"/>
               </w:rPr>
             </w:pPr>
             <w:r>
@@ -3434,8 +3452,8 @@
               <w:spacing w:after="0" w:before="0" w:line="240" w:lineRule="auto"/>
               <w:ind w:left="0" w:firstLine="0"/>
               <w:rPr>
-                <w:sz w:val="20"/>
-                <w:szCs w:val="20"/>
+                <w:sz w:val="18"/>
+                <w:szCs w:val="18"/>
               </w:rPr>
             </w:pPr>
             <w:r>
@@ -3468,14 +3486,14 @@
               <w:widowControl w:val="0"/>
               <w:spacing w:line="240" w:lineRule="auto"/>
               <w:rPr>
-                <w:sz w:val="20"/>
-                <w:szCs w:val="20"/>
-              </w:rPr>
-            </w:pPr>
-            <w:r>
-              <w:rPr>
-                <w:sz w:val="20"/>
-                <w:szCs w:val="20"/>
+                <w:sz w:val="18"/>
+                <w:szCs w:val="18"/>
+              </w:rPr>
+            </w:pPr>
+            <w:r>
+              <w:rPr>
+                <w:sz w:val="18"/>
+                <w:szCs w:val="18"/>
                 <w:rtl w:val="0"/>
               </w:rPr>
               <w:t xml:space="preserve">Prep person</w:t>
@@ -3498,41 +3516,41 @@
               <w:widowControl w:val="0"/>
               <w:spacing w:line="240" w:lineRule="auto"/>
               <w:rPr>
-                <w:sz w:val="20"/>
-                <w:szCs w:val="20"/>
-              </w:rPr>
-            </w:pPr>
-            <w:r>
-              <w:rPr>
-                <w:rtl w:val="0"/>
-              </w:rPr>
-            </w:r>
-          </w:p>
-        </w:tc>
-        <w:tc>
-          <w:tcPr>
-            <w:shd w:fill="auto" w:val="clear"/>
-            <w:tcMar>
-              <w:top w:w="100.0" w:type="dxa"/>
-              <w:left w:w="100.0" w:type="dxa"/>
-              <w:bottom w:w="100.0" w:type="dxa"/>
-              <w:right w:w="100.0" w:type="dxa"/>
-            </w:tcMar>
-            <w:vAlign w:val="top"/>
-          </w:tcPr>
-          <w:p>
-            <w:pPr>
-              <w:widowControl w:val="0"/>
-              <w:spacing w:line="240" w:lineRule="auto"/>
-              <w:rPr>
-                <w:sz w:val="20"/>
-                <w:szCs w:val="20"/>
-              </w:rPr>
-            </w:pPr>
-            <w:r>
-              <w:rPr>
-                <w:sz w:val="20"/>
-                <w:szCs w:val="20"/>
+                <w:sz w:val="18"/>
+                <w:szCs w:val="18"/>
+              </w:rPr>
+            </w:pPr>
+            <w:r>
+              <w:rPr>
+                <w:rtl w:val="0"/>
+              </w:rPr>
+            </w:r>
+          </w:p>
+        </w:tc>
+        <w:tc>
+          <w:tcPr>
+            <w:shd w:fill="auto" w:val="clear"/>
+            <w:tcMar>
+              <w:top w:w="100.0" w:type="dxa"/>
+              <w:left w:w="100.0" w:type="dxa"/>
+              <w:bottom w:w="100.0" w:type="dxa"/>
+              <w:right w:w="100.0" w:type="dxa"/>
+            </w:tcMar>
+            <w:vAlign w:val="top"/>
+          </w:tcPr>
+          <w:p>
+            <w:pPr>
+              <w:widowControl w:val="0"/>
+              <w:spacing w:line="240" w:lineRule="auto"/>
+              <w:rPr>
+                <w:sz w:val="18"/>
+                <w:szCs w:val="18"/>
+              </w:rPr>
+            </w:pPr>
+            <w:r>
+              <w:rPr>
+                <w:sz w:val="18"/>
+                <w:szCs w:val="18"/>
                 <w:rtl w:val="0"/>
               </w:rPr>
               <w:t xml:space="preserve">Handlers</w:t>
@@ -3557,8 +3575,8 @@
               <w:spacing w:after="0" w:before="0" w:line="240" w:lineRule="auto"/>
               <w:ind w:left="0" w:firstLine="0"/>
               <w:rPr>
-                <w:sz w:val="20"/>
-                <w:szCs w:val="20"/>
+                <w:sz w:val="18"/>
+                <w:szCs w:val="18"/>
               </w:rPr>
             </w:pPr>
             <w:r>
@@ -3572,12 +3590,13 @@
     </w:tbl>
     <w:p>
       <w:pPr>
+        <w:spacing w:line="240" w:lineRule="auto"/>
         <w:ind w:left="-992.1259842519685" w:firstLine="0"/>
         <w:rPr>
           <w:b w:val="1"/>
           <w:bCs w:val="1"/>
-          <w:sz w:val="12"/>
-          <w:szCs w:val="12"/>
+          <w:sz w:val="10"/>
+          <w:szCs w:val="10"/>
         </w:rPr>
       </w:pPr>
       <w:r>
@@ -3669,26 +3688,27 @@
           </w:tcPr>
           <w:p>
             <w:pPr>
+              <w:spacing w:line="240" w:lineRule="auto"/>
               <w:ind w:left="141.73228346456688" w:firstLine="0"/>
               <w:rPr>
-                <w:sz w:val="20"/>
-                <w:szCs w:val="20"/>
+                <w:sz w:val="18"/>
+                <w:szCs w:val="18"/>
               </w:rPr>
             </w:pPr>
             <w:r>
               <w:rPr>
                 <w:b w:val="1"/>
                 <w:bCs w:val="1"/>
-                <w:sz w:val="20"/>
-                <w:szCs w:val="20"/>
+                <w:sz w:val="18"/>
+                <w:szCs w:val="18"/>
                 <w:rtl w:val="0"/>
               </w:rPr>
               <w:t xml:space="preserve">Maintenance Xylazine:Ketamine 1:2 IV / Propofol </w:t>
             </w:r>
             <w:r>
               <w:rPr>
-                <w:sz w:val="20"/>
-                <w:szCs w:val="20"/>
+                <w:sz w:val="18"/>
+                <w:szCs w:val="18"/>
                 <w:rtl w:val="0"/>
               </w:rPr>
               <w:t xml:space="preserve">(0.1ml/kg)</w:t>
@@ -3719,14 +3739,14 @@
               <w:widowControl w:val="0"/>
               <w:spacing w:line="240" w:lineRule="auto"/>
               <w:rPr>
-                <w:sz w:val="20"/>
-                <w:szCs w:val="20"/>
-              </w:rPr>
-            </w:pPr>
-            <w:r>
-              <w:rPr>
-                <w:sz w:val="20"/>
-                <w:szCs w:val="20"/>
+                <w:sz w:val="18"/>
+                <w:szCs w:val="18"/>
+              </w:rPr>
+            </w:pPr>
+            <w:r>
+              <w:rPr>
+                <w:sz w:val="18"/>
+                <w:szCs w:val="18"/>
                 <w:rtl w:val="0"/>
               </w:rPr>
               <w:t xml:space="preserve">Top-up in ml</w:t>
@@ -3749,332 +3769,332 @@
               <w:widowControl w:val="0"/>
               <w:spacing w:line="240" w:lineRule="auto"/>
               <w:rPr>
-                <w:sz w:val="20"/>
-                <w:szCs w:val="20"/>
-              </w:rPr>
-            </w:pPr>
-            <w:r>
-              <w:rPr>
-                <w:rtl w:val="0"/>
-              </w:rPr>
-            </w:r>
-          </w:p>
-        </w:tc>
-        <w:tc>
-          <w:tcPr>
-            <w:shd w:fill="auto" w:val="clear"/>
-            <w:tcMar>
-              <w:top w:w="100.0" w:type="dxa"/>
-              <w:left w:w="100.0" w:type="dxa"/>
-              <w:bottom w:w="100.0" w:type="dxa"/>
-              <w:right w:w="100.0" w:type="dxa"/>
-            </w:tcMar>
-            <w:vAlign w:val="top"/>
-          </w:tcPr>
-          <w:p>
-            <w:pPr>
-              <w:widowControl w:val="0"/>
-              <w:spacing w:line="240" w:lineRule="auto"/>
-              <w:rPr>
-                <w:sz w:val="20"/>
-                <w:szCs w:val="20"/>
-              </w:rPr>
-            </w:pPr>
-            <w:r>
-              <w:rPr>
-                <w:rtl w:val="0"/>
-              </w:rPr>
-            </w:r>
-          </w:p>
-        </w:tc>
-        <w:tc>
-          <w:tcPr>
-            <w:shd w:fill="auto" w:val="clear"/>
-            <w:tcMar>
-              <w:top w:w="100.0" w:type="dxa"/>
-              <w:left w:w="100.0" w:type="dxa"/>
-              <w:bottom w:w="100.0" w:type="dxa"/>
-              <w:right w:w="100.0" w:type="dxa"/>
-            </w:tcMar>
-            <w:vAlign w:val="top"/>
-          </w:tcPr>
-          <w:p>
-            <w:pPr>
-              <w:widowControl w:val="0"/>
-              <w:spacing w:line="240" w:lineRule="auto"/>
-              <w:rPr>
-                <w:sz w:val="20"/>
-                <w:szCs w:val="20"/>
-              </w:rPr>
-            </w:pPr>
-            <w:r>
-              <w:rPr>
-                <w:rtl w:val="0"/>
-              </w:rPr>
-            </w:r>
-          </w:p>
-        </w:tc>
-        <w:tc>
-          <w:tcPr>
-            <w:shd w:fill="auto" w:val="clear"/>
-            <w:tcMar>
-              <w:top w:w="100.0" w:type="dxa"/>
-              <w:left w:w="100.0" w:type="dxa"/>
-              <w:bottom w:w="100.0" w:type="dxa"/>
-              <w:right w:w="100.0" w:type="dxa"/>
-            </w:tcMar>
-            <w:vAlign w:val="top"/>
-          </w:tcPr>
-          <w:p>
-            <w:pPr>
-              <w:widowControl w:val="0"/>
-              <w:spacing w:line="240" w:lineRule="auto"/>
-              <w:rPr>
-                <w:sz w:val="20"/>
-                <w:szCs w:val="20"/>
-              </w:rPr>
-            </w:pPr>
-            <w:r>
-              <w:rPr>
-                <w:rtl w:val="0"/>
-              </w:rPr>
-            </w:r>
-          </w:p>
-        </w:tc>
-        <w:tc>
-          <w:tcPr>
-            <w:shd w:fill="auto" w:val="clear"/>
-            <w:tcMar>
-              <w:top w:w="100.0" w:type="dxa"/>
-              <w:left w:w="100.0" w:type="dxa"/>
-              <w:bottom w:w="100.0" w:type="dxa"/>
-              <w:right w:w="100.0" w:type="dxa"/>
-            </w:tcMar>
-            <w:vAlign w:val="top"/>
-          </w:tcPr>
-          <w:p>
-            <w:pPr>
-              <w:widowControl w:val="0"/>
-              <w:spacing w:line="240" w:lineRule="auto"/>
-              <w:rPr>
-                <w:sz w:val="20"/>
-                <w:szCs w:val="20"/>
-              </w:rPr>
-            </w:pPr>
-            <w:r>
-              <w:rPr>
-                <w:rtl w:val="0"/>
-              </w:rPr>
-            </w:r>
-          </w:p>
-        </w:tc>
-        <w:tc>
-          <w:tcPr>
-            <w:shd w:fill="auto" w:val="clear"/>
-            <w:tcMar>
-              <w:top w:w="100.0" w:type="dxa"/>
-              <w:left w:w="100.0" w:type="dxa"/>
-              <w:bottom w:w="100.0" w:type="dxa"/>
-              <w:right w:w="100.0" w:type="dxa"/>
-            </w:tcMar>
-            <w:vAlign w:val="top"/>
-          </w:tcPr>
-          <w:p>
-            <w:pPr>
-              <w:widowControl w:val="0"/>
-              <w:spacing w:line="240" w:lineRule="auto"/>
-              <w:rPr>
-                <w:sz w:val="20"/>
-                <w:szCs w:val="20"/>
-              </w:rPr>
-            </w:pPr>
-            <w:r>
-              <w:rPr>
-                <w:rtl w:val="0"/>
-              </w:rPr>
-            </w:r>
-          </w:p>
-        </w:tc>
-        <w:tc>
-          <w:tcPr>
-            <w:shd w:fill="auto" w:val="clear"/>
-            <w:tcMar>
-              <w:top w:w="100.0" w:type="dxa"/>
-              <w:left w:w="100.0" w:type="dxa"/>
-              <w:bottom w:w="100.0" w:type="dxa"/>
-              <w:right w:w="100.0" w:type="dxa"/>
-            </w:tcMar>
-            <w:vAlign w:val="top"/>
-          </w:tcPr>
-          <w:p>
-            <w:pPr>
-              <w:widowControl w:val="0"/>
-              <w:spacing w:line="240" w:lineRule="auto"/>
-              <w:rPr>
-                <w:sz w:val="20"/>
-                <w:szCs w:val="20"/>
-              </w:rPr>
-            </w:pPr>
-            <w:r>
-              <w:rPr>
-                <w:rtl w:val="0"/>
-              </w:rPr>
-            </w:r>
-          </w:p>
-        </w:tc>
-        <w:tc>
-          <w:tcPr>
-            <w:shd w:fill="auto" w:val="clear"/>
-            <w:tcMar>
-              <w:top w:w="100.0" w:type="dxa"/>
-              <w:left w:w="100.0" w:type="dxa"/>
-              <w:bottom w:w="100.0" w:type="dxa"/>
-              <w:right w:w="100.0" w:type="dxa"/>
-            </w:tcMar>
-            <w:vAlign w:val="top"/>
-          </w:tcPr>
-          <w:p>
-            <w:pPr>
-              <w:widowControl w:val="0"/>
-              <w:spacing w:line="240" w:lineRule="auto"/>
-              <w:rPr>
-                <w:sz w:val="20"/>
-                <w:szCs w:val="20"/>
-              </w:rPr>
-            </w:pPr>
-            <w:r>
-              <w:rPr>
-                <w:rtl w:val="0"/>
-              </w:rPr>
-            </w:r>
-          </w:p>
-        </w:tc>
-        <w:tc>
-          <w:tcPr>
-            <w:shd w:fill="auto" w:val="clear"/>
-            <w:tcMar>
-              <w:top w:w="100.0" w:type="dxa"/>
-              <w:left w:w="100.0" w:type="dxa"/>
-              <w:bottom w:w="100.0" w:type="dxa"/>
-              <w:right w:w="100.0" w:type="dxa"/>
-            </w:tcMar>
-            <w:vAlign w:val="top"/>
-          </w:tcPr>
-          <w:p>
-            <w:pPr>
-              <w:widowControl w:val="0"/>
-              <w:spacing w:line="240" w:lineRule="auto"/>
-              <w:rPr>
-                <w:sz w:val="20"/>
-                <w:szCs w:val="20"/>
-              </w:rPr>
-            </w:pPr>
-            <w:r>
-              <w:rPr>
-                <w:rtl w:val="0"/>
-              </w:rPr>
-            </w:r>
-          </w:p>
-        </w:tc>
-        <w:tc>
-          <w:tcPr>
-            <w:shd w:fill="auto" w:val="clear"/>
-            <w:tcMar>
-              <w:top w:w="100.0" w:type="dxa"/>
-              <w:left w:w="100.0" w:type="dxa"/>
-              <w:bottom w:w="100.0" w:type="dxa"/>
-              <w:right w:w="100.0" w:type="dxa"/>
-            </w:tcMar>
-            <w:vAlign w:val="top"/>
-          </w:tcPr>
-          <w:p>
-            <w:pPr>
-              <w:widowControl w:val="0"/>
-              <w:spacing w:line="240" w:lineRule="auto"/>
-              <w:rPr>
-                <w:sz w:val="20"/>
-                <w:szCs w:val="20"/>
-              </w:rPr>
-            </w:pPr>
-            <w:r>
-              <w:rPr>
-                <w:rtl w:val="0"/>
-              </w:rPr>
-            </w:r>
-          </w:p>
-        </w:tc>
-        <w:tc>
-          <w:tcPr>
-            <w:shd w:fill="auto" w:val="clear"/>
-            <w:tcMar>
-              <w:top w:w="100.0" w:type="dxa"/>
-              <w:left w:w="100.0" w:type="dxa"/>
-              <w:bottom w:w="100.0" w:type="dxa"/>
-              <w:right w:w="100.0" w:type="dxa"/>
-            </w:tcMar>
-            <w:vAlign w:val="top"/>
-          </w:tcPr>
-          <w:p>
-            <w:pPr>
-              <w:widowControl w:val="0"/>
-              <w:spacing w:line="240" w:lineRule="auto"/>
-              <w:rPr>
-                <w:sz w:val="20"/>
-                <w:szCs w:val="20"/>
-              </w:rPr>
-            </w:pPr>
-            <w:r>
-              <w:rPr>
-                <w:rtl w:val="0"/>
-              </w:rPr>
-            </w:r>
-          </w:p>
-        </w:tc>
-        <w:tc>
-          <w:tcPr>
-            <w:shd w:fill="auto" w:val="clear"/>
-            <w:tcMar>
-              <w:top w:w="100.0" w:type="dxa"/>
-              <w:left w:w="100.0" w:type="dxa"/>
-              <w:bottom w:w="100.0" w:type="dxa"/>
-              <w:right w:w="100.0" w:type="dxa"/>
-            </w:tcMar>
-            <w:vAlign w:val="top"/>
-          </w:tcPr>
-          <w:p>
-            <w:pPr>
-              <w:widowControl w:val="0"/>
-              <w:spacing w:line="240" w:lineRule="auto"/>
-              <w:rPr>
-                <w:sz w:val="20"/>
-                <w:szCs w:val="20"/>
-              </w:rPr>
-            </w:pPr>
-            <w:r>
-              <w:rPr>
-                <w:rtl w:val="0"/>
-              </w:rPr>
-            </w:r>
-          </w:p>
-        </w:tc>
-        <w:tc>
-          <w:tcPr>
-            <w:shd w:fill="auto" w:val="clear"/>
-            <w:tcMar>
-              <w:top w:w="100.0" w:type="dxa"/>
-              <w:left w:w="100.0" w:type="dxa"/>
-              <w:bottom w:w="100.0" w:type="dxa"/>
-              <w:right w:w="100.0" w:type="dxa"/>
-            </w:tcMar>
-            <w:vAlign w:val="top"/>
-          </w:tcPr>
-          <w:p>
-            <w:pPr>
-              <w:widowControl w:val="0"/>
-              <w:spacing w:line="240" w:lineRule="auto"/>
-              <w:rPr>
-                <w:sz w:val="20"/>
-                <w:szCs w:val="20"/>
+                <w:sz w:val="18"/>
+                <w:szCs w:val="18"/>
+              </w:rPr>
+            </w:pPr>
+            <w:r>
+              <w:rPr>
+                <w:rtl w:val="0"/>
+              </w:rPr>
+            </w:r>
+          </w:p>
+        </w:tc>
+        <w:tc>
+          <w:tcPr>
+            <w:shd w:fill="auto" w:val="clear"/>
+            <w:tcMar>
+              <w:top w:w="100.0" w:type="dxa"/>
+              <w:left w:w="100.0" w:type="dxa"/>
+              <w:bottom w:w="100.0" w:type="dxa"/>
+              <w:right w:w="100.0" w:type="dxa"/>
+            </w:tcMar>
+            <w:vAlign w:val="top"/>
+          </w:tcPr>
+          <w:p>
+            <w:pPr>
+              <w:widowControl w:val="0"/>
+              <w:spacing w:line="240" w:lineRule="auto"/>
+              <w:rPr>
+                <w:sz w:val="18"/>
+                <w:szCs w:val="18"/>
+              </w:rPr>
+            </w:pPr>
+            <w:r>
+              <w:rPr>
+                <w:rtl w:val="0"/>
+              </w:rPr>
+            </w:r>
+          </w:p>
+        </w:tc>
+        <w:tc>
+          <w:tcPr>
+            <w:shd w:fill="auto" w:val="clear"/>
+            <w:tcMar>
+              <w:top w:w="100.0" w:type="dxa"/>
+              <w:left w:w="100.0" w:type="dxa"/>
+              <w:bottom w:w="100.0" w:type="dxa"/>
+              <w:right w:w="100.0" w:type="dxa"/>
+            </w:tcMar>
+            <w:vAlign w:val="top"/>
+          </w:tcPr>
+          <w:p>
+            <w:pPr>
+              <w:widowControl w:val="0"/>
+              <w:spacing w:line="240" w:lineRule="auto"/>
+              <w:rPr>
+                <w:sz w:val="18"/>
+                <w:szCs w:val="18"/>
+              </w:rPr>
+            </w:pPr>
+            <w:r>
+              <w:rPr>
+                <w:rtl w:val="0"/>
+              </w:rPr>
+            </w:r>
+          </w:p>
+        </w:tc>
+        <w:tc>
+          <w:tcPr>
+            <w:shd w:fill="auto" w:val="clear"/>
+            <w:tcMar>
+              <w:top w:w="100.0" w:type="dxa"/>
+              <w:left w:w="100.0" w:type="dxa"/>
+              <w:bottom w:w="100.0" w:type="dxa"/>
+              <w:right w:w="100.0" w:type="dxa"/>
+            </w:tcMar>
+            <w:vAlign w:val="top"/>
+          </w:tcPr>
+          <w:p>
+            <w:pPr>
+              <w:widowControl w:val="0"/>
+              <w:spacing w:line="240" w:lineRule="auto"/>
+              <w:rPr>
+                <w:sz w:val="18"/>
+                <w:szCs w:val="18"/>
+              </w:rPr>
+            </w:pPr>
+            <w:r>
+              <w:rPr>
+                <w:rtl w:val="0"/>
+              </w:rPr>
+            </w:r>
+          </w:p>
+        </w:tc>
+        <w:tc>
+          <w:tcPr>
+            <w:shd w:fill="auto" w:val="clear"/>
+            <w:tcMar>
+              <w:top w:w="100.0" w:type="dxa"/>
+              <w:left w:w="100.0" w:type="dxa"/>
+              <w:bottom w:w="100.0" w:type="dxa"/>
+              <w:right w:w="100.0" w:type="dxa"/>
+            </w:tcMar>
+            <w:vAlign w:val="top"/>
+          </w:tcPr>
+          <w:p>
+            <w:pPr>
+              <w:widowControl w:val="0"/>
+              <w:spacing w:line="240" w:lineRule="auto"/>
+              <w:rPr>
+                <w:sz w:val="18"/>
+                <w:szCs w:val="18"/>
+              </w:rPr>
+            </w:pPr>
+            <w:r>
+              <w:rPr>
+                <w:rtl w:val="0"/>
+              </w:rPr>
+            </w:r>
+          </w:p>
+        </w:tc>
+        <w:tc>
+          <w:tcPr>
+            <w:shd w:fill="auto" w:val="clear"/>
+            <w:tcMar>
+              <w:top w:w="100.0" w:type="dxa"/>
+              <w:left w:w="100.0" w:type="dxa"/>
+              <w:bottom w:w="100.0" w:type="dxa"/>
+              <w:right w:w="100.0" w:type="dxa"/>
+            </w:tcMar>
+            <w:vAlign w:val="top"/>
+          </w:tcPr>
+          <w:p>
+            <w:pPr>
+              <w:widowControl w:val="0"/>
+              <w:spacing w:line="240" w:lineRule="auto"/>
+              <w:rPr>
+                <w:sz w:val="18"/>
+                <w:szCs w:val="18"/>
+              </w:rPr>
+            </w:pPr>
+            <w:r>
+              <w:rPr>
+                <w:rtl w:val="0"/>
+              </w:rPr>
+            </w:r>
+          </w:p>
+        </w:tc>
+        <w:tc>
+          <w:tcPr>
+            <w:shd w:fill="auto" w:val="clear"/>
+            <w:tcMar>
+              <w:top w:w="100.0" w:type="dxa"/>
+              <w:left w:w="100.0" w:type="dxa"/>
+              <w:bottom w:w="100.0" w:type="dxa"/>
+              <w:right w:w="100.0" w:type="dxa"/>
+            </w:tcMar>
+            <w:vAlign w:val="top"/>
+          </w:tcPr>
+          <w:p>
+            <w:pPr>
+              <w:widowControl w:val="0"/>
+              <w:spacing w:line="240" w:lineRule="auto"/>
+              <w:rPr>
+                <w:sz w:val="18"/>
+                <w:szCs w:val="18"/>
+              </w:rPr>
+            </w:pPr>
+            <w:r>
+              <w:rPr>
+                <w:rtl w:val="0"/>
+              </w:rPr>
+            </w:r>
+          </w:p>
+        </w:tc>
+        <w:tc>
+          <w:tcPr>
+            <w:shd w:fill="auto" w:val="clear"/>
+            <w:tcMar>
+              <w:top w:w="100.0" w:type="dxa"/>
+              <w:left w:w="100.0" w:type="dxa"/>
+              <w:bottom w:w="100.0" w:type="dxa"/>
+              <w:right w:w="100.0" w:type="dxa"/>
+            </w:tcMar>
+            <w:vAlign w:val="top"/>
+          </w:tcPr>
+          <w:p>
+            <w:pPr>
+              <w:widowControl w:val="0"/>
+              <w:spacing w:line="240" w:lineRule="auto"/>
+              <w:rPr>
+                <w:sz w:val="18"/>
+                <w:szCs w:val="18"/>
+              </w:rPr>
+            </w:pPr>
+            <w:r>
+              <w:rPr>
+                <w:rtl w:val="0"/>
+              </w:rPr>
+            </w:r>
+          </w:p>
+        </w:tc>
+        <w:tc>
+          <w:tcPr>
+            <w:shd w:fill="auto" w:val="clear"/>
+            <w:tcMar>
+              <w:top w:w="100.0" w:type="dxa"/>
+              <w:left w:w="100.0" w:type="dxa"/>
+              <w:bottom w:w="100.0" w:type="dxa"/>
+              <w:right w:w="100.0" w:type="dxa"/>
+            </w:tcMar>
+            <w:vAlign w:val="top"/>
+          </w:tcPr>
+          <w:p>
+            <w:pPr>
+              <w:widowControl w:val="0"/>
+              <w:spacing w:line="240" w:lineRule="auto"/>
+              <w:rPr>
+                <w:sz w:val="18"/>
+                <w:szCs w:val="18"/>
+              </w:rPr>
+            </w:pPr>
+            <w:r>
+              <w:rPr>
+                <w:rtl w:val="0"/>
+              </w:rPr>
+            </w:r>
+          </w:p>
+        </w:tc>
+        <w:tc>
+          <w:tcPr>
+            <w:shd w:fill="auto" w:val="clear"/>
+            <w:tcMar>
+              <w:top w:w="100.0" w:type="dxa"/>
+              <w:left w:w="100.0" w:type="dxa"/>
+              <w:bottom w:w="100.0" w:type="dxa"/>
+              <w:right w:w="100.0" w:type="dxa"/>
+            </w:tcMar>
+            <w:vAlign w:val="top"/>
+          </w:tcPr>
+          <w:p>
+            <w:pPr>
+              <w:widowControl w:val="0"/>
+              <w:spacing w:line="240" w:lineRule="auto"/>
+              <w:rPr>
+                <w:sz w:val="18"/>
+                <w:szCs w:val="18"/>
+              </w:rPr>
+            </w:pPr>
+            <w:r>
+              <w:rPr>
+                <w:rtl w:val="0"/>
+              </w:rPr>
+            </w:r>
+          </w:p>
+        </w:tc>
+        <w:tc>
+          <w:tcPr>
+            <w:shd w:fill="auto" w:val="clear"/>
+            <w:tcMar>
+              <w:top w:w="100.0" w:type="dxa"/>
+              <w:left w:w="100.0" w:type="dxa"/>
+              <w:bottom w:w="100.0" w:type="dxa"/>
+              <w:right w:w="100.0" w:type="dxa"/>
+            </w:tcMar>
+            <w:vAlign w:val="top"/>
+          </w:tcPr>
+          <w:p>
+            <w:pPr>
+              <w:widowControl w:val="0"/>
+              <w:spacing w:line="240" w:lineRule="auto"/>
+              <w:rPr>
+                <w:sz w:val="18"/>
+                <w:szCs w:val="18"/>
+              </w:rPr>
+            </w:pPr>
+            <w:r>
+              <w:rPr>
+                <w:rtl w:val="0"/>
+              </w:rPr>
+            </w:r>
+          </w:p>
+        </w:tc>
+        <w:tc>
+          <w:tcPr>
+            <w:shd w:fill="auto" w:val="clear"/>
+            <w:tcMar>
+              <w:top w:w="100.0" w:type="dxa"/>
+              <w:left w:w="100.0" w:type="dxa"/>
+              <w:bottom w:w="100.0" w:type="dxa"/>
+              <w:right w:w="100.0" w:type="dxa"/>
+            </w:tcMar>
+            <w:vAlign w:val="top"/>
+          </w:tcPr>
+          <w:p>
+            <w:pPr>
+              <w:widowControl w:val="0"/>
+              <w:spacing w:line="240" w:lineRule="auto"/>
+              <w:rPr>
+                <w:sz w:val="18"/>
+                <w:szCs w:val="18"/>
+              </w:rPr>
+            </w:pPr>
+            <w:r>
+              <w:rPr>
+                <w:rtl w:val="0"/>
+              </w:rPr>
+            </w:r>
+          </w:p>
+        </w:tc>
+        <w:tc>
+          <w:tcPr>
+            <w:shd w:fill="auto" w:val="clear"/>
+            <w:tcMar>
+              <w:top w:w="100.0" w:type="dxa"/>
+              <w:left w:w="100.0" w:type="dxa"/>
+              <w:bottom w:w="100.0" w:type="dxa"/>
+              <w:right w:w="100.0" w:type="dxa"/>
+            </w:tcMar>
+            <w:vAlign w:val="top"/>
+          </w:tcPr>
+          <w:p>
+            <w:pPr>
+              <w:widowControl w:val="0"/>
+              <w:spacing w:line="240" w:lineRule="auto"/>
+              <w:rPr>
+                <w:sz w:val="18"/>
+                <w:szCs w:val="18"/>
               </w:rPr>
             </w:pPr>
             <w:r>
@@ -4115,8 +4135,8 @@
               <w:rPr>
                 <w:b w:val="1"/>
                 <w:bCs w:val="1"/>
-                <w:sz w:val="20"/>
-                <w:szCs w:val="20"/>
+                <w:sz w:val="18"/>
+                <w:szCs w:val="18"/>
               </w:rPr>
             </w:pPr>
             <w:r>
@@ -4157,8 +4177,8 @@
               <w:rPr>
                 <w:b w:val="1"/>
                 <w:bCs w:val="1"/>
-                <w:sz w:val="20"/>
-                <w:szCs w:val="20"/>
+                <w:sz w:val="18"/>
+                <w:szCs w:val="18"/>
               </w:rPr>
             </w:pPr>
             <w:r>
@@ -4199,8 +4219,8 @@
               <w:rPr>
                 <w:b w:val="1"/>
                 <w:bCs w:val="1"/>
-                <w:sz w:val="20"/>
-                <w:szCs w:val="20"/>
+                <w:sz w:val="18"/>
+                <w:szCs w:val="18"/>
               </w:rPr>
             </w:pPr>
             <w:r>
@@ -4241,8 +4261,8 @@
               <w:rPr>
                 <w:b w:val="1"/>
                 <w:bCs w:val="1"/>
-                <w:sz w:val="20"/>
-                <w:szCs w:val="20"/>
+                <w:sz w:val="18"/>
+                <w:szCs w:val="18"/>
               </w:rPr>
             </w:pPr>
             <w:r>
@@ -4275,14 +4295,14 @@
               <w:widowControl w:val="0"/>
               <w:spacing w:line="240" w:lineRule="auto"/>
               <w:rPr>
-                <w:sz w:val="20"/>
-                <w:szCs w:val="20"/>
-              </w:rPr>
-            </w:pPr>
-            <w:r>
-              <w:rPr>
-                <w:sz w:val="20"/>
-                <w:szCs w:val="20"/>
+                <w:sz w:val="18"/>
+                <w:szCs w:val="18"/>
+              </w:rPr>
+            </w:pPr>
+            <w:r>
+              <w:rPr>
+                <w:sz w:val="18"/>
+                <w:szCs w:val="18"/>
                 <w:rtl w:val="0"/>
               </w:rPr>
               <w:t xml:space="preserve">Time</w:t>
@@ -4305,332 +4325,332 @@
               <w:widowControl w:val="0"/>
               <w:spacing w:line="240" w:lineRule="auto"/>
               <w:rPr>
-                <w:sz w:val="20"/>
-                <w:szCs w:val="20"/>
-              </w:rPr>
-            </w:pPr>
-            <w:r>
-              <w:rPr>
-                <w:rtl w:val="0"/>
-              </w:rPr>
-            </w:r>
-          </w:p>
-        </w:tc>
-        <w:tc>
-          <w:tcPr>
-            <w:shd w:fill="auto" w:val="clear"/>
-            <w:tcMar>
-              <w:top w:w="100.0" w:type="dxa"/>
-              <w:left w:w="100.0" w:type="dxa"/>
-              <w:bottom w:w="100.0" w:type="dxa"/>
-              <w:right w:w="100.0" w:type="dxa"/>
-            </w:tcMar>
-            <w:vAlign w:val="top"/>
-          </w:tcPr>
-          <w:p>
-            <w:pPr>
-              <w:widowControl w:val="0"/>
-              <w:spacing w:line="240" w:lineRule="auto"/>
-              <w:rPr>
-                <w:sz w:val="20"/>
-                <w:szCs w:val="20"/>
-              </w:rPr>
-            </w:pPr>
-            <w:r>
-              <w:rPr>
-                <w:rtl w:val="0"/>
-              </w:rPr>
-            </w:r>
-          </w:p>
-        </w:tc>
-        <w:tc>
-          <w:tcPr>
-            <w:shd w:fill="auto" w:val="clear"/>
-            <w:tcMar>
-              <w:top w:w="100.0" w:type="dxa"/>
-              <w:left w:w="100.0" w:type="dxa"/>
-              <w:bottom w:w="100.0" w:type="dxa"/>
-              <w:right w:w="100.0" w:type="dxa"/>
-            </w:tcMar>
-            <w:vAlign w:val="top"/>
-          </w:tcPr>
-          <w:p>
-            <w:pPr>
-              <w:widowControl w:val="0"/>
-              <w:spacing w:line="240" w:lineRule="auto"/>
-              <w:rPr>
-                <w:sz w:val="20"/>
-                <w:szCs w:val="20"/>
-              </w:rPr>
-            </w:pPr>
-            <w:r>
-              <w:rPr>
-                <w:rtl w:val="0"/>
-              </w:rPr>
-            </w:r>
-          </w:p>
-        </w:tc>
-        <w:tc>
-          <w:tcPr>
-            <w:shd w:fill="auto" w:val="clear"/>
-            <w:tcMar>
-              <w:top w:w="100.0" w:type="dxa"/>
-              <w:left w:w="100.0" w:type="dxa"/>
-              <w:bottom w:w="100.0" w:type="dxa"/>
-              <w:right w:w="100.0" w:type="dxa"/>
-            </w:tcMar>
-            <w:vAlign w:val="top"/>
-          </w:tcPr>
-          <w:p>
-            <w:pPr>
-              <w:widowControl w:val="0"/>
-              <w:spacing w:line="240" w:lineRule="auto"/>
-              <w:rPr>
-                <w:sz w:val="20"/>
-                <w:szCs w:val="20"/>
-              </w:rPr>
-            </w:pPr>
-            <w:r>
-              <w:rPr>
-                <w:rtl w:val="0"/>
-              </w:rPr>
-            </w:r>
-          </w:p>
-        </w:tc>
-        <w:tc>
-          <w:tcPr>
-            <w:shd w:fill="auto" w:val="clear"/>
-            <w:tcMar>
-              <w:top w:w="100.0" w:type="dxa"/>
-              <w:left w:w="100.0" w:type="dxa"/>
-              <w:bottom w:w="100.0" w:type="dxa"/>
-              <w:right w:w="100.0" w:type="dxa"/>
-            </w:tcMar>
-            <w:vAlign w:val="top"/>
-          </w:tcPr>
-          <w:p>
-            <w:pPr>
-              <w:widowControl w:val="0"/>
-              <w:spacing w:line="240" w:lineRule="auto"/>
-              <w:rPr>
-                <w:sz w:val="20"/>
-                <w:szCs w:val="20"/>
-              </w:rPr>
-            </w:pPr>
-            <w:r>
-              <w:rPr>
-                <w:rtl w:val="0"/>
-              </w:rPr>
-            </w:r>
-          </w:p>
-        </w:tc>
-        <w:tc>
-          <w:tcPr>
-            <w:shd w:fill="auto" w:val="clear"/>
-            <w:tcMar>
-              <w:top w:w="100.0" w:type="dxa"/>
-              <w:left w:w="100.0" w:type="dxa"/>
-              <w:bottom w:w="100.0" w:type="dxa"/>
-              <w:right w:w="100.0" w:type="dxa"/>
-            </w:tcMar>
-            <w:vAlign w:val="top"/>
-          </w:tcPr>
-          <w:p>
-            <w:pPr>
-              <w:widowControl w:val="0"/>
-              <w:spacing w:line="240" w:lineRule="auto"/>
-              <w:rPr>
-                <w:sz w:val="20"/>
-                <w:szCs w:val="20"/>
-              </w:rPr>
-            </w:pPr>
-            <w:r>
-              <w:rPr>
-                <w:rtl w:val="0"/>
-              </w:rPr>
-            </w:r>
-          </w:p>
-        </w:tc>
-        <w:tc>
-          <w:tcPr>
-            <w:shd w:fill="auto" w:val="clear"/>
-            <w:tcMar>
-              <w:top w:w="100.0" w:type="dxa"/>
-              <w:left w:w="100.0" w:type="dxa"/>
-              <w:bottom w:w="100.0" w:type="dxa"/>
-              <w:right w:w="100.0" w:type="dxa"/>
-            </w:tcMar>
-            <w:vAlign w:val="top"/>
-          </w:tcPr>
-          <w:p>
-            <w:pPr>
-              <w:widowControl w:val="0"/>
-              <w:spacing w:line="240" w:lineRule="auto"/>
-              <w:rPr>
-                <w:sz w:val="20"/>
-                <w:szCs w:val="20"/>
-              </w:rPr>
-            </w:pPr>
-            <w:r>
-              <w:rPr>
-                <w:rtl w:val="0"/>
-              </w:rPr>
-            </w:r>
-          </w:p>
-        </w:tc>
-        <w:tc>
-          <w:tcPr>
-            <w:shd w:fill="auto" w:val="clear"/>
-            <w:tcMar>
-              <w:top w:w="100.0" w:type="dxa"/>
-              <w:left w:w="100.0" w:type="dxa"/>
-              <w:bottom w:w="100.0" w:type="dxa"/>
-              <w:right w:w="100.0" w:type="dxa"/>
-            </w:tcMar>
-            <w:vAlign w:val="top"/>
-          </w:tcPr>
-          <w:p>
-            <w:pPr>
-              <w:widowControl w:val="0"/>
-              <w:spacing w:line="240" w:lineRule="auto"/>
-              <w:rPr>
-                <w:sz w:val="20"/>
-                <w:szCs w:val="20"/>
-              </w:rPr>
-            </w:pPr>
-            <w:r>
-              <w:rPr>
-                <w:rtl w:val="0"/>
-              </w:rPr>
-            </w:r>
-          </w:p>
-        </w:tc>
-        <w:tc>
-          <w:tcPr>
-            <w:shd w:fill="auto" w:val="clear"/>
-            <w:tcMar>
-              <w:top w:w="100.0" w:type="dxa"/>
-              <w:left w:w="100.0" w:type="dxa"/>
-              <w:bottom w:w="100.0" w:type="dxa"/>
-              <w:right w:w="100.0" w:type="dxa"/>
-            </w:tcMar>
-            <w:vAlign w:val="top"/>
-          </w:tcPr>
-          <w:p>
-            <w:pPr>
-              <w:widowControl w:val="0"/>
-              <w:spacing w:line="240" w:lineRule="auto"/>
-              <w:rPr>
-                <w:sz w:val="20"/>
-                <w:szCs w:val="20"/>
-              </w:rPr>
-            </w:pPr>
-            <w:r>
-              <w:rPr>
-                <w:rtl w:val="0"/>
-              </w:rPr>
-            </w:r>
-          </w:p>
-        </w:tc>
-        <w:tc>
-          <w:tcPr>
-            <w:shd w:fill="auto" w:val="clear"/>
-            <w:tcMar>
-              <w:top w:w="100.0" w:type="dxa"/>
-              <w:left w:w="100.0" w:type="dxa"/>
-              <w:bottom w:w="100.0" w:type="dxa"/>
-              <w:right w:w="100.0" w:type="dxa"/>
-            </w:tcMar>
-            <w:vAlign w:val="top"/>
-          </w:tcPr>
-          <w:p>
-            <w:pPr>
-              <w:widowControl w:val="0"/>
-              <w:spacing w:line="240" w:lineRule="auto"/>
-              <w:rPr>
-                <w:sz w:val="20"/>
-                <w:szCs w:val="20"/>
-              </w:rPr>
-            </w:pPr>
-            <w:r>
-              <w:rPr>
-                <w:rtl w:val="0"/>
-              </w:rPr>
-            </w:r>
-          </w:p>
-        </w:tc>
-        <w:tc>
-          <w:tcPr>
-            <w:shd w:fill="auto" w:val="clear"/>
-            <w:tcMar>
-              <w:top w:w="100.0" w:type="dxa"/>
-              <w:left w:w="100.0" w:type="dxa"/>
-              <w:bottom w:w="100.0" w:type="dxa"/>
-              <w:right w:w="100.0" w:type="dxa"/>
-            </w:tcMar>
-            <w:vAlign w:val="top"/>
-          </w:tcPr>
-          <w:p>
-            <w:pPr>
-              <w:widowControl w:val="0"/>
-              <w:spacing w:line="240" w:lineRule="auto"/>
-              <w:rPr>
-                <w:sz w:val="20"/>
-                <w:szCs w:val="20"/>
-              </w:rPr>
-            </w:pPr>
-            <w:r>
-              <w:rPr>
-                <w:rtl w:val="0"/>
-              </w:rPr>
-            </w:r>
-          </w:p>
-        </w:tc>
-        <w:tc>
-          <w:tcPr>
-            <w:shd w:fill="auto" w:val="clear"/>
-            <w:tcMar>
-              <w:top w:w="100.0" w:type="dxa"/>
-              <w:left w:w="100.0" w:type="dxa"/>
-              <w:bottom w:w="100.0" w:type="dxa"/>
-              <w:right w:w="100.0" w:type="dxa"/>
-            </w:tcMar>
-            <w:vAlign w:val="top"/>
-          </w:tcPr>
-          <w:p>
-            <w:pPr>
-              <w:widowControl w:val="0"/>
-              <w:spacing w:line="240" w:lineRule="auto"/>
-              <w:rPr>
-                <w:sz w:val="20"/>
-                <w:szCs w:val="20"/>
-              </w:rPr>
-            </w:pPr>
-            <w:r>
-              <w:rPr>
-                <w:rtl w:val="0"/>
-              </w:rPr>
-            </w:r>
-          </w:p>
-        </w:tc>
-        <w:tc>
-          <w:tcPr>
-            <w:shd w:fill="auto" w:val="clear"/>
-            <w:tcMar>
-              <w:top w:w="100.0" w:type="dxa"/>
-              <w:left w:w="100.0" w:type="dxa"/>
-              <w:bottom w:w="100.0" w:type="dxa"/>
-              <w:right w:w="100.0" w:type="dxa"/>
-            </w:tcMar>
-            <w:vAlign w:val="top"/>
-          </w:tcPr>
-          <w:p>
-            <w:pPr>
-              <w:widowControl w:val="0"/>
-              <w:spacing w:line="240" w:lineRule="auto"/>
-              <w:rPr>
-                <w:sz w:val="20"/>
-                <w:szCs w:val="20"/>
+                <w:sz w:val="18"/>
+                <w:szCs w:val="18"/>
+              </w:rPr>
+            </w:pPr>
+            <w:r>
+              <w:rPr>
+                <w:rtl w:val="0"/>
+              </w:rPr>
+            </w:r>
+          </w:p>
+        </w:tc>
+        <w:tc>
+          <w:tcPr>
+            <w:shd w:fill="auto" w:val="clear"/>
+            <w:tcMar>
+              <w:top w:w="100.0" w:type="dxa"/>
+              <w:left w:w="100.0" w:type="dxa"/>
+              <w:bottom w:w="100.0" w:type="dxa"/>
+              <w:right w:w="100.0" w:type="dxa"/>
+            </w:tcMar>
+            <w:vAlign w:val="top"/>
+          </w:tcPr>
+          <w:p>
+            <w:pPr>
+              <w:widowControl w:val="0"/>
+              <w:spacing w:line="240" w:lineRule="auto"/>
+              <w:rPr>
+                <w:sz w:val="18"/>
+                <w:szCs w:val="18"/>
+              </w:rPr>
+            </w:pPr>
+            <w:r>
+              <w:rPr>
+                <w:rtl w:val="0"/>
+              </w:rPr>
+            </w:r>
+          </w:p>
+        </w:tc>
+        <w:tc>
+          <w:tcPr>
+            <w:shd w:fill="auto" w:val="clear"/>
+            <w:tcMar>
+              <w:top w:w="100.0" w:type="dxa"/>
+              <w:left w:w="100.0" w:type="dxa"/>
+              <w:bottom w:w="100.0" w:type="dxa"/>
+              <w:right w:w="100.0" w:type="dxa"/>
+            </w:tcMar>
+            <w:vAlign w:val="top"/>
+          </w:tcPr>
+          <w:p>
+            <w:pPr>
+              <w:widowControl w:val="0"/>
+              <w:spacing w:line="240" w:lineRule="auto"/>
+              <w:rPr>
+                <w:sz w:val="18"/>
+                <w:szCs w:val="18"/>
+              </w:rPr>
+            </w:pPr>
+            <w:r>
+              <w:rPr>
+                <w:rtl w:val="0"/>
+              </w:rPr>
+            </w:r>
+          </w:p>
+        </w:tc>
+        <w:tc>
+          <w:tcPr>
+            <w:shd w:fill="auto" w:val="clear"/>
+            <w:tcMar>
+              <w:top w:w="100.0" w:type="dxa"/>
+              <w:left w:w="100.0" w:type="dxa"/>
+              <w:bottom w:w="100.0" w:type="dxa"/>
+              <w:right w:w="100.0" w:type="dxa"/>
+            </w:tcMar>
+            <w:vAlign w:val="top"/>
+          </w:tcPr>
+          <w:p>
+            <w:pPr>
+              <w:widowControl w:val="0"/>
+              <w:spacing w:line="240" w:lineRule="auto"/>
+              <w:rPr>
+                <w:sz w:val="18"/>
+                <w:szCs w:val="18"/>
+              </w:rPr>
+            </w:pPr>
+            <w:r>
+              <w:rPr>
+                <w:rtl w:val="0"/>
+              </w:rPr>
+            </w:r>
+          </w:p>
+        </w:tc>
+        <w:tc>
+          <w:tcPr>
+            <w:shd w:fill="auto" w:val="clear"/>
+            <w:tcMar>
+              <w:top w:w="100.0" w:type="dxa"/>
+              <w:left w:w="100.0" w:type="dxa"/>
+              <w:bottom w:w="100.0" w:type="dxa"/>
+              <w:right w:w="100.0" w:type="dxa"/>
+            </w:tcMar>
+            <w:vAlign w:val="top"/>
+          </w:tcPr>
+          <w:p>
+            <w:pPr>
+              <w:widowControl w:val="0"/>
+              <w:spacing w:line="240" w:lineRule="auto"/>
+              <w:rPr>
+                <w:sz w:val="18"/>
+                <w:szCs w:val="18"/>
+              </w:rPr>
+            </w:pPr>
+            <w:r>
+              <w:rPr>
+                <w:rtl w:val="0"/>
+              </w:rPr>
+            </w:r>
+          </w:p>
+        </w:tc>
+        <w:tc>
+          <w:tcPr>
+            <w:shd w:fill="auto" w:val="clear"/>
+            <w:tcMar>
+              <w:top w:w="100.0" w:type="dxa"/>
+              <w:left w:w="100.0" w:type="dxa"/>
+              <w:bottom w:w="100.0" w:type="dxa"/>
+              <w:right w:w="100.0" w:type="dxa"/>
+            </w:tcMar>
+            <w:vAlign w:val="top"/>
+          </w:tcPr>
+          <w:p>
+            <w:pPr>
+              <w:widowControl w:val="0"/>
+              <w:spacing w:line="240" w:lineRule="auto"/>
+              <w:rPr>
+                <w:sz w:val="18"/>
+                <w:szCs w:val="18"/>
+              </w:rPr>
+            </w:pPr>
+            <w:r>
+              <w:rPr>
+                <w:rtl w:val="0"/>
+              </w:rPr>
+            </w:r>
+          </w:p>
+        </w:tc>
+        <w:tc>
+          <w:tcPr>
+            <w:shd w:fill="auto" w:val="clear"/>
+            <w:tcMar>
+              <w:top w:w="100.0" w:type="dxa"/>
+              <w:left w:w="100.0" w:type="dxa"/>
+              <w:bottom w:w="100.0" w:type="dxa"/>
+              <w:right w:w="100.0" w:type="dxa"/>
+            </w:tcMar>
+            <w:vAlign w:val="top"/>
+          </w:tcPr>
+          <w:p>
+            <w:pPr>
+              <w:widowControl w:val="0"/>
+              <w:spacing w:line="240" w:lineRule="auto"/>
+              <w:rPr>
+                <w:sz w:val="18"/>
+                <w:szCs w:val="18"/>
+              </w:rPr>
+            </w:pPr>
+            <w:r>
+              <w:rPr>
+                <w:rtl w:val="0"/>
+              </w:rPr>
+            </w:r>
+          </w:p>
+        </w:tc>
+        <w:tc>
+          <w:tcPr>
+            <w:shd w:fill="auto" w:val="clear"/>
+            <w:tcMar>
+              <w:top w:w="100.0" w:type="dxa"/>
+              <w:left w:w="100.0" w:type="dxa"/>
+              <w:bottom w:w="100.0" w:type="dxa"/>
+              <w:right w:w="100.0" w:type="dxa"/>
+            </w:tcMar>
+            <w:vAlign w:val="top"/>
+          </w:tcPr>
+          <w:p>
+            <w:pPr>
+              <w:widowControl w:val="0"/>
+              <w:spacing w:line="240" w:lineRule="auto"/>
+              <w:rPr>
+                <w:sz w:val="18"/>
+                <w:szCs w:val="18"/>
+              </w:rPr>
+            </w:pPr>
+            <w:r>
+              <w:rPr>
+                <w:rtl w:val="0"/>
+              </w:rPr>
+            </w:r>
+          </w:p>
+        </w:tc>
+        <w:tc>
+          <w:tcPr>
+            <w:shd w:fill="auto" w:val="clear"/>
+            <w:tcMar>
+              <w:top w:w="100.0" w:type="dxa"/>
+              <w:left w:w="100.0" w:type="dxa"/>
+              <w:bottom w:w="100.0" w:type="dxa"/>
+              <w:right w:w="100.0" w:type="dxa"/>
+            </w:tcMar>
+            <w:vAlign w:val="top"/>
+          </w:tcPr>
+          <w:p>
+            <w:pPr>
+              <w:widowControl w:val="0"/>
+              <w:spacing w:line="240" w:lineRule="auto"/>
+              <w:rPr>
+                <w:sz w:val="18"/>
+                <w:szCs w:val="18"/>
+              </w:rPr>
+            </w:pPr>
+            <w:r>
+              <w:rPr>
+                <w:rtl w:val="0"/>
+              </w:rPr>
+            </w:r>
+          </w:p>
+        </w:tc>
+        <w:tc>
+          <w:tcPr>
+            <w:shd w:fill="auto" w:val="clear"/>
+            <w:tcMar>
+              <w:top w:w="100.0" w:type="dxa"/>
+              <w:left w:w="100.0" w:type="dxa"/>
+              <w:bottom w:w="100.0" w:type="dxa"/>
+              <w:right w:w="100.0" w:type="dxa"/>
+            </w:tcMar>
+            <w:vAlign w:val="top"/>
+          </w:tcPr>
+          <w:p>
+            <w:pPr>
+              <w:widowControl w:val="0"/>
+              <w:spacing w:line="240" w:lineRule="auto"/>
+              <w:rPr>
+                <w:sz w:val="18"/>
+                <w:szCs w:val="18"/>
+              </w:rPr>
+            </w:pPr>
+            <w:r>
+              <w:rPr>
+                <w:rtl w:val="0"/>
+              </w:rPr>
+            </w:r>
+          </w:p>
+        </w:tc>
+        <w:tc>
+          <w:tcPr>
+            <w:shd w:fill="auto" w:val="clear"/>
+            <w:tcMar>
+              <w:top w:w="100.0" w:type="dxa"/>
+              <w:left w:w="100.0" w:type="dxa"/>
+              <w:bottom w:w="100.0" w:type="dxa"/>
+              <w:right w:w="100.0" w:type="dxa"/>
+            </w:tcMar>
+            <w:vAlign w:val="top"/>
+          </w:tcPr>
+          <w:p>
+            <w:pPr>
+              <w:widowControl w:val="0"/>
+              <w:spacing w:line="240" w:lineRule="auto"/>
+              <w:rPr>
+                <w:sz w:val="18"/>
+                <w:szCs w:val="18"/>
+              </w:rPr>
+            </w:pPr>
+            <w:r>
+              <w:rPr>
+                <w:rtl w:val="0"/>
+              </w:rPr>
+            </w:r>
+          </w:p>
+        </w:tc>
+        <w:tc>
+          <w:tcPr>
+            <w:shd w:fill="auto" w:val="clear"/>
+            <w:tcMar>
+              <w:top w:w="100.0" w:type="dxa"/>
+              <w:left w:w="100.0" w:type="dxa"/>
+              <w:bottom w:w="100.0" w:type="dxa"/>
+              <w:right w:w="100.0" w:type="dxa"/>
+            </w:tcMar>
+            <w:vAlign w:val="top"/>
+          </w:tcPr>
+          <w:p>
+            <w:pPr>
+              <w:widowControl w:val="0"/>
+              <w:spacing w:line="240" w:lineRule="auto"/>
+              <w:rPr>
+                <w:sz w:val="18"/>
+                <w:szCs w:val="18"/>
+              </w:rPr>
+            </w:pPr>
+            <w:r>
+              <w:rPr>
+                <w:rtl w:val="0"/>
+              </w:rPr>
+            </w:r>
+          </w:p>
+        </w:tc>
+        <w:tc>
+          <w:tcPr>
+            <w:shd w:fill="auto" w:val="clear"/>
+            <w:tcMar>
+              <w:top w:w="100.0" w:type="dxa"/>
+              <w:left w:w="100.0" w:type="dxa"/>
+              <w:bottom w:w="100.0" w:type="dxa"/>
+              <w:right w:w="100.0" w:type="dxa"/>
+            </w:tcMar>
+            <w:vAlign w:val="top"/>
+          </w:tcPr>
+          <w:p>
+            <w:pPr>
+              <w:widowControl w:val="0"/>
+              <w:spacing w:line="240" w:lineRule="auto"/>
+              <w:rPr>
+                <w:sz w:val="18"/>
+                <w:szCs w:val="18"/>
               </w:rPr>
             </w:pPr>
             <w:r>
@@ -4671,8 +4691,8 @@
               <w:rPr>
                 <w:b w:val="1"/>
                 <w:bCs w:val="1"/>
-                <w:sz w:val="20"/>
-                <w:szCs w:val="20"/>
+                <w:sz w:val="18"/>
+                <w:szCs w:val="18"/>
               </w:rPr>
             </w:pPr>
             <w:r>
@@ -4713,8 +4733,8 @@
               <w:rPr>
                 <w:b w:val="1"/>
                 <w:bCs w:val="1"/>
-                <w:sz w:val="20"/>
-                <w:szCs w:val="20"/>
+                <w:sz w:val="18"/>
+                <w:szCs w:val="18"/>
               </w:rPr>
             </w:pPr>
             <w:r>
@@ -4755,8 +4775,8 @@
               <w:rPr>
                 <w:b w:val="1"/>
                 <w:bCs w:val="1"/>
-                <w:sz w:val="20"/>
-                <w:szCs w:val="20"/>
+                <w:sz w:val="18"/>
+                <w:szCs w:val="18"/>
               </w:rPr>
             </w:pPr>
             <w:r>
@@ -4797,8 +4817,8 @@
               <w:rPr>
                 <w:b w:val="1"/>
                 <w:bCs w:val="1"/>
-                <w:sz w:val="20"/>
-                <w:szCs w:val="20"/>
+                <w:sz w:val="18"/>
+                <w:szCs w:val="18"/>
               </w:rPr>
             </w:pPr>
             <w:r>
@@ -4812,12 +4832,13 @@
     </w:tbl>
     <w:p>
       <w:pPr>
+        <w:spacing w:line="240" w:lineRule="auto"/>
         <w:ind w:left="-992.1259842519685" w:firstLine="0"/>
         <w:rPr>
           <w:b w:val="1"/>
           <w:bCs w:val="1"/>
-          <w:sz w:val="12"/>
-          <w:szCs w:val="12"/>
+          <w:sz w:val="10"/>
+          <w:szCs w:val="10"/>
         </w:rPr>
       </w:pPr>
       <w:r>
@@ -4878,14 +4899,14 @@
               <w:widowControl w:val="0"/>
               <w:spacing w:line="240" w:lineRule="auto"/>
               <w:rPr>
-                <w:sz w:val="20"/>
-                <w:szCs w:val="20"/>
-              </w:rPr>
-            </w:pPr>
-            <w:r>
-              <w:rPr>
-                <w:sz w:val="20"/>
-                <w:szCs w:val="20"/>
+                <w:sz w:val="18"/>
+                <w:szCs w:val="18"/>
+              </w:rPr>
+            </w:pPr>
+            <w:r>
+              <w:rPr>
+                <w:sz w:val="18"/>
+                <w:szCs w:val="18"/>
                 <w:rtl w:val="0"/>
               </w:rPr>
               <w:t xml:space="preserve">Surgery Start Time</w:t>
@@ -4908,41 +4929,41 @@
               <w:widowControl w:val="0"/>
               <w:spacing w:line="240" w:lineRule="auto"/>
               <w:rPr>
-                <w:sz w:val="20"/>
-                <w:szCs w:val="20"/>
-              </w:rPr>
-            </w:pPr>
-            <w:r>
-              <w:rPr>
-                <w:rtl w:val="0"/>
-              </w:rPr>
-            </w:r>
-          </w:p>
-        </w:tc>
-        <w:tc>
-          <w:tcPr>
-            <w:shd w:fill="auto" w:val="clear"/>
-            <w:tcMar>
-              <w:top w:w="100.0" w:type="dxa"/>
-              <w:left w:w="100.0" w:type="dxa"/>
-              <w:bottom w:w="100.0" w:type="dxa"/>
-              <w:right w:w="100.0" w:type="dxa"/>
-            </w:tcMar>
-            <w:vAlign w:val="top"/>
-          </w:tcPr>
-          <w:p>
-            <w:pPr>
-              <w:widowControl w:val="0"/>
-              <w:spacing w:line="240" w:lineRule="auto"/>
-              <w:rPr>
-                <w:sz w:val="20"/>
-                <w:szCs w:val="20"/>
-              </w:rPr>
-            </w:pPr>
-            <w:r>
-              <w:rPr>
-                <w:sz w:val="20"/>
-                <w:szCs w:val="20"/>
+                <w:sz w:val="18"/>
+                <w:szCs w:val="18"/>
+              </w:rPr>
+            </w:pPr>
+            <w:r>
+              <w:rPr>
+                <w:rtl w:val="0"/>
+              </w:rPr>
+            </w:r>
+          </w:p>
+        </w:tc>
+        <w:tc>
+          <w:tcPr>
+            <w:shd w:fill="auto" w:val="clear"/>
+            <w:tcMar>
+              <w:top w:w="100.0" w:type="dxa"/>
+              <w:left w:w="100.0" w:type="dxa"/>
+              <w:bottom w:w="100.0" w:type="dxa"/>
+              <w:right w:w="100.0" w:type="dxa"/>
+            </w:tcMar>
+            <w:vAlign w:val="top"/>
+          </w:tcPr>
+          <w:p>
+            <w:pPr>
+              <w:widowControl w:val="0"/>
+              <w:spacing w:line="240" w:lineRule="auto"/>
+              <w:rPr>
+                <w:sz w:val="18"/>
+                <w:szCs w:val="18"/>
+              </w:rPr>
+            </w:pPr>
+            <w:r>
+              <w:rPr>
+                <w:sz w:val="18"/>
+                <w:szCs w:val="18"/>
                 <w:rtl w:val="0"/>
               </w:rPr>
               <w:t xml:space="preserve">Surgery End Time</w:t>
@@ -4965,8 +4986,8 @@
               <w:widowControl w:val="0"/>
               <w:spacing w:line="240" w:lineRule="auto"/>
               <w:rPr>
-                <w:sz w:val="20"/>
-                <w:szCs w:val="20"/>
+                <w:sz w:val="18"/>
+                <w:szCs w:val="18"/>
               </w:rPr>
             </w:pPr>
             <w:r>
@@ -4998,14 +5019,14 @@
               <w:widowControl w:val="0"/>
               <w:spacing w:line="240" w:lineRule="auto"/>
               <w:rPr>
-                <w:sz w:val="20"/>
-                <w:szCs w:val="20"/>
-              </w:rPr>
-            </w:pPr>
-            <w:r>
-              <w:rPr>
-                <w:sz w:val="20"/>
-                <w:szCs w:val="20"/>
+                <w:sz w:val="18"/>
+                <w:szCs w:val="18"/>
+              </w:rPr>
+            </w:pPr>
+            <w:r>
+              <w:rPr>
+                <w:sz w:val="18"/>
+                <w:szCs w:val="18"/>
                 <w:rtl w:val="0"/>
               </w:rPr>
               <w:t xml:space="preserve">Ear notch</w:t>
@@ -5028,41 +5049,41 @@
               <w:widowControl w:val="0"/>
               <w:spacing w:line="240" w:lineRule="auto"/>
               <w:rPr>
-                <w:sz w:val="20"/>
-                <w:szCs w:val="20"/>
-              </w:rPr>
-            </w:pPr>
-            <w:r>
-              <w:rPr>
-                <w:rtl w:val="0"/>
-              </w:rPr>
-            </w:r>
-          </w:p>
-        </w:tc>
-        <w:tc>
-          <w:tcPr>
-            <w:shd w:fill="auto" w:val="clear"/>
-            <w:tcMar>
-              <w:top w:w="100.0" w:type="dxa"/>
-              <w:left w:w="100.0" w:type="dxa"/>
-              <w:bottom w:w="100.0" w:type="dxa"/>
-              <w:right w:w="100.0" w:type="dxa"/>
-            </w:tcMar>
-            <w:vAlign w:val="top"/>
-          </w:tcPr>
-          <w:p>
-            <w:pPr>
-              <w:widowControl w:val="0"/>
-              <w:spacing w:line="240" w:lineRule="auto"/>
-              <w:rPr>
-                <w:sz w:val="20"/>
-                <w:szCs w:val="20"/>
-              </w:rPr>
-            </w:pPr>
-            <w:r>
-              <w:rPr>
-                <w:sz w:val="20"/>
-                <w:szCs w:val="20"/>
+                <w:sz w:val="18"/>
+                <w:szCs w:val="18"/>
+              </w:rPr>
+            </w:pPr>
+            <w:r>
+              <w:rPr>
+                <w:rtl w:val="0"/>
+              </w:rPr>
+            </w:r>
+          </w:p>
+        </w:tc>
+        <w:tc>
+          <w:tcPr>
+            <w:shd w:fill="auto" w:val="clear"/>
+            <w:tcMar>
+              <w:top w:w="100.0" w:type="dxa"/>
+              <w:left w:w="100.0" w:type="dxa"/>
+              <w:bottom w:w="100.0" w:type="dxa"/>
+              <w:right w:w="100.0" w:type="dxa"/>
+            </w:tcMar>
+            <w:vAlign w:val="top"/>
+          </w:tcPr>
+          <w:p>
+            <w:pPr>
+              <w:widowControl w:val="0"/>
+              <w:spacing w:line="240" w:lineRule="auto"/>
+              <w:rPr>
+                <w:sz w:val="18"/>
+                <w:szCs w:val="18"/>
+              </w:rPr>
+            </w:pPr>
+            <w:r>
+              <w:rPr>
+                <w:sz w:val="18"/>
+                <w:szCs w:val="18"/>
                 <w:rtl w:val="0"/>
               </w:rPr>
               <w:t xml:space="preserve">Post operative temp</w:t>
@@ -5085,8 +5106,8 @@
               <w:widowControl w:val="0"/>
               <w:spacing w:line="240" w:lineRule="auto"/>
               <w:rPr>
-                <w:sz w:val="20"/>
-                <w:szCs w:val="20"/>
+                <w:sz w:val="18"/>
+                <w:szCs w:val="18"/>
               </w:rPr>
             </w:pPr>
             <w:r>
@@ -5118,14 +5139,14 @@
               <w:widowControl w:val="0"/>
               <w:spacing w:line="240" w:lineRule="auto"/>
               <w:rPr>
-                <w:sz w:val="20"/>
-                <w:szCs w:val="20"/>
-              </w:rPr>
-            </w:pPr>
-            <w:r>
-              <w:rPr>
-                <w:sz w:val="20"/>
-                <w:szCs w:val="20"/>
+                <w:sz w:val="18"/>
+                <w:szCs w:val="18"/>
+              </w:rPr>
+            </w:pPr>
+            <w:r>
+              <w:rPr>
+                <w:sz w:val="18"/>
+                <w:szCs w:val="18"/>
                 <w:rtl w:val="0"/>
               </w:rPr>
               <w:t xml:space="preserve">ARV Date</w:t>
@@ -5148,41 +5169,41 @@
               <w:widowControl w:val="0"/>
               <w:spacing w:line="240" w:lineRule="auto"/>
               <w:rPr>
-                <w:sz w:val="20"/>
-                <w:szCs w:val="20"/>
-              </w:rPr>
-            </w:pPr>
-            <w:r>
-              <w:rPr>
-                <w:rtl w:val="0"/>
-              </w:rPr>
-            </w:r>
-          </w:p>
-        </w:tc>
-        <w:tc>
-          <w:tcPr>
-            <w:shd w:fill="auto" w:val="clear"/>
-            <w:tcMar>
-              <w:top w:w="100.0" w:type="dxa"/>
-              <w:left w:w="100.0" w:type="dxa"/>
-              <w:bottom w:w="100.0" w:type="dxa"/>
-              <w:right w:w="100.0" w:type="dxa"/>
-            </w:tcMar>
-            <w:vAlign w:val="top"/>
-          </w:tcPr>
-          <w:p>
-            <w:pPr>
-              <w:widowControl w:val="0"/>
-              <w:spacing w:line="240" w:lineRule="auto"/>
-              <w:rPr>
-                <w:sz w:val="20"/>
-                <w:szCs w:val="20"/>
-              </w:rPr>
-            </w:pPr>
-            <w:r>
-              <w:rPr>
-                <w:sz w:val="20"/>
-                <w:szCs w:val="20"/>
+                <w:sz w:val="18"/>
+                <w:szCs w:val="18"/>
+              </w:rPr>
+            </w:pPr>
+            <w:r>
+              <w:rPr>
+                <w:rtl w:val="0"/>
+              </w:rPr>
+            </w:r>
+          </w:p>
+        </w:tc>
+        <w:tc>
+          <w:tcPr>
+            <w:shd w:fill="auto" w:val="clear"/>
+            <w:tcMar>
+              <w:top w:w="100.0" w:type="dxa"/>
+              <w:left w:w="100.0" w:type="dxa"/>
+              <w:bottom w:w="100.0" w:type="dxa"/>
+              <w:right w:w="100.0" w:type="dxa"/>
+            </w:tcMar>
+            <w:vAlign w:val="top"/>
+          </w:tcPr>
+          <w:p>
+            <w:pPr>
+              <w:widowControl w:val="0"/>
+              <w:spacing w:line="240" w:lineRule="auto"/>
+              <w:rPr>
+                <w:sz w:val="18"/>
+                <w:szCs w:val="18"/>
+              </w:rPr>
+            </w:pPr>
+            <w:r>
+              <w:rPr>
+                <w:sz w:val="18"/>
+                <w:szCs w:val="18"/>
                 <w:rtl w:val="0"/>
               </w:rPr>
               <w:t xml:space="preserve">Release date </w:t>
@@ -5205,8 +5226,8 @@
               <w:widowControl w:val="0"/>
               <w:spacing w:line="240" w:lineRule="auto"/>
               <w:rPr>
-                <w:sz w:val="20"/>
-                <w:szCs w:val="20"/>
+                <w:sz w:val="18"/>
+                <w:szCs w:val="18"/>
               </w:rPr>
             </w:pPr>
             <w:r>
@@ -5221,7 +5242,11 @@
     <w:p>
       <w:pPr>
         <w:pStyle w:val="Heading1"/>
-        <w:rPr/>
+        <w:spacing w:line="240" w:lineRule="auto"/>
+        <w:rPr>
+          <w:sz w:val="38"/>
+          <w:szCs w:val="38"/>
+        </w:rPr>
       </w:pPr>
       <w:bookmarkStart w:colFirst="0" w:colLast="0" w:name="_3c219fubekzv" w:id="0"/>
       <w:bookmarkEnd w:id="0"/>

</xml_diff>